<commit_message>
Minor edits and bug fixes for stage 1
</commit_message>
<xml_diff>
--- a/exec/gitrepo/stage1/adcp_s55/Signature 55Hz processing guide.docx
+++ b/exec/gitrepo/stage1/adcp_s55/Signature 55Hz processing guide.docx
@@ -22,6 +22,8 @@
       <w:r>
         <w:rPr>
           <w:rStyle w:val="CommentReference"/>
+          <w:sz w:val="24"/>
+          <w:szCs w:val="24"/>
         </w:rPr>
         <w:commentReference w:id="0"/>
       </w:r>
@@ -65,7 +67,7 @@
         <w:rPr>
           <w:noProof/>
         </w:rPr>
-        <w:t>05/02/2026 13:07:20</w:t>
+        <w:t>10/02/2026 09:09:06</w:t>
       </w:r>
       <w:r>
         <w:fldChar w:fldCharType="end"/>
@@ -322,6 +324,7 @@
           <w:rStyle w:val="CommentReference"/>
           <w:sz w:val="24"/>
           <w:szCs w:val="24"/>
+          <w:lang w:val="en-US"/>
         </w:rPr>
         <w:commentReference w:id="1"/>
       </w:r>
@@ -331,6 +334,7 @@
           <w:rStyle w:val="CommentReference"/>
           <w:sz w:val="24"/>
           <w:szCs w:val="24"/>
+          <w:lang w:val="en-US"/>
         </w:rPr>
         <w:commentReference w:id="2"/>
       </w:r>
@@ -359,6 +363,7 @@
           <w:rStyle w:val="CommentReference"/>
           <w:sz w:val="24"/>
           <w:szCs w:val="24"/>
+          <w:lang w:val="en-US"/>
         </w:rPr>
         <w:commentReference w:id="3"/>
       </w:r>
@@ -468,7 +473,13 @@
         <w:t>only data where the correlation of echo and signal is above 50%</w:t>
       </w:r>
       <w:r>
-        <w:t xml:space="preserve"> is kept.</w:t>
+        <w:t xml:space="preserve"> is kept</w:t>
+      </w:r>
+      <w:r>
+        <w:t xml:space="preserve"> in the avgd.mat file</w:t>
+      </w:r>
+      <w:r>
+        <w:t>.</w:t>
       </w:r>
     </w:p>
     <w:p>
@@ -517,7 +528,7 @@
           <w:iCs/>
           <w:color w:val="3A7C22" w:themeColor="accent6" w:themeShade="BF"/>
         </w:rPr>
-        <w:t>2000</w:t>
+        <w:t>200</w:t>
       </w:r>
       <w:r>
         <w:rPr>
@@ -533,7 +544,23 @@
           <w:iCs/>
           <w:color w:val="3A7C22" w:themeColor="accent6" w:themeShade="BF"/>
         </w:rPr>
-        <w:t>_data.mat; 20044_data_avgd.mat</w:t>
+        <w:t>_data.mat; 2</w:t>
+      </w:r>
+      <w:r>
+        <w:rPr>
+          <w:i/>
+          <w:iCs/>
+          <w:color w:val="3A7C22" w:themeColor="accent6" w:themeShade="BF"/>
+        </w:rPr>
+        <w:t>0</w:t>
+      </w:r>
+      <w:r>
+        <w:rPr>
+          <w:i/>
+          <w:iCs/>
+          <w:color w:val="3A7C22" w:themeColor="accent6" w:themeShade="BF"/>
+        </w:rPr>
+        <w:t>044_data_avgd.mat</w:t>
       </w:r>
     </w:p>
     <w:p>
@@ -697,30 +724,44 @@
       </w:r>
       <w:r>
         <w:rPr>
+          <w:i/>
+          <w:iCs/>
           <w:color w:val="3A7C22" w:themeColor="accent6" w:themeShade="BF"/>
         </w:rPr>
         <w:t>[</w:t>
       </w:r>
       <w:r>
         <w:rPr>
+          <w:i/>
+          <w:iCs/>
           <w:color w:val="3A7C22" w:themeColor="accent6" w:themeShade="BF"/>
         </w:rPr>
         <w:t>moorname</w:t>
       </w:r>
       <w:r>
         <w:rPr>
+          <w:i/>
+          <w:iCs/>
           <w:color w:val="3A7C22" w:themeColor="accent6" w:themeShade="BF"/>
         </w:rPr>
         <w:t>]</w:t>
       </w:r>
       <w:r>
         <w:rPr>
+          <w:i/>
+          <w:iCs/>
           <w:color w:val="3A7C22" w:themeColor="accent6" w:themeShade="BF"/>
         </w:rPr>
         <w:t>info.dat</w:t>
       </w:r>
       <w:r>
-        <w:t xml:space="preserve"> contains metadata for mooring position (lon, lat, waterdepth and mean magnetic deviation during the deployment), deployment period, nominal depths and serial numbers of each instrument. </w:t>
+        <w:rPr>
+          <w:color w:val="3A7C22" w:themeColor="accent6" w:themeShade="BF"/>
+        </w:rPr>
+        <w:t xml:space="preserve"> </w:t>
+      </w:r>
+      <w:r>
+        <w:t xml:space="preserve">contains metadata for mooring position (lon, lat, waterdepth and mean magnetic deviation during the deployment), deployment period, nominal depths and serial numbers of each instrument. </w:t>
       </w:r>
     </w:p>
     <w:p>
@@ -1172,6 +1213,7 @@
     </w:p>
     <w:p>
       <w:r>
+        <w:lastRenderedPageBreak/>
         <w:t>All checks should use plots showing original and flagged data</w:t>
       </w:r>
       <w:r>
@@ -1796,6 +1838,8 @@
       <w:r>
         <w:rPr>
           <w:rStyle w:val="CommentReference"/>
+          <w:sz w:val="24"/>
+          <w:szCs w:val="24"/>
         </w:rPr>
         <w:commentReference w:id="4"/>
       </w:r>
@@ -1823,6 +1867,7 @@
           <w:bCs/>
           <w:lang w:val="en-US"/>
         </w:rPr>
+        <w:lastRenderedPageBreak/>
         <w:t>Just check again Correlation (&lt;50 will be set to NaN by default)</w:t>
       </w:r>
     </w:p>
@@ -2006,17 +2051,7 @@
               <w:rFonts w:ascii="Cambria Math" w:hAnsi="Cambria Math"/>
               <w:lang w:val="en-US"/>
             </w:rPr>
-            <m:t>-</m:t>
-          </m:r>
-          <m:r>
-            <m:rPr>
-              <m:sty m:val="p"/>
-            </m:rPr>
-            <w:rPr>
-              <w:rFonts w:ascii="Cambria Math" w:hAnsi="Cambria Math"/>
-              <w:lang w:val="en-US"/>
-            </w:rPr>
-            <m:t>Cell Size</m:t>
+            <m:t>-Cell Size</m:t>
           </m:r>
         </m:oMath>
       </m:oMathPara>
@@ -2454,6 +2489,7 @@
           <w:rStyle w:val="CommentReference"/>
           <w:sz w:val="24"/>
           <w:szCs w:val="24"/>
+          <w:lang w:val="en-US"/>
         </w:rPr>
         <w:commentReference w:id="5"/>
       </w:r>
@@ -2544,6 +2580,1354 @@
       <w:pPr>
         <w:spacing w:after="0"/>
         <w:rPr>
+          <w:lang w:val="en-US"/>
+        </w:rPr>
+      </w:pPr>
+    </w:p>
+    <w:p>
+      <w:pPr>
+        <w:spacing w:after="0"/>
+        <w:rPr>
+          <w:lang w:val="en-US"/>
+        </w:rPr>
+      </w:pPr>
+      <w:r>
+        <w:rPr>
+          <w:lang w:val="en-US"/>
+        </w:rPr>
+        <w:t>Usin</w:t>
+      </w:r>
+      <w:r>
+        <w:rPr>
+          <w:lang w:val="en-US"/>
+        </w:rPr>
+        <w:t>g</w:t>
+      </w:r>
+      <w:r>
+        <w:rPr>
+          <w:lang w:val="en-US"/>
+        </w:rPr>
+        <w:t xml:space="preserve"> the magnetometer data</w:t>
+      </w:r>
+      <w:r>
+        <w:rPr>
+          <w:lang w:val="en-US"/>
+        </w:rPr>
+        <w:t>:</w:t>
+      </w:r>
+    </w:p>
+    <w:p>
+      <w:pPr>
+        <w:pStyle w:val="ListParagraph"/>
+        <w:numPr>
+          <w:ilvl w:val="0"/>
+          <w:numId w:val="34"/>
+        </w:numPr>
+        <w:spacing w:after="0"/>
+        <w:rPr>
+          <w:lang w:val="en-US"/>
+        </w:rPr>
+      </w:pPr>
+      <w:r>
+        <w:rPr>
+          <w:lang w:val="en-US"/>
+        </w:rPr>
+        <w:t xml:space="preserve">Raw Measurement: The magnetometer outputs  </w:t>
+      </w:r>
+      <m:oMath>
+        <m:sSub>
+          <m:sSubPr>
+            <m:ctrlPr>
+              <w:rPr>
+                <w:rFonts w:ascii="Cambria Math" w:hAnsi="Cambria Math"/>
+                <w:i/>
+                <w:lang w:val="en-US"/>
+              </w:rPr>
+            </m:ctrlPr>
+          </m:sSubPr>
+          <m:e>
+            <m:r>
+              <w:rPr>
+                <w:rFonts w:ascii="Cambria Math" w:hAnsi="Cambria Math"/>
+                <w:lang w:val="en-US"/>
+              </w:rPr>
+              <m:t>M</m:t>
+            </m:r>
+          </m:e>
+          <m:sub>
+            <m:r>
+              <w:rPr>
+                <w:rFonts w:ascii="Cambria Math" w:hAnsi="Cambria Math"/>
+                <w:lang w:val="en-US"/>
+              </w:rPr>
+              <m:t>y</m:t>
+            </m:r>
+          </m:sub>
+        </m:sSub>
+        <m:r>
+          <w:rPr>
+            <w:rFonts w:ascii="Cambria Math" w:hAnsi="Cambria Math"/>
+            <w:lang w:val="en-US"/>
+          </w:rPr>
+          <m:t xml:space="preserve">, </m:t>
+        </m:r>
+        <m:sSub>
+          <m:sSubPr>
+            <m:ctrlPr>
+              <w:rPr>
+                <w:rFonts w:ascii="Cambria Math" w:hAnsi="Cambria Math"/>
+                <w:i/>
+                <w:lang w:val="en-US"/>
+              </w:rPr>
+            </m:ctrlPr>
+          </m:sSubPr>
+          <m:e>
+            <m:r>
+              <w:rPr>
+                <w:rFonts w:ascii="Cambria Math" w:hAnsi="Cambria Math"/>
+                <w:lang w:val="en-US"/>
+              </w:rPr>
+              <m:t>M</m:t>
+            </m:r>
+          </m:e>
+          <m:sub>
+            <m:r>
+              <w:rPr>
+                <w:rFonts w:ascii="Cambria Math" w:hAnsi="Cambria Math"/>
+                <w:lang w:val="en-US"/>
+              </w:rPr>
+              <m:t>x</m:t>
+            </m:r>
+          </m:sub>
+        </m:sSub>
+      </m:oMath>
+      <w:r>
+        <w:rPr>
+          <w:rFonts w:eastAsiaTheme="minorEastAsia"/>
+          <w:lang w:val="en-US"/>
+        </w:rPr>
+        <w:t xml:space="preserve"> </w:t>
+      </w:r>
+      <w:r>
+        <w:rPr>
+          <w:lang w:val="en-US"/>
+        </w:rPr>
+        <w:t>which contain the Earth's magnetic field distorted by the instrument frame's Hard-Iron error. The raw magnetic heading is calculated as:</w:t>
+      </w:r>
+      <w:r>
+        <w:rPr>
+          <w:lang w:val="en-US"/>
+        </w:rPr>
+        <w:t xml:space="preserve"> </w:t>
+      </w:r>
+      <m:oMath>
+        <m:sSub>
+          <m:sSubPr>
+            <m:ctrlPr>
+              <w:rPr>
+                <w:rFonts w:ascii="Cambria Math" w:hAnsi="Cambria Math"/>
+                <w:i/>
+                <w:lang w:val="en-US"/>
+              </w:rPr>
+            </m:ctrlPr>
+          </m:sSubPr>
+          <m:e>
+            <m:r>
+              <w:rPr>
+                <w:rFonts w:ascii="Cambria Math" w:hAnsi="Cambria Math"/>
+                <w:lang w:val="en-US"/>
+              </w:rPr>
+              <m:t>ψ</m:t>
+            </m:r>
+          </m:e>
+          <m:sub>
+            <m:r>
+              <w:rPr>
+                <w:rFonts w:ascii="Cambria Math" w:hAnsi="Cambria Math"/>
+                <w:lang w:val="en-US"/>
+              </w:rPr>
+              <m:t>raw</m:t>
+            </m:r>
+          </m:sub>
+        </m:sSub>
+        <m:r>
+          <w:rPr>
+            <w:rFonts w:ascii="Cambria Math" w:hAnsi="Cambria Math"/>
+            <w:lang w:val="en-US"/>
+          </w:rPr>
+          <m:t>=</m:t>
+        </m:r>
+        <m:r>
+          <w:rPr>
+            <w:rFonts w:ascii="Cambria Math" w:hAnsi="Cambria Math"/>
+            <w:lang w:val="en-US"/>
+          </w:rPr>
+          <m:t>atan</m:t>
+        </m:r>
+        <m:r>
+          <w:rPr>
+            <w:rFonts w:ascii="Cambria Math" w:hAnsi="Cambria Math"/>
+            <w:lang w:val="en-US"/>
+          </w:rPr>
+          <m:t>2</m:t>
+        </m:r>
+        <m:r>
+          <w:rPr>
+            <w:rFonts w:ascii="Cambria Math" w:hAnsi="Cambria Math"/>
+            <w:lang w:val="en-US"/>
+          </w:rPr>
+          <m:t>(-</m:t>
+        </m:r>
+        <m:sSub>
+          <m:sSubPr>
+            <m:ctrlPr>
+              <w:rPr>
+                <w:rFonts w:ascii="Cambria Math" w:hAnsi="Cambria Math"/>
+                <w:i/>
+                <w:lang w:val="en-US"/>
+              </w:rPr>
+            </m:ctrlPr>
+          </m:sSubPr>
+          <m:e>
+            <m:r>
+              <w:rPr>
+                <w:rFonts w:ascii="Cambria Math" w:hAnsi="Cambria Math"/>
+                <w:lang w:val="en-US"/>
+              </w:rPr>
+              <m:t>M</m:t>
+            </m:r>
+          </m:e>
+          <m:sub>
+            <m:r>
+              <w:rPr>
+                <w:rFonts w:ascii="Cambria Math" w:hAnsi="Cambria Math"/>
+                <w:lang w:val="en-US"/>
+              </w:rPr>
+              <m:t>y</m:t>
+            </m:r>
+          </m:sub>
+        </m:sSub>
+        <m:r>
+          <w:rPr>
+            <w:rFonts w:ascii="Cambria Math" w:hAnsi="Cambria Math"/>
+            <w:lang w:val="en-US"/>
+          </w:rPr>
+          <m:t xml:space="preserve">, </m:t>
+        </m:r>
+        <m:sSub>
+          <m:sSubPr>
+            <m:ctrlPr>
+              <w:rPr>
+                <w:rFonts w:ascii="Cambria Math" w:hAnsi="Cambria Math"/>
+                <w:i/>
+                <w:lang w:val="en-US"/>
+              </w:rPr>
+            </m:ctrlPr>
+          </m:sSubPr>
+          <m:e>
+            <m:r>
+              <w:rPr>
+                <w:rFonts w:ascii="Cambria Math" w:hAnsi="Cambria Math"/>
+                <w:lang w:val="en-US"/>
+              </w:rPr>
+              <m:t>M</m:t>
+            </m:r>
+          </m:e>
+          <m:sub>
+            <m:r>
+              <w:rPr>
+                <w:rFonts w:ascii="Cambria Math" w:hAnsi="Cambria Math"/>
+                <w:lang w:val="en-US"/>
+              </w:rPr>
+              <m:t>x</m:t>
+            </m:r>
+          </m:sub>
+        </m:sSub>
+        <m:r>
+          <w:rPr>
+            <w:rFonts w:ascii="Cambria Math" w:hAnsi="Cambria Math"/>
+            <w:lang w:val="en-US"/>
+          </w:rPr>
+          <m:t>)</m:t>
+        </m:r>
+      </m:oMath>
+      <w:r>
+        <w:rPr>
+          <w:lang w:val="en-US"/>
+        </w:rPr>
+        <w:t xml:space="preserve"> </w:t>
+      </w:r>
+    </w:p>
+    <w:p>
+      <w:pPr>
+        <w:pStyle w:val="ListParagraph"/>
+        <w:numPr>
+          <w:ilvl w:val="0"/>
+          <w:numId w:val="34"/>
+        </w:numPr>
+        <w:spacing w:after="0"/>
+        <w:rPr>
+          <w:rFonts w:eastAsiaTheme="minorEastAsia"/>
+          <w:lang w:val="en-US"/>
+        </w:rPr>
+      </w:pPr>
+      <w:r>
+        <w:rPr>
+          <w:lang w:val="en-US"/>
+        </w:rPr>
+        <w:t>Calibration: By fitting a circle to the raw</w:t>
+      </w:r>
+      <m:oMath>
+        <m:r>
+          <w:rPr>
+            <w:rFonts w:ascii="Cambria Math" w:hAnsi="Cambria Math"/>
+            <w:lang w:val="en-US"/>
+          </w:rPr>
+          <m:t xml:space="preserve"> </m:t>
+        </m:r>
+        <m:sSub>
+          <m:sSubPr>
+            <m:ctrlPr>
+              <w:rPr>
+                <w:rFonts w:ascii="Cambria Math" w:hAnsi="Cambria Math"/>
+                <w:i/>
+                <w:lang w:val="en-US"/>
+              </w:rPr>
+            </m:ctrlPr>
+          </m:sSubPr>
+          <m:e>
+            <m:r>
+              <w:rPr>
+                <w:rFonts w:ascii="Cambria Math" w:hAnsi="Cambria Math"/>
+                <w:lang w:val="en-US"/>
+              </w:rPr>
+              <m:t>M</m:t>
+            </m:r>
+          </m:e>
+          <m:sub>
+            <m:r>
+              <w:rPr>
+                <w:rFonts w:ascii="Cambria Math" w:hAnsi="Cambria Math"/>
+                <w:lang w:val="en-US"/>
+              </w:rPr>
+              <m:t>y</m:t>
+            </m:r>
+          </m:sub>
+        </m:sSub>
+        <m:r>
+          <w:rPr>
+            <w:rFonts w:ascii="Cambria Math" w:hAnsi="Cambria Math"/>
+            <w:lang w:val="en-US"/>
+          </w:rPr>
+          <m:t xml:space="preserve">, </m:t>
+        </m:r>
+        <m:sSub>
+          <m:sSubPr>
+            <m:ctrlPr>
+              <w:rPr>
+                <w:rFonts w:ascii="Cambria Math" w:hAnsi="Cambria Math"/>
+                <w:i/>
+                <w:lang w:val="en-US"/>
+              </w:rPr>
+            </m:ctrlPr>
+          </m:sSubPr>
+          <m:e>
+            <m:r>
+              <w:rPr>
+                <w:rFonts w:ascii="Cambria Math" w:hAnsi="Cambria Math"/>
+                <w:lang w:val="en-US"/>
+              </w:rPr>
+              <m:t>M</m:t>
+            </m:r>
+          </m:e>
+          <m:sub>
+            <m:r>
+              <w:rPr>
+                <w:rFonts w:ascii="Cambria Math" w:hAnsi="Cambria Math"/>
+                <w:lang w:val="en-US"/>
+              </w:rPr>
+              <m:t>x</m:t>
+            </m:r>
+          </m:sub>
+        </m:sSub>
+      </m:oMath>
+      <w:r>
+        <w:rPr>
+          <w:lang w:val="en-US"/>
+        </w:rPr>
+        <w:t xml:space="preserve"> data points, we identify the offsets </w:t>
+      </w:r>
+      <m:oMath>
+        <m:sSub>
+          <m:sSubPr>
+            <m:ctrlPr>
+              <w:rPr>
+                <w:rFonts w:ascii="Cambria Math" w:hAnsi="Cambria Math"/>
+                <w:i/>
+                <w:lang w:val="en-US"/>
+              </w:rPr>
+            </m:ctrlPr>
+          </m:sSubPr>
+          <m:e>
+            <m:r>
+              <w:rPr>
+                <w:rFonts w:ascii="Cambria Math" w:hAnsi="Cambria Math"/>
+                <w:lang w:val="en-US"/>
+              </w:rPr>
+              <m:t>y</m:t>
+            </m:r>
+          </m:e>
+          <m:sub>
+            <m:r>
+              <w:rPr>
+                <w:rFonts w:ascii="Cambria Math" w:hAnsi="Cambria Math"/>
+                <w:lang w:val="en-US"/>
+              </w:rPr>
+              <m:t>c</m:t>
+            </m:r>
+          </m:sub>
+        </m:sSub>
+        <m:r>
+          <w:rPr>
+            <w:rFonts w:ascii="Cambria Math" w:hAnsi="Cambria Math"/>
+            <w:lang w:val="en-US"/>
+          </w:rPr>
+          <m:t>,</m:t>
+        </m:r>
+        <m:sSub>
+          <m:sSubPr>
+            <m:ctrlPr>
+              <w:rPr>
+                <w:rFonts w:ascii="Cambria Math" w:hAnsi="Cambria Math"/>
+                <w:i/>
+                <w:lang w:val="en-US"/>
+              </w:rPr>
+            </m:ctrlPr>
+          </m:sSubPr>
+          <m:e>
+            <m:r>
+              <w:rPr>
+                <w:rFonts w:ascii="Cambria Math" w:hAnsi="Cambria Math"/>
+                <w:lang w:val="en-US"/>
+              </w:rPr>
+              <m:t>x</m:t>
+            </m:r>
+          </m:e>
+          <m:sub>
+            <m:r>
+              <w:rPr>
+                <w:rFonts w:ascii="Cambria Math" w:hAnsi="Cambria Math"/>
+                <w:lang w:val="en-US"/>
+              </w:rPr>
+              <m:t>c</m:t>
+            </m:r>
+          </m:sub>
+        </m:sSub>
+      </m:oMath>
+      <w:r>
+        <w:rPr>
+          <w:lang w:val="en-US"/>
+        </w:rPr>
+        <w:t>. The corrected heading relative to Magnetic North is found by centering the data:</w:t>
+      </w:r>
+      <w:r>
+        <w:rPr>
+          <w:rFonts w:eastAsiaTheme="minorEastAsia"/>
+          <w:lang w:val="en-US"/>
+        </w:rPr>
+        <w:t xml:space="preserve"> </w:t>
+      </w:r>
+      <m:oMath>
+        <m:func>
+          <m:funcPr>
+            <m:ctrlPr>
+              <w:rPr>
+                <w:rFonts w:ascii="Cambria Math" w:hAnsi="Cambria Math"/>
+                <w:lang w:val="en-US"/>
+              </w:rPr>
+            </m:ctrlPr>
+          </m:funcPr>
+          <m:fName>
+            <m:sSub>
+              <m:sSubPr>
+                <m:ctrlPr>
+                  <w:rPr>
+                    <w:rFonts w:ascii="Cambria Math" w:hAnsi="Cambria Math"/>
+                    <w:i/>
+                    <w:lang w:val="en-US"/>
+                  </w:rPr>
+                </m:ctrlPr>
+              </m:sSubPr>
+              <m:e>
+                <m:r>
+                  <w:rPr>
+                    <w:rFonts w:ascii="Cambria Math" w:hAnsi="Cambria Math"/>
+                    <w:lang w:val="en-US"/>
+                  </w:rPr>
+                  <m:t>ψ</m:t>
+                </m:r>
+              </m:e>
+              <m:sub>
+                <m:r>
+                  <w:rPr>
+                    <w:rFonts w:ascii="Cambria Math" w:hAnsi="Cambria Math"/>
+                    <w:lang w:val="en-US"/>
+                  </w:rPr>
+                  <m:t>true</m:t>
+                </m:r>
+              </m:sub>
+            </m:sSub>
+            <m:r>
+              <w:rPr>
+                <w:rFonts w:ascii="Cambria Math" w:hAnsi="Cambria Math"/>
+                <w:lang w:val="en-US"/>
+              </w:rPr>
+              <m:t>=</m:t>
+            </m:r>
+            <m:r>
+              <m:rPr>
+                <m:sty m:val="p"/>
+              </m:rPr>
+              <w:rPr>
+                <w:rFonts w:ascii="Cambria Math" w:hAnsi="Cambria Math"/>
+                <w:lang w:val="en-US"/>
+              </w:rPr>
+              <m:t>atan</m:t>
+            </m:r>
+            <m:r>
+              <m:rPr>
+                <m:sty m:val="p"/>
+              </m:rPr>
+              <w:rPr>
+                <w:rFonts w:ascii="Cambria Math" w:hAnsi="Cambria Math"/>
+                <w:lang w:val="en-US"/>
+              </w:rPr>
+              <m:t>2</m:t>
+            </m:r>
+          </m:fName>
+          <m:e>
+            <m:d>
+              <m:dPr>
+                <m:ctrlPr>
+                  <w:rPr>
+                    <w:rFonts w:ascii="Cambria Math" w:hAnsi="Cambria Math"/>
+                    <w:i/>
+                    <w:lang w:val="en-US"/>
+                  </w:rPr>
+                </m:ctrlPr>
+              </m:dPr>
+              <m:e>
+                <m:r>
+                  <w:rPr>
+                    <w:rFonts w:ascii="Cambria Math" w:hAnsi="Cambria Math"/>
+                    <w:lang w:val="en-US"/>
+                  </w:rPr>
+                  <m:t>-</m:t>
+                </m:r>
+                <m:r>
+                  <w:rPr>
+                    <w:rFonts w:ascii="Cambria Math" w:hAnsi="Cambria Math"/>
+                    <w:lang w:val="en-US"/>
+                  </w:rPr>
+                  <m:t>(</m:t>
+                </m:r>
+                <m:sSub>
+                  <m:sSubPr>
+                    <m:ctrlPr>
+                      <w:rPr>
+                        <w:rFonts w:ascii="Cambria Math" w:hAnsi="Cambria Math"/>
+                        <w:i/>
+                        <w:lang w:val="en-US"/>
+                      </w:rPr>
+                    </m:ctrlPr>
+                  </m:sSubPr>
+                  <m:e>
+                    <m:r>
+                      <w:rPr>
+                        <w:rFonts w:ascii="Cambria Math" w:hAnsi="Cambria Math"/>
+                        <w:lang w:val="en-US"/>
+                      </w:rPr>
+                      <m:t>M</m:t>
+                    </m:r>
+                  </m:e>
+                  <m:sub>
+                    <m:r>
+                      <w:rPr>
+                        <w:rFonts w:ascii="Cambria Math" w:hAnsi="Cambria Math"/>
+                        <w:lang w:val="en-US"/>
+                      </w:rPr>
+                      <m:t>y</m:t>
+                    </m:r>
+                  </m:sub>
+                </m:sSub>
+                <m:r>
+                  <w:rPr>
+                    <w:rFonts w:ascii="Cambria Math" w:hAnsi="Cambria Math"/>
+                    <w:lang w:val="en-US"/>
+                  </w:rPr>
+                  <m:t>-</m:t>
+                </m:r>
+                <m:sSub>
+                  <m:sSubPr>
+                    <m:ctrlPr>
+                      <w:rPr>
+                        <w:rFonts w:ascii="Cambria Math" w:hAnsi="Cambria Math"/>
+                        <w:i/>
+                        <w:lang w:val="en-US"/>
+                      </w:rPr>
+                    </m:ctrlPr>
+                  </m:sSubPr>
+                  <m:e>
+                    <m:r>
+                      <w:rPr>
+                        <w:rFonts w:ascii="Cambria Math" w:hAnsi="Cambria Math"/>
+                        <w:lang w:val="en-US"/>
+                      </w:rPr>
+                      <m:t>y</m:t>
+                    </m:r>
+                  </m:e>
+                  <m:sub>
+                    <m:r>
+                      <w:rPr>
+                        <w:rFonts w:ascii="Cambria Math" w:hAnsi="Cambria Math"/>
+                        <w:lang w:val="en-US"/>
+                      </w:rPr>
+                      <m:t>c</m:t>
+                    </m:r>
+                  </m:sub>
+                </m:sSub>
+                <m:r>
+                  <w:rPr>
+                    <w:rFonts w:ascii="Cambria Math" w:hAnsi="Cambria Math"/>
+                    <w:lang w:val="en-US"/>
+                  </w:rPr>
+                  <m:t>)</m:t>
+                </m:r>
+                <m:r>
+                  <w:rPr>
+                    <w:rFonts w:ascii="Cambria Math" w:hAnsi="Cambria Math"/>
+                    <w:lang w:val="en-US"/>
+                  </w:rPr>
+                  <m:t xml:space="preserve">, </m:t>
+                </m:r>
+                <m:sSub>
+                  <m:sSubPr>
+                    <m:ctrlPr>
+                      <w:rPr>
+                        <w:rFonts w:ascii="Cambria Math" w:hAnsi="Cambria Math"/>
+                        <w:i/>
+                        <w:lang w:val="en-US"/>
+                      </w:rPr>
+                    </m:ctrlPr>
+                  </m:sSubPr>
+                  <m:e>
+                    <m:r>
+                      <w:rPr>
+                        <w:rFonts w:ascii="Cambria Math" w:hAnsi="Cambria Math"/>
+                        <w:lang w:val="en-US"/>
+                      </w:rPr>
+                      <m:t>M</m:t>
+                    </m:r>
+                  </m:e>
+                  <m:sub>
+                    <m:r>
+                      <w:rPr>
+                        <w:rFonts w:ascii="Cambria Math" w:hAnsi="Cambria Math"/>
+                        <w:lang w:val="en-US"/>
+                      </w:rPr>
+                      <m:t>x</m:t>
+                    </m:r>
+                  </m:sub>
+                </m:sSub>
+                <m:r>
+                  <w:rPr>
+                    <w:rFonts w:ascii="Cambria Math" w:hAnsi="Cambria Math"/>
+                    <w:lang w:val="en-US"/>
+                  </w:rPr>
+                  <m:t>-</m:t>
+                </m:r>
+                <m:sSub>
+                  <m:sSubPr>
+                    <m:ctrlPr>
+                      <w:rPr>
+                        <w:rFonts w:ascii="Cambria Math" w:hAnsi="Cambria Math"/>
+                        <w:i/>
+                        <w:lang w:val="en-US"/>
+                      </w:rPr>
+                    </m:ctrlPr>
+                  </m:sSubPr>
+                  <m:e>
+                    <m:r>
+                      <w:rPr>
+                        <w:rFonts w:ascii="Cambria Math" w:hAnsi="Cambria Math"/>
+                        <w:lang w:val="en-US"/>
+                      </w:rPr>
+                      <m:t>x</m:t>
+                    </m:r>
+                  </m:e>
+                  <m:sub>
+                    <m:r>
+                      <w:rPr>
+                        <w:rFonts w:ascii="Cambria Math" w:hAnsi="Cambria Math"/>
+                        <w:lang w:val="en-US"/>
+                      </w:rPr>
+                      <m:t>c</m:t>
+                    </m:r>
+                  </m:sub>
+                </m:sSub>
+              </m:e>
+            </m:d>
+          </m:e>
+        </m:func>
+      </m:oMath>
+    </w:p>
+    <w:p>
+      <w:pPr>
+        <w:pStyle w:val="ListParagraph"/>
+        <w:numPr>
+          <w:ilvl w:val="0"/>
+          <w:numId w:val="34"/>
+        </w:numPr>
+        <w:spacing w:after="0"/>
+        <w:rPr>
+          <w:rFonts w:eastAsiaTheme="minorEastAsia"/>
+          <w:lang w:val="en-US"/>
+        </w:rPr>
+      </w:pPr>
+      <w:r>
+        <w:rPr>
+          <w:lang w:val="en-US"/>
+        </w:rPr>
+        <w:t>Correction Angle: The angular deviation caused by the Hard-Iron effect is:</w:t>
+      </w:r>
+      <w:r>
+        <w:rPr>
+          <w:lang w:val="en-US"/>
+        </w:rPr>
+        <w:t xml:space="preserve"> </w:t>
+      </w:r>
+    </w:p>
+    <w:p>
+      <w:pPr>
+        <w:pStyle w:val="ListParagraph"/>
+        <w:spacing w:after="0"/>
+        <w:ind w:left="770"/>
+        <w:rPr>
+          <w:rFonts w:eastAsiaTheme="minorEastAsia"/>
+          <w:lang w:val="en-US"/>
+        </w:rPr>
+      </w:pPr>
+      <m:oMathPara>
+        <m:oMath>
+          <m:r>
+            <w:rPr>
+              <w:rFonts w:ascii="Cambria Math" w:hAnsi="Cambria Math"/>
+              <w:lang w:val="en-US"/>
+            </w:rPr>
+            <m:t>ϵ</m:t>
+          </m:r>
+          <m:r>
+            <w:rPr>
+              <w:rFonts w:ascii="Cambria Math" w:hAnsi="Cambria Math"/>
+              <w:lang w:val="en-US"/>
+            </w:rPr>
+            <m:t>=</m:t>
+          </m:r>
+          <m:sSub>
+            <m:sSubPr>
+              <m:ctrlPr>
+                <w:rPr>
+                  <w:rFonts w:ascii="Cambria Math" w:hAnsi="Cambria Math"/>
+                  <w:i/>
+                  <w:lang w:val="en-US"/>
+                </w:rPr>
+              </m:ctrlPr>
+            </m:sSubPr>
+            <m:e>
+              <m:r>
+                <w:rPr>
+                  <w:rFonts w:ascii="Cambria Math" w:hAnsi="Cambria Math"/>
+                  <w:lang w:val="en-US"/>
+                </w:rPr>
+                <m:t>ψ</m:t>
+              </m:r>
+            </m:e>
+            <m:sub>
+              <m:r>
+                <w:rPr>
+                  <w:rFonts w:ascii="Cambria Math" w:hAnsi="Cambria Math"/>
+                  <w:lang w:val="en-US"/>
+                </w:rPr>
+                <m:t>true</m:t>
+              </m:r>
+            </m:sub>
+          </m:sSub>
+          <m:r>
+            <w:rPr>
+              <w:rFonts w:ascii="Cambria Math" w:hAnsi="Cambria Math"/>
+              <w:lang w:val="en-US"/>
+            </w:rPr>
+            <m:t>-</m:t>
+          </m:r>
+          <m:sSub>
+            <m:sSubPr>
+              <m:ctrlPr>
+                <w:rPr>
+                  <w:rFonts w:ascii="Cambria Math" w:hAnsi="Cambria Math"/>
+                  <w:i/>
+                  <w:lang w:val="en-US"/>
+                </w:rPr>
+              </m:ctrlPr>
+            </m:sSubPr>
+            <m:e>
+              <m:r>
+                <w:rPr>
+                  <w:rFonts w:ascii="Cambria Math" w:hAnsi="Cambria Math"/>
+                  <w:lang w:val="en-US"/>
+                </w:rPr>
+                <m:t>ψ</m:t>
+              </m:r>
+            </m:e>
+            <m:sub>
+              <m:r>
+                <w:rPr>
+                  <w:rFonts w:ascii="Cambria Math" w:hAnsi="Cambria Math"/>
+                  <w:lang w:val="en-US"/>
+                </w:rPr>
+                <m:t>raw</m:t>
+              </m:r>
+            </m:sub>
+          </m:sSub>
+        </m:oMath>
+      </m:oMathPara>
+    </w:p>
+    <w:p>
+      <w:pPr>
+        <w:pStyle w:val="ListParagraph"/>
+        <w:numPr>
+          <w:ilvl w:val="0"/>
+          <w:numId w:val="34"/>
+        </w:numPr>
+        <w:spacing w:after="0"/>
+        <w:rPr>
+          <w:rFonts w:eastAsiaTheme="minorEastAsia"/>
+          <w:lang w:val="en-US"/>
+        </w:rPr>
+      </w:pPr>
+      <w:r>
+        <w:rPr>
+          <w:rFonts w:eastAsiaTheme="minorEastAsia"/>
+          <w:lang w:val="en-US"/>
+        </w:rPr>
+        <w:lastRenderedPageBreak/>
+        <w:t xml:space="preserve">Velocity Transformation: To align the measured velocities </w:t>
+      </w:r>
+      <m:oMath>
+        <m:sSub>
+          <m:sSubPr>
+            <m:ctrlPr>
+              <w:rPr>
+                <w:rFonts w:ascii="Cambria Math" w:eastAsiaTheme="minorEastAsia" w:hAnsi="Cambria Math"/>
+                <w:i/>
+                <w:lang w:val="en-US"/>
+              </w:rPr>
+            </m:ctrlPr>
+          </m:sSubPr>
+          <m:e>
+            <m:r>
+              <w:rPr>
+                <w:rFonts w:ascii="Cambria Math" w:eastAsiaTheme="minorEastAsia" w:hAnsi="Cambria Math"/>
+                <w:lang w:val="en-US"/>
+              </w:rPr>
+              <m:t>U</m:t>
+            </m:r>
+          </m:e>
+          <m:sub>
+            <m:r>
+              <w:rPr>
+                <w:rFonts w:ascii="Cambria Math" w:eastAsiaTheme="minorEastAsia" w:hAnsi="Cambria Math"/>
+                <w:lang w:val="en-US"/>
+              </w:rPr>
+              <m:t>raw</m:t>
+            </m:r>
+          </m:sub>
+        </m:sSub>
+        <m:r>
+          <w:rPr>
+            <w:rFonts w:ascii="Cambria Math" w:eastAsiaTheme="minorEastAsia" w:hAnsi="Cambria Math"/>
+            <w:lang w:val="en-US"/>
+          </w:rPr>
+          <m:t xml:space="preserve">, </m:t>
+        </m:r>
+        <m:sSub>
+          <m:sSubPr>
+            <m:ctrlPr>
+              <w:rPr>
+                <w:rFonts w:ascii="Cambria Math" w:eastAsiaTheme="minorEastAsia" w:hAnsi="Cambria Math"/>
+                <w:i/>
+                <w:lang w:val="en-US"/>
+              </w:rPr>
+            </m:ctrlPr>
+          </m:sSubPr>
+          <m:e>
+            <m:r>
+              <w:rPr>
+                <w:rFonts w:ascii="Cambria Math" w:eastAsiaTheme="minorEastAsia" w:hAnsi="Cambria Math"/>
+                <w:lang w:val="en-US"/>
+              </w:rPr>
+              <m:t>V</m:t>
+            </m:r>
+          </m:e>
+          <m:sub>
+            <m:r>
+              <w:rPr>
+                <w:rFonts w:ascii="Cambria Math" w:eastAsiaTheme="minorEastAsia" w:hAnsi="Cambria Math"/>
+                <w:lang w:val="en-US"/>
+              </w:rPr>
+              <m:t>raw</m:t>
+            </m:r>
+          </m:sub>
+        </m:sSub>
+      </m:oMath>
+      <w:r>
+        <w:rPr>
+          <w:rFonts w:eastAsiaTheme="minorEastAsia"/>
+          <w:lang w:val="en-US"/>
+        </w:rPr>
+        <w:t xml:space="preserve"> </w:t>
+      </w:r>
+      <w:r>
+        <w:rPr>
+          <w:rFonts w:eastAsiaTheme="minorEastAsia"/>
+          <w:lang w:val="en-US"/>
+        </w:rPr>
+        <w:t>with the corrected heading, we apply a rotation matrix using the error</w:t>
+      </w:r>
+      <w:r>
+        <w:rPr>
+          <w:rFonts w:eastAsiaTheme="minorEastAsia"/>
+          <w:lang w:val="en-US"/>
+        </w:rPr>
+        <w:t xml:space="preserve"> </w:t>
+      </w:r>
+      <m:oMath>
+        <m:r>
+          <w:rPr>
+            <w:rFonts w:ascii="Cambria Math" w:eastAsiaTheme="minorEastAsia" w:hAnsi="Cambria Math"/>
+            <w:lang w:val="en-US"/>
+          </w:rPr>
+          <m:t>ϵ</m:t>
+        </m:r>
+      </m:oMath>
+      <w:r>
+        <w:rPr>
+          <w:rFonts w:eastAsiaTheme="minorEastAsia"/>
+          <w:lang w:val="en-US"/>
+        </w:rPr>
+        <w:t>:</w:t>
+      </w:r>
+      <w:r>
+        <w:rPr>
+          <w:rFonts w:eastAsiaTheme="minorEastAsia"/>
+          <w:lang w:val="en-US"/>
+        </w:rPr>
+        <w:tab/>
+      </w:r>
+    </w:p>
+    <w:p>
+      <w:pPr>
+        <w:spacing w:after="0"/>
+        <w:ind w:left="2570" w:firstLine="310"/>
+        <w:rPr>
+          <w:rFonts w:eastAsiaTheme="minorEastAsia"/>
+          <w:lang w:val="en-US"/>
+        </w:rPr>
+      </w:pPr>
+      <w:r>
+        <w:rPr>
+          <w:rFonts w:eastAsiaTheme="minorEastAsia"/>
+          <w:lang w:val="en-US"/>
+        </w:rPr>
+        <w:t xml:space="preserve"> </w:t>
+      </w:r>
+      <m:oMath>
+        <m:sSub>
+          <m:sSubPr>
+            <m:ctrlPr>
+              <w:rPr>
+                <w:rFonts w:ascii="Cambria Math" w:eastAsiaTheme="minorEastAsia" w:hAnsi="Cambria Math"/>
+                <w:i/>
+                <w:lang w:val="en-US"/>
+              </w:rPr>
+            </m:ctrlPr>
+          </m:sSubPr>
+          <m:e>
+            <m:r>
+              <w:rPr>
+                <w:rFonts w:ascii="Cambria Math" w:eastAsiaTheme="minorEastAsia" w:hAnsi="Cambria Math"/>
+                <w:lang w:val="en-US"/>
+              </w:rPr>
+              <m:t>U</m:t>
+            </m:r>
+          </m:e>
+          <m:sub>
+            <m:r>
+              <w:rPr>
+                <w:rFonts w:ascii="Cambria Math" w:eastAsiaTheme="minorEastAsia" w:hAnsi="Cambria Math"/>
+                <w:lang w:val="en-US"/>
+              </w:rPr>
+              <m:t>corr</m:t>
+            </m:r>
+          </m:sub>
+        </m:sSub>
+        <m:r>
+          <w:rPr>
+            <w:rFonts w:ascii="Cambria Math" w:eastAsiaTheme="minorEastAsia" w:hAnsi="Cambria Math"/>
+            <w:lang w:val="en-US"/>
+          </w:rPr>
+          <m:t>=</m:t>
+        </m:r>
+        <m:sSub>
+          <m:sSubPr>
+            <m:ctrlPr>
+              <w:rPr>
+                <w:rFonts w:ascii="Cambria Math" w:eastAsiaTheme="minorEastAsia" w:hAnsi="Cambria Math"/>
+                <w:i/>
+                <w:lang w:val="en-US"/>
+              </w:rPr>
+            </m:ctrlPr>
+          </m:sSubPr>
+          <m:e>
+            <m:r>
+              <w:rPr>
+                <w:rFonts w:ascii="Cambria Math" w:eastAsiaTheme="minorEastAsia" w:hAnsi="Cambria Math"/>
+                <w:lang w:val="en-US"/>
+              </w:rPr>
+              <m:t>U</m:t>
+            </m:r>
+          </m:e>
+          <m:sub>
+            <m:r>
+              <w:rPr>
+                <w:rFonts w:ascii="Cambria Math" w:eastAsiaTheme="minorEastAsia" w:hAnsi="Cambria Math"/>
+                <w:lang w:val="en-US"/>
+              </w:rPr>
+              <m:t>raw</m:t>
+            </m:r>
+          </m:sub>
+        </m:sSub>
+        <m:func>
+          <m:funcPr>
+            <m:ctrlPr>
+              <w:rPr>
+                <w:rFonts w:ascii="Cambria Math" w:eastAsiaTheme="minorEastAsia" w:hAnsi="Cambria Math"/>
+                <w:lang w:val="en-US"/>
+              </w:rPr>
+            </m:ctrlPr>
+          </m:funcPr>
+          <m:fName>
+            <m:r>
+              <m:rPr>
+                <m:sty m:val="p"/>
+              </m:rPr>
+              <w:rPr>
+                <w:rFonts w:ascii="Cambria Math" w:eastAsiaTheme="minorEastAsia" w:hAnsi="Cambria Math"/>
+                <w:lang w:val="en-US"/>
+              </w:rPr>
+              <m:t>cos</m:t>
+            </m:r>
+          </m:fName>
+          <m:e>
+            <m:d>
+              <m:dPr>
+                <m:ctrlPr>
+                  <w:rPr>
+                    <w:rFonts w:ascii="Cambria Math" w:eastAsiaTheme="minorEastAsia" w:hAnsi="Cambria Math"/>
+                    <w:i/>
+                    <w:lang w:val="en-US"/>
+                  </w:rPr>
+                </m:ctrlPr>
+              </m:dPr>
+              <m:e>
+                <m:r>
+                  <w:rPr>
+                    <w:rFonts w:ascii="Cambria Math" w:eastAsiaTheme="minorEastAsia" w:hAnsi="Cambria Math"/>
+                    <w:lang w:val="en-US"/>
+                  </w:rPr>
+                  <m:t>ϵ</m:t>
+                </m:r>
+              </m:e>
+            </m:d>
+          </m:e>
+        </m:func>
+        <m:r>
+          <w:rPr>
+            <w:rFonts w:ascii="Cambria Math" w:eastAsiaTheme="minorEastAsia" w:hAnsi="Cambria Math"/>
+            <w:lang w:val="en-US"/>
+          </w:rPr>
+          <m:t>-</m:t>
+        </m:r>
+        <m:sSub>
+          <m:sSubPr>
+            <m:ctrlPr>
+              <w:rPr>
+                <w:rFonts w:ascii="Cambria Math" w:eastAsiaTheme="minorEastAsia" w:hAnsi="Cambria Math"/>
+                <w:i/>
+                <w:lang w:val="en-US"/>
+              </w:rPr>
+            </m:ctrlPr>
+          </m:sSubPr>
+          <m:e>
+            <m:r>
+              <w:rPr>
+                <w:rFonts w:ascii="Cambria Math" w:eastAsiaTheme="minorEastAsia" w:hAnsi="Cambria Math"/>
+                <w:lang w:val="en-US"/>
+              </w:rPr>
+              <m:t>V</m:t>
+            </m:r>
+          </m:e>
+          <m:sub>
+            <m:r>
+              <w:rPr>
+                <w:rFonts w:ascii="Cambria Math" w:eastAsiaTheme="minorEastAsia" w:hAnsi="Cambria Math"/>
+                <w:lang w:val="en-US"/>
+              </w:rPr>
+              <m:t>raw</m:t>
+            </m:r>
+          </m:sub>
+        </m:sSub>
+        <m:func>
+          <m:funcPr>
+            <m:ctrlPr>
+              <w:rPr>
+                <w:rFonts w:ascii="Cambria Math" w:eastAsiaTheme="minorEastAsia" w:hAnsi="Cambria Math"/>
+                <w:lang w:val="en-US"/>
+              </w:rPr>
+            </m:ctrlPr>
+          </m:funcPr>
+          <m:fName>
+            <m:r>
+              <m:rPr>
+                <m:sty m:val="p"/>
+              </m:rPr>
+              <w:rPr>
+                <w:rFonts w:ascii="Cambria Math" w:eastAsiaTheme="minorEastAsia" w:hAnsi="Cambria Math"/>
+                <w:lang w:val="en-US"/>
+              </w:rPr>
+              <m:t>sin</m:t>
+            </m:r>
+          </m:fName>
+          <m:e>
+            <m:d>
+              <m:dPr>
+                <m:ctrlPr>
+                  <w:rPr>
+                    <w:rFonts w:ascii="Cambria Math" w:eastAsiaTheme="minorEastAsia" w:hAnsi="Cambria Math"/>
+                    <w:i/>
+                    <w:lang w:val="en-US"/>
+                  </w:rPr>
+                </m:ctrlPr>
+              </m:dPr>
+              <m:e>
+                <m:r>
+                  <w:rPr>
+                    <w:rFonts w:ascii="Cambria Math" w:eastAsiaTheme="minorEastAsia" w:hAnsi="Cambria Math"/>
+                    <w:lang w:val="en-US"/>
+                  </w:rPr>
+                  <m:t>ϵ</m:t>
+                </m:r>
+              </m:e>
+            </m:d>
+          </m:e>
+        </m:func>
+      </m:oMath>
+    </w:p>
+    <w:p>
+      <w:pPr>
+        <w:spacing w:after="0"/>
+        <w:rPr>
+          <w:rFonts w:eastAsiaTheme="minorEastAsia"/>
+          <w:lang w:val="en-US"/>
+        </w:rPr>
+      </w:pPr>
+      <m:oMathPara>
+        <m:oMath>
+          <m:sSub>
+            <m:sSubPr>
+              <m:ctrlPr>
+                <w:rPr>
+                  <w:rFonts w:ascii="Cambria Math" w:eastAsiaTheme="minorEastAsia" w:hAnsi="Cambria Math"/>
+                  <w:i/>
+                  <w:lang w:val="en-US"/>
+                </w:rPr>
+              </m:ctrlPr>
+            </m:sSubPr>
+            <m:e>
+              <m:r>
+                <w:rPr>
+                  <w:rFonts w:ascii="Cambria Math" w:eastAsiaTheme="minorEastAsia" w:hAnsi="Cambria Math"/>
+                  <w:lang w:val="en-US"/>
+                </w:rPr>
+                <m:t>V</m:t>
+              </m:r>
+            </m:e>
+            <m:sub>
+              <m:r>
+                <w:rPr>
+                  <w:rFonts w:ascii="Cambria Math" w:eastAsiaTheme="minorEastAsia" w:hAnsi="Cambria Math"/>
+                  <w:lang w:val="en-US"/>
+                </w:rPr>
+                <m:t>corr</m:t>
+              </m:r>
+            </m:sub>
+          </m:sSub>
+          <m:r>
+            <w:rPr>
+              <w:rFonts w:ascii="Cambria Math" w:eastAsiaTheme="minorEastAsia" w:hAnsi="Cambria Math"/>
+              <w:lang w:val="en-US"/>
+            </w:rPr>
+            <m:t>=</m:t>
+          </m:r>
+          <m:sSub>
+            <m:sSubPr>
+              <m:ctrlPr>
+                <w:rPr>
+                  <w:rFonts w:ascii="Cambria Math" w:eastAsiaTheme="minorEastAsia" w:hAnsi="Cambria Math"/>
+                  <w:i/>
+                  <w:lang w:val="en-US"/>
+                </w:rPr>
+              </m:ctrlPr>
+            </m:sSubPr>
+            <m:e>
+              <m:r>
+                <w:rPr>
+                  <w:rFonts w:ascii="Cambria Math" w:eastAsiaTheme="minorEastAsia" w:hAnsi="Cambria Math"/>
+                  <w:lang w:val="en-US"/>
+                </w:rPr>
+                <m:t>U</m:t>
+              </m:r>
+            </m:e>
+            <m:sub>
+              <m:r>
+                <w:rPr>
+                  <w:rFonts w:ascii="Cambria Math" w:eastAsiaTheme="minorEastAsia" w:hAnsi="Cambria Math"/>
+                  <w:lang w:val="en-US"/>
+                </w:rPr>
+                <m:t>raw</m:t>
+              </m:r>
+            </m:sub>
+          </m:sSub>
+          <m:func>
+            <m:funcPr>
+              <m:ctrlPr>
+                <w:rPr>
+                  <w:rFonts w:ascii="Cambria Math" w:eastAsiaTheme="minorEastAsia" w:hAnsi="Cambria Math"/>
+                  <w:lang w:val="en-US"/>
+                </w:rPr>
+              </m:ctrlPr>
+            </m:funcPr>
+            <m:fName>
+              <m:r>
+                <m:rPr>
+                  <m:sty m:val="p"/>
+                </m:rPr>
+                <w:rPr>
+                  <w:rFonts w:ascii="Cambria Math" w:eastAsiaTheme="minorEastAsia" w:hAnsi="Cambria Math"/>
+                  <w:lang w:val="en-US"/>
+                </w:rPr>
+                <m:t>sin</m:t>
+              </m:r>
+            </m:fName>
+            <m:e>
+              <m:d>
+                <m:dPr>
+                  <m:ctrlPr>
+                    <w:rPr>
+                      <w:rFonts w:ascii="Cambria Math" w:eastAsiaTheme="minorEastAsia" w:hAnsi="Cambria Math"/>
+                      <w:i/>
+                      <w:lang w:val="en-US"/>
+                    </w:rPr>
+                  </m:ctrlPr>
+                </m:dPr>
+                <m:e>
+                  <m:r>
+                    <w:rPr>
+                      <w:rFonts w:ascii="Cambria Math" w:eastAsiaTheme="minorEastAsia" w:hAnsi="Cambria Math"/>
+                      <w:lang w:val="en-US"/>
+                    </w:rPr>
+                    <m:t>ϵ</m:t>
+                  </m:r>
+                </m:e>
+              </m:d>
+            </m:e>
+          </m:func>
+          <m:r>
+            <w:rPr>
+              <w:rFonts w:ascii="Cambria Math" w:eastAsiaTheme="minorEastAsia" w:hAnsi="Cambria Math"/>
+              <w:lang w:val="en-US"/>
+            </w:rPr>
+            <m:t>+</m:t>
+          </m:r>
+          <m:sSub>
+            <m:sSubPr>
+              <m:ctrlPr>
+                <w:rPr>
+                  <w:rFonts w:ascii="Cambria Math" w:eastAsiaTheme="minorEastAsia" w:hAnsi="Cambria Math"/>
+                  <w:i/>
+                  <w:lang w:val="en-US"/>
+                </w:rPr>
+              </m:ctrlPr>
+            </m:sSubPr>
+            <m:e>
+              <m:r>
+                <w:rPr>
+                  <w:rFonts w:ascii="Cambria Math" w:eastAsiaTheme="minorEastAsia" w:hAnsi="Cambria Math"/>
+                  <w:lang w:val="en-US"/>
+                </w:rPr>
+                <m:t>V</m:t>
+              </m:r>
+            </m:e>
+            <m:sub>
+              <m:r>
+                <w:rPr>
+                  <w:rFonts w:ascii="Cambria Math" w:eastAsiaTheme="minorEastAsia" w:hAnsi="Cambria Math"/>
+                  <w:lang w:val="en-US"/>
+                </w:rPr>
+                <m:t>raw</m:t>
+              </m:r>
+            </m:sub>
+          </m:sSub>
+          <m:r>
+            <m:rPr>
+              <m:sty m:val="p"/>
+            </m:rPr>
+            <w:rPr>
+              <w:rFonts w:ascii="Cambria Math" w:eastAsiaTheme="minorEastAsia" w:hAnsi="Cambria Math"/>
+              <w:lang w:val="en-US"/>
+            </w:rPr>
+            <m:t>cos⁡</m:t>
+          </m:r>
+          <m:r>
+            <w:rPr>
+              <w:rFonts w:ascii="Cambria Math" w:eastAsiaTheme="minorEastAsia" w:hAnsi="Cambria Math"/>
+              <w:lang w:val="en-US"/>
+            </w:rPr>
+            <m:t>(</m:t>
+          </m:r>
+          <m:r>
+            <w:rPr>
+              <w:rFonts w:ascii="Cambria Math" w:eastAsiaTheme="minorEastAsia" w:hAnsi="Cambria Math"/>
+              <w:lang w:val="en-US"/>
+            </w:rPr>
+            <m:t>ϵ)</m:t>
+          </m:r>
+        </m:oMath>
+      </m:oMathPara>
+    </w:p>
+    <w:p>
+      <w:pPr>
+        <w:spacing w:after="0"/>
+        <w:rPr>
           <w:sz w:val="22"/>
           <w:szCs w:val="22"/>
           <w:lang w:val="en-US"/>
@@ -2559,117 +3943,454 @@
           <w:lang w:val="en-US"/>
         </w:rPr>
       </w:pPr>
-    </w:p>
-    <w:p>
-      <w:pPr>
-        <w:spacing w:after="0"/>
+      <w:r>
         <w:rPr>
           <w:sz w:val="22"/>
           <w:szCs w:val="22"/>
           <w:lang w:val="en-US"/>
         </w:rPr>
-      </w:pPr>
-    </w:p>
-    <w:p>
-      <w:pPr>
-        <w:spacing w:after="0"/>
+        <w:t>The function</w:t>
+      </w:r>
+      <w:r>
         <w:rPr>
           <w:sz w:val="22"/>
           <w:szCs w:val="22"/>
           <w:lang w:val="en-US"/>
         </w:rPr>
-      </w:pPr>
-    </w:p>
-    <w:p>
-      <w:pPr>
-        <w:spacing w:after="0"/>
-        <w:rPr>
+        <w:t xml:space="preserve"> </w:t>
+      </w:r>
+      <w:r>
+        <w:rPr>
+          <w:i/>
+          <w:iCs/>
+          <w:color w:val="C00000"/>
           <w:sz w:val="22"/>
           <w:szCs w:val="22"/>
           <w:lang w:val="en-US"/>
         </w:rPr>
-      </w:pPr>
-    </w:p>
-    <w:p>
-      <w:pPr>
-        <w:spacing w:after="0"/>
+        <w:t>s55_hard_iron_compass_correction.m</w:t>
+      </w:r>
+      <w:r>
         <w:rPr>
           <w:sz w:val="22"/>
           <w:szCs w:val="22"/>
           <w:lang w:val="en-US"/>
         </w:rPr>
-      </w:pPr>
-    </w:p>
-    <w:p>
-      <w:pPr>
-        <w:spacing w:after="0"/>
+        <w:t xml:space="preserve"> calculates the center of the </w:t>
+      </w:r>
+      <w:r>
         <w:rPr>
           <w:sz w:val="22"/>
           <w:szCs w:val="22"/>
           <w:lang w:val="en-US"/>
         </w:rPr>
-      </w:pPr>
-    </w:p>
-    <w:p>
-      <w:pPr>
-        <w:spacing w:after="0"/>
+        <w:t xml:space="preserve">compass data (hard iron). Here we only plot it, but is has the </w:t>
+      </w:r>
+      <w:r>
         <w:rPr>
           <w:sz w:val="22"/>
           <w:szCs w:val="22"/>
           <w:lang w:val="en-US"/>
         </w:rPr>
-      </w:pPr>
-    </w:p>
-    <w:p>
-      <w:pPr>
-        <w:spacing w:after="0"/>
+        <w:t>functionality to correct U and V accordingly, which can be used in stage 2.</w:t>
+      </w:r>
+      <w:r>
         <w:rPr>
           <w:sz w:val="22"/>
           <w:szCs w:val="22"/>
           <w:lang w:val="en-US"/>
         </w:rPr>
-      </w:pPr>
-      <w:r>
+        <w:t xml:space="preserve"> </w:t>
+      </w:r>
+    </w:p>
+    <w:p>
+      <w:pPr>
+        <w:spacing w:after="0"/>
         <w:rPr>
           <w:sz w:val="22"/>
           <w:szCs w:val="22"/>
           <w:lang w:val="en-US"/>
         </w:rPr>
-        <w:drawing>
-          <wp:inline distT="0" distB="0" distL="0" distR="0" wp14:anchorId="289E5CC4" wp14:editId="5E598C17">
-            <wp:extent cx="5744377" cy="6687483"/>
-            <wp:effectExtent l="0" t="0" r="8890" b="0"/>
-            <wp:docPr id="155580947" name="Picture 1"/>
-            <wp:cNvGraphicFramePr>
-              <a:graphicFrameLocks xmlns:a="http://schemas.openxmlformats.org/drawingml/2006/main" noChangeAspect="1"/>
-            </wp:cNvGraphicFramePr>
-            <a:graphic xmlns:a="http://schemas.openxmlformats.org/drawingml/2006/main">
-              <a:graphicData uri="http://schemas.openxmlformats.org/drawingml/2006/picture">
-                <pic:pic xmlns:pic="http://schemas.openxmlformats.org/drawingml/2006/picture">
-                  <pic:nvPicPr>
-                    <pic:cNvPr id="155580947" name=""/>
-                    <pic:cNvPicPr/>
-                  </pic:nvPicPr>
-                  <pic:blipFill>
-                    <a:blip r:embed="rId14"/>
-                    <a:stretch>
-                      <a:fillRect/>
-                    </a:stretch>
-                  </pic:blipFill>
-                  <pic:spPr>
-                    <a:xfrm>
-                      <a:off x="0" y="0"/>
-                      <a:ext cx="5744377" cy="6687483"/>
-                    </a:xfrm>
-                    <a:prstGeom prst="rect">
-                      <a:avLst/>
-                    </a:prstGeom>
-                  </pic:spPr>
-                </pic:pic>
-              </a:graphicData>
-            </a:graphic>
-          </wp:inline>
-        </w:drawing>
+      </w:pPr>
+    </w:p>
+    <w:p>
+      <w:pPr>
+        <w:pStyle w:val="Heading3"/>
+        <w:rPr>
+          <w:lang w:val="en-US"/>
+        </w:rPr>
+      </w:pPr>
+      <w:r>
+        <w:rPr>
+          <w:lang w:val="en-US"/>
+        </w:rPr>
+        <w:t xml:space="preserve">Figure </w:t>
+      </w:r>
+      <w:r>
+        <w:rPr>
+          <w:lang w:val="en-US"/>
+        </w:rPr>
+        <w:t>6</w:t>
+      </w:r>
+      <w:r>
+        <w:rPr>
+          <w:lang w:val="en-US"/>
+        </w:rPr>
+        <w:t xml:space="preserve"> – status: </w:t>
+      </w:r>
+      <w:r>
+        <w:rPr>
+          <w:lang w:val="en-US"/>
+        </w:rPr>
+        <w:t>completed</w:t>
+      </w:r>
+    </w:p>
+    <w:p>
+      <w:pPr>
+        <w:rPr>
+          <w:lang w:val="en-US"/>
+        </w:rPr>
+      </w:pPr>
+      <w:r>
+        <w:rPr>
+          <w:lang w:val="en-US"/>
+        </w:rPr>
+        <w:t>Plot all sorts of sensor diagnostics (temperature sensors</w:t>
+      </w:r>
+      <w:r>
+        <w:rPr>
+          <w:lang w:val="en-US"/>
+        </w:rPr>
+        <w:t>, accelerometers, magnetometer)</w:t>
+      </w:r>
+      <w:r>
+        <w:rPr>
+          <w:lang w:val="en-US"/>
+        </w:rPr>
+        <w:t>. Just check then temperature sensors are sensible, etc.</w:t>
+      </w:r>
+    </w:p>
+    <w:p>
+      <w:pPr>
+        <w:pStyle w:val="Heading3"/>
+        <w:rPr>
+          <w:lang w:val="en-US"/>
+        </w:rPr>
+      </w:pPr>
+      <w:r>
+        <w:rPr>
+          <w:lang w:val="en-US"/>
+        </w:rPr>
+        <w:t>Save Stage 01 data</w:t>
+      </w:r>
+    </w:p>
+    <w:p>
+      <w:pPr>
+        <w:rPr>
+          <w:i/>
+          <w:iCs/>
+          <w:color w:val="3A7C22" w:themeColor="accent6" w:themeShade="BF"/>
+          <w:lang w:val="en-US"/>
+        </w:rPr>
+      </w:pPr>
+      <w:r>
+        <w:rPr>
+          <w:lang w:val="en-US"/>
+        </w:rPr>
+        <w:t>Data are save</w:t>
+      </w:r>
+      <w:r>
+        <w:rPr>
+          <w:lang w:val="en-US"/>
+        </w:rPr>
+        <w:t xml:space="preserve">d filename: </w:t>
+      </w:r>
+      <w:r>
+        <w:rPr>
+          <w:i/>
+          <w:iCs/>
+          <w:color w:val="3A7C22" w:themeColor="accent6" w:themeShade="BF"/>
+          <w:lang w:val="en-US"/>
+        </w:rPr>
+        <w:t>moor_id_sn_stage1.nc</w:t>
+      </w:r>
+      <w:r>
+        <w:rPr>
+          <w:lang w:val="en-US"/>
+        </w:rPr>
+        <w:t xml:space="preserve">,  e.g. for JC238: </w:t>
+      </w:r>
+      <w:r>
+        <w:rPr>
+          <w:i/>
+          <w:iCs/>
+          <w:color w:val="3A7C22" w:themeColor="accent6" w:themeShade="BF"/>
+          <w:lang w:val="en-US"/>
+        </w:rPr>
+        <w:t>rhadcp_0</w:t>
+      </w:r>
+      <w:r>
+        <w:rPr>
+          <w:i/>
+          <w:iCs/>
+          <w:color w:val="3A7C22" w:themeColor="accent6" w:themeShade="BF"/>
+          <w:lang w:val="en-US"/>
+        </w:rPr>
+        <w:t>1</w:t>
+      </w:r>
+      <w:r>
+        <w:rPr>
+          <w:i/>
+          <w:iCs/>
+          <w:color w:val="3A7C22" w:themeColor="accent6" w:themeShade="BF"/>
+          <w:lang w:val="en-US"/>
+        </w:rPr>
+        <w:t>_202</w:t>
+      </w:r>
+      <w:r>
+        <w:rPr>
+          <w:i/>
+          <w:iCs/>
+          <w:color w:val="3A7C22" w:themeColor="accent6" w:themeShade="BF"/>
+          <w:lang w:val="en-US"/>
+        </w:rPr>
+        <w:t>0</w:t>
+      </w:r>
+      <w:r>
+        <w:rPr>
+          <w:i/>
+          <w:iCs/>
+          <w:color w:val="3A7C22" w:themeColor="accent6" w:themeShade="BF"/>
+          <w:lang w:val="en-US"/>
+        </w:rPr>
+        <w:t>_200044_stage1.nc</w:t>
+      </w:r>
+    </w:p>
+    <w:p>
+      <w:pPr>
+        <w:rPr>
+          <w:i/>
+          <w:iCs/>
+          <w:color w:val="4EA72E" w:themeColor="accent6"/>
+          <w:lang w:val="en-US"/>
+        </w:rPr>
+      </w:pPr>
+      <w:r>
+        <w:rPr>
+          <w:lang w:val="en-US"/>
+        </w:rPr>
+        <w:t xml:space="preserve">Data directory: </w:t>
+      </w:r>
+      <w:r>
+        <w:rPr>
+          <w:lang w:val="en-US"/>
+        </w:rPr>
+        <w:t xml:space="preserve"> </w:t>
+      </w:r>
+      <w:r>
+        <w:rPr>
+          <w:i/>
+          <w:iCs/>
+          <w:color w:val="4EA72E" w:themeColor="accent6"/>
+          <w:lang w:val="en-US"/>
+        </w:rPr>
+        <w:t>osnap</w:t>
+      </w:r>
+      <w:r>
+        <w:rPr>
+          <w:i/>
+          <w:iCs/>
+          <w:color w:val="4EA72E" w:themeColor="accent6"/>
+          <w:lang w:val="en-US"/>
+        </w:rPr>
+        <w:t>/</w:t>
+      </w:r>
+      <w:r>
+        <w:rPr>
+          <w:i/>
+          <w:iCs/>
+          <w:color w:val="4EA72E" w:themeColor="accent6"/>
+          <w:lang w:val="en-US"/>
+        </w:rPr>
+        <w:t>data</w:t>
+      </w:r>
+      <w:r>
+        <w:rPr>
+          <w:i/>
+          <w:iCs/>
+          <w:color w:val="4EA72E" w:themeColor="accent6"/>
+          <w:lang w:val="en-US"/>
+        </w:rPr>
+        <w:t>/</w:t>
+      </w:r>
+      <w:r>
+        <w:rPr>
+          <w:i/>
+          <w:iCs/>
+          <w:color w:val="4EA72E" w:themeColor="accent6"/>
+          <w:lang w:val="en-US"/>
+        </w:rPr>
+        <w:t>moor</w:t>
+      </w:r>
+      <w:r>
+        <w:rPr>
+          <w:i/>
+          <w:iCs/>
+          <w:color w:val="4EA72E" w:themeColor="accent6"/>
+          <w:lang w:val="en-US"/>
+        </w:rPr>
+        <w:t>/</w:t>
+      </w:r>
+      <w:r>
+        <w:rPr>
+          <w:i/>
+          <w:iCs/>
+          <w:color w:val="4EA72E" w:themeColor="accent6"/>
+          <w:lang w:val="en-US"/>
+        </w:rPr>
+        <w:t>proc</w:t>
+      </w:r>
+      <w:r>
+        <w:rPr>
+          <w:i/>
+          <w:iCs/>
+          <w:color w:val="4EA72E" w:themeColor="accent6"/>
+          <w:lang w:val="en-US"/>
+        </w:rPr>
+        <w:t>/moor_id/</w:t>
+      </w:r>
+      <w:r>
+        <w:rPr>
+          <w:i/>
+          <w:iCs/>
+          <w:color w:val="4EA72E" w:themeColor="accent6"/>
+          <w:lang w:val="en-US"/>
+        </w:rPr>
+        <w:t>adcp_S55</w:t>
+      </w:r>
+      <w:r>
+        <w:rPr>
+          <w:i/>
+          <w:iCs/>
+          <w:color w:val="4EA72E" w:themeColor="accent6"/>
+          <w:lang w:val="en-US"/>
+        </w:rPr>
+        <w:t>/</w:t>
+      </w:r>
+    </w:p>
+    <w:p>
+      <w:pPr>
+        <w:rPr>
+          <w:i/>
+          <w:iCs/>
+          <w:color w:val="4EA72E" w:themeColor="accent6"/>
+          <w:lang w:val="en-US"/>
+        </w:rPr>
+      </w:pPr>
+      <w:r>
+        <w:rPr>
+          <w:lang w:val="en-US"/>
+        </w:rPr>
+        <w:t xml:space="preserve">E.g. for JC238: </w:t>
+      </w:r>
+      <w:r>
+        <w:rPr>
+          <w:lang w:val="en-US"/>
+        </w:rPr>
+        <w:t xml:space="preserve"> </w:t>
+      </w:r>
+      <w:r>
+        <w:rPr>
+          <w:i/>
+          <w:iCs/>
+          <w:color w:val="4EA72E" w:themeColor="accent6"/>
+          <w:lang w:val="en-US"/>
+        </w:rPr>
+        <w:t>osnap\data\moor\proc\rhadcp_0</w:t>
+      </w:r>
+      <w:r>
+        <w:rPr>
+          <w:i/>
+          <w:iCs/>
+          <w:color w:val="4EA72E" w:themeColor="accent6"/>
+          <w:lang w:val="en-US"/>
+        </w:rPr>
+        <w:t>1</w:t>
+      </w:r>
+      <w:r>
+        <w:rPr>
+          <w:i/>
+          <w:iCs/>
+          <w:color w:val="4EA72E" w:themeColor="accent6"/>
+          <w:lang w:val="en-US"/>
+        </w:rPr>
+        <w:t>_202</w:t>
+      </w:r>
+      <w:r>
+        <w:rPr>
+          <w:i/>
+          <w:iCs/>
+          <w:color w:val="4EA72E" w:themeColor="accent6"/>
+          <w:lang w:val="en-US"/>
+        </w:rPr>
+        <w:t>0</w:t>
+      </w:r>
+      <w:r>
+        <w:rPr>
+          <w:i/>
+          <w:iCs/>
+          <w:color w:val="4EA72E" w:themeColor="accent6"/>
+          <w:lang w:val="en-US"/>
+        </w:rPr>
+        <w:t>\adcp_S55\</w:t>
+      </w:r>
+    </w:p>
+    <w:p>
+      <w:pPr>
+        <w:rPr>
+          <w:lang w:val="en-US"/>
+        </w:rPr>
+      </w:pPr>
+      <w:r>
+        <w:rPr>
+          <w:lang w:val="en-US"/>
+        </w:rPr>
+        <w:t xml:space="preserve">The function </w:t>
+      </w:r>
+      <w:r>
+        <w:rPr>
+          <w:i/>
+          <w:iCs/>
+          <w:color w:val="C00000"/>
+          <w:lang w:val="en-US"/>
+        </w:rPr>
+        <w:t>s55_load_nc_as_struct.m</w:t>
+      </w:r>
+      <w:r>
+        <w:rPr>
+          <w:i/>
+          <w:iCs/>
+          <w:lang w:val="en-US"/>
+        </w:rPr>
+        <w:t xml:space="preserve"> </w:t>
+      </w:r>
+      <w:r>
+        <w:rPr>
+          <w:lang w:val="en-US"/>
+        </w:rPr>
+        <w:t>load</w:t>
+      </w:r>
+      <w:r>
+        <w:rPr>
+          <w:lang w:val="en-US"/>
+        </w:rPr>
+        <w:t>s</w:t>
+      </w:r>
+      <w:r>
+        <w:rPr>
+          <w:lang w:val="en-US"/>
+        </w:rPr>
+        <w:t xml:space="preserve"> nc-file as matlab structure.</w:t>
       </w:r>
     </w:p>
     <w:p>
@@ -2681,124 +4402,21 @@
           <w:lang w:val="en-US"/>
         </w:rPr>
       </w:pPr>
-      <w:r>
+    </w:p>
+    <w:p>
+      <w:pPr>
         <w:rPr>
           <w:sz w:val="22"/>
           <w:szCs w:val="22"/>
           <w:lang w:val="en-US"/>
         </w:rPr>
-        <w:drawing>
-          <wp:inline distT="0" distB="0" distL="0" distR="0" wp14:anchorId="2B41B114" wp14:editId="123310D4">
-            <wp:extent cx="5715798" cy="6296904"/>
-            <wp:effectExtent l="0" t="0" r="0" b="8890"/>
-            <wp:docPr id="1274562740" name="Picture 1"/>
-            <wp:cNvGraphicFramePr>
-              <a:graphicFrameLocks xmlns:a="http://schemas.openxmlformats.org/drawingml/2006/main" noChangeAspect="1"/>
-            </wp:cNvGraphicFramePr>
-            <a:graphic xmlns:a="http://schemas.openxmlformats.org/drawingml/2006/main">
-              <a:graphicData uri="http://schemas.openxmlformats.org/drawingml/2006/picture">
-                <pic:pic xmlns:pic="http://schemas.openxmlformats.org/drawingml/2006/picture">
-                  <pic:nvPicPr>
-                    <pic:cNvPr id="1274562740" name=""/>
-                    <pic:cNvPicPr/>
-                  </pic:nvPicPr>
-                  <pic:blipFill>
-                    <a:blip r:embed="rId15"/>
-                    <a:stretch>
-                      <a:fillRect/>
-                    </a:stretch>
-                  </pic:blipFill>
-                  <pic:spPr>
-                    <a:xfrm>
-                      <a:off x="0" y="0"/>
-                      <a:ext cx="5715798" cy="6296904"/>
-                    </a:xfrm>
-                    <a:prstGeom prst="rect">
-                      <a:avLst/>
-                    </a:prstGeom>
-                  </pic:spPr>
-                </pic:pic>
-              </a:graphicData>
-            </a:graphic>
-          </wp:inline>
-        </w:drawing>
-      </w:r>
-    </w:p>
-    <w:p>
-      <w:pPr>
-        <w:pStyle w:val="Heading3"/>
-        <w:rPr>
-          <w:lang w:val="en-US"/>
-        </w:rPr>
-      </w:pPr>
-      <w:r>
-        <w:rPr>
-          <w:lang w:val="en-US"/>
-        </w:rPr>
-        <w:t xml:space="preserve">Figure </w:t>
-      </w:r>
-      <w:r>
-        <w:rPr>
-          <w:lang w:val="en-US"/>
-        </w:rPr>
-        <w:t>6</w:t>
-      </w:r>
-      <w:r>
-        <w:rPr>
-          <w:lang w:val="en-US"/>
-        </w:rPr>
-        <w:t xml:space="preserve"> – status: </w:t>
-      </w:r>
-      <w:r>
-        <w:rPr>
-          <w:lang w:val="en-US"/>
-        </w:rPr>
-        <w:t>WIP</w:t>
-      </w:r>
-    </w:p>
-    <w:p>
-      <w:pPr>
-        <w:rPr>
-          <w:lang w:val="en-US"/>
-        </w:rPr>
-      </w:pPr>
-      <w:r>
-        <w:rPr>
-          <w:lang w:val="en-US"/>
-        </w:rPr>
-        <w:t>Plot all sorts of sensor diagnostics (temperature sensors</w:t>
-      </w:r>
-      <w:r>
-        <w:rPr>
-          <w:lang w:val="en-US"/>
-        </w:rPr>
-        <w:t>, accelerometers, magnetometer)</w:t>
-      </w:r>
-    </w:p>
-    <w:p>
-      <w:pPr>
-        <w:spacing w:after="0"/>
+      </w:pPr>
+      <w:r>
         <w:rPr>
           <w:sz w:val="22"/>
           <w:szCs w:val="22"/>
           <w:lang w:val="en-US"/>
         </w:rPr>
-      </w:pPr>
-    </w:p>
-    <w:p>
-      <w:pPr>
-        <w:rPr>
-          <w:sz w:val="22"/>
-          <w:szCs w:val="22"/>
-          <w:lang w:val="en-US"/>
-        </w:rPr>
-      </w:pPr>
-      <w:r>
-        <w:rPr>
-          <w:sz w:val="22"/>
-          <w:szCs w:val="22"/>
-          <w:lang w:val="en-US"/>
-        </w:rPr>
         <w:br w:type="page"/>
       </w:r>
     </w:p>
@@ -2807,6 +4425,7 @@
         <w:pStyle w:val="Heading2"/>
       </w:pPr>
       <w:r>
+        <w:lastRenderedPageBreak/>
         <w:t xml:space="preserve">STAGE 2 – </w:t>
       </w:r>
       <w:r>
@@ -3219,13 +4838,7 @@
                         <w:rPr>
                           <w:rFonts w:ascii="Cambria Math" w:hAnsi="Cambria Math"/>
                         </w:rPr>
-                        <m:t>pitc</m:t>
-                      </m:r>
-                      <m:r>
-                        <w:rPr>
-                          <w:rFonts w:ascii="Cambria Math" w:hAnsi="Cambria Math"/>
-                        </w:rPr>
-                        <m:t>h</m:t>
+                        <m:t>pitch</m:t>
                       </m:r>
                     </m:sub>
                   </m:sSub>
@@ -3241,17 +4854,7 @@
               <w:rFonts w:ascii="Cambria Math" w:hAnsi="Cambria Math"/>
               <w:lang w:val="en-US"/>
             </w:rPr>
-            <m:t>-</m:t>
-          </m:r>
-          <m:r>
-            <m:rPr>
-              <m:sty m:val="p"/>
-            </m:rPr>
-            <w:rPr>
-              <w:rFonts w:ascii="Cambria Math" w:hAnsi="Cambria Math"/>
-              <w:lang w:val="en-US"/>
-            </w:rPr>
-            <m:t>Cell Size</m:t>
+            <m:t>-Cell Size</m:t>
           </m:r>
         </m:oMath>
       </m:oMathPara>
@@ -3394,6 +4997,7 @@
         <w:pStyle w:val="Heading2"/>
       </w:pPr>
       <w:r>
+        <w:lastRenderedPageBreak/>
         <w:t>Appendix</w:t>
       </w:r>
     </w:p>
@@ -4554,31 +6158,7 @@
                                   <w:szCs w:val="22"/>
                                   <w:lang w:val=""/>
                                 </w:rPr>
-                                <m:t>(90-</m:t>
-                              </m:r>
-                              <m:r>
-                                <m:rPr>
-                                  <m:sty m:val="p"/>
-                                </m:rPr>
-                                <w:rPr>
-                                  <w:rFonts w:ascii="Cambria Math" w:hAnsi="Cambria Math"/>
-                                  <w:sz w:val="22"/>
-                                  <w:szCs w:val="22"/>
-                                  <w:lang w:val=""/>
-                                </w:rPr>
-                                <m:t>ϴ</m:t>
-                              </m:r>
-                              <m:r>
-                                <m:rPr>
-                                  <m:sty m:val="p"/>
-                                </m:rPr>
-                                <w:rPr>
-                                  <w:rFonts w:ascii="Cambria Math" w:hAnsi="Cambria Math"/>
-                                  <w:sz w:val="22"/>
-                                  <w:szCs w:val="22"/>
-                                  <w:lang w:val=""/>
-                                </w:rPr>
-                                <m:t>)</m:t>
+                                <m:t>(90-ϴ)</m:t>
                               </m:r>
                             </m:num>
                             <m:den>
@@ -6621,8 +8201,8 @@
     </w:p>
     <w:p/>
     <w:sectPr>
-      <w:headerReference w:type="default" r:id="rId16"/>
-      <w:footerReference w:type="default" r:id="rId17"/>
+      <w:headerReference w:type="default" r:id="rId14"/>
+      <w:footerReference w:type="default" r:id="rId15"/>
       <w:pgSz w:w="12240" w:h="15840"/>
       <w:pgMar w:top="1440" w:right="1440" w:bottom="1440" w:left="1440" w:header="708" w:footer="708" w:gutter="0"/>
       <w:cols w:space="708"/>
@@ -8086,6 +9666,119 @@
     </w:lvl>
   </w:abstractNum>
   <w:abstractNum w:abstractNumId="9" w15:restartNumberingAfterBreak="0">
+    <w:nsid w:val="2FE05074"/>
+    <w:multiLevelType w:val="hybridMultilevel"/>
+    <w:tmpl w:val="6486DE8E"/>
+    <w:lvl w:ilvl="0" w:tplc="04090001">
+      <w:start w:val="1"/>
+      <w:numFmt w:val="bullet"/>
+      <w:lvlText w:val=""/>
+      <w:lvlJc w:val="left"/>
+      <w:pPr>
+        <w:ind w:left="770" w:hanging="360"/>
+      </w:pPr>
+      <w:rPr>
+        <w:rFonts w:ascii="Symbol" w:hAnsi="Symbol" w:hint="default"/>
+      </w:rPr>
+    </w:lvl>
+    <w:lvl w:ilvl="1" w:tplc="04090003" w:tentative="1">
+      <w:start w:val="1"/>
+      <w:numFmt w:val="bullet"/>
+      <w:lvlText w:val="o"/>
+      <w:lvlJc w:val="left"/>
+      <w:pPr>
+        <w:ind w:left="1490" w:hanging="360"/>
+      </w:pPr>
+      <w:rPr>
+        <w:rFonts w:ascii="Courier New" w:hAnsi="Courier New" w:cs="Courier New" w:hint="default"/>
+      </w:rPr>
+    </w:lvl>
+    <w:lvl w:ilvl="2" w:tplc="04090005" w:tentative="1">
+      <w:start w:val="1"/>
+      <w:numFmt w:val="bullet"/>
+      <w:lvlText w:val=""/>
+      <w:lvlJc w:val="left"/>
+      <w:pPr>
+        <w:ind w:left="2210" w:hanging="360"/>
+      </w:pPr>
+      <w:rPr>
+        <w:rFonts w:ascii="Wingdings" w:hAnsi="Wingdings" w:hint="default"/>
+      </w:rPr>
+    </w:lvl>
+    <w:lvl w:ilvl="3" w:tplc="04090001" w:tentative="1">
+      <w:start w:val="1"/>
+      <w:numFmt w:val="bullet"/>
+      <w:lvlText w:val=""/>
+      <w:lvlJc w:val="left"/>
+      <w:pPr>
+        <w:ind w:left="2930" w:hanging="360"/>
+      </w:pPr>
+      <w:rPr>
+        <w:rFonts w:ascii="Symbol" w:hAnsi="Symbol" w:hint="default"/>
+      </w:rPr>
+    </w:lvl>
+    <w:lvl w:ilvl="4" w:tplc="04090003" w:tentative="1">
+      <w:start w:val="1"/>
+      <w:numFmt w:val="bullet"/>
+      <w:lvlText w:val="o"/>
+      <w:lvlJc w:val="left"/>
+      <w:pPr>
+        <w:ind w:left="3650" w:hanging="360"/>
+      </w:pPr>
+      <w:rPr>
+        <w:rFonts w:ascii="Courier New" w:hAnsi="Courier New" w:cs="Courier New" w:hint="default"/>
+      </w:rPr>
+    </w:lvl>
+    <w:lvl w:ilvl="5" w:tplc="04090005" w:tentative="1">
+      <w:start w:val="1"/>
+      <w:numFmt w:val="bullet"/>
+      <w:lvlText w:val=""/>
+      <w:lvlJc w:val="left"/>
+      <w:pPr>
+        <w:ind w:left="4370" w:hanging="360"/>
+      </w:pPr>
+      <w:rPr>
+        <w:rFonts w:ascii="Wingdings" w:hAnsi="Wingdings" w:hint="default"/>
+      </w:rPr>
+    </w:lvl>
+    <w:lvl w:ilvl="6" w:tplc="04090001" w:tentative="1">
+      <w:start w:val="1"/>
+      <w:numFmt w:val="bullet"/>
+      <w:lvlText w:val=""/>
+      <w:lvlJc w:val="left"/>
+      <w:pPr>
+        <w:ind w:left="5090" w:hanging="360"/>
+      </w:pPr>
+      <w:rPr>
+        <w:rFonts w:ascii="Symbol" w:hAnsi="Symbol" w:hint="default"/>
+      </w:rPr>
+    </w:lvl>
+    <w:lvl w:ilvl="7" w:tplc="04090003" w:tentative="1">
+      <w:start w:val="1"/>
+      <w:numFmt w:val="bullet"/>
+      <w:lvlText w:val="o"/>
+      <w:lvlJc w:val="left"/>
+      <w:pPr>
+        <w:ind w:left="5810" w:hanging="360"/>
+      </w:pPr>
+      <w:rPr>
+        <w:rFonts w:ascii="Courier New" w:hAnsi="Courier New" w:cs="Courier New" w:hint="default"/>
+      </w:rPr>
+    </w:lvl>
+    <w:lvl w:ilvl="8" w:tplc="04090005" w:tentative="1">
+      <w:start w:val="1"/>
+      <w:numFmt w:val="bullet"/>
+      <w:lvlText w:val=""/>
+      <w:lvlJc w:val="left"/>
+      <w:pPr>
+        <w:ind w:left="6530" w:hanging="360"/>
+      </w:pPr>
+      <w:rPr>
+        <w:rFonts w:ascii="Wingdings" w:hAnsi="Wingdings" w:hint="default"/>
+      </w:rPr>
+    </w:lvl>
+  </w:abstractNum>
+  <w:abstractNum w:abstractNumId="10" w15:restartNumberingAfterBreak="0">
     <w:nsid w:val="329D6ED1"/>
     <w:multiLevelType w:val="hybridMultilevel"/>
     <w:tmpl w:val="A2204EF4"/>
@@ -8198,7 +9891,7 @@
       </w:rPr>
     </w:lvl>
   </w:abstractNum>
-  <w:abstractNum w:abstractNumId="10" w15:restartNumberingAfterBreak="0">
+  <w:abstractNum w:abstractNumId="11" w15:restartNumberingAfterBreak="0">
     <w:nsid w:val="34013D8D"/>
     <w:multiLevelType w:val="hybridMultilevel"/>
     <w:tmpl w:val="F14CA870"/>
@@ -8311,7 +10004,7 @@
       </w:rPr>
     </w:lvl>
   </w:abstractNum>
-  <w:abstractNum w:abstractNumId="11" w15:restartNumberingAfterBreak="0">
+  <w:abstractNum w:abstractNumId="12" w15:restartNumberingAfterBreak="0">
     <w:nsid w:val="34CC2C91"/>
     <w:multiLevelType w:val="multilevel"/>
     <w:tmpl w:val="0A62D2D6"/>
@@ -8429,7 +10122,7 @@
       </w:pPr>
     </w:lvl>
   </w:abstractNum>
-  <w:abstractNum w:abstractNumId="12" w15:restartNumberingAfterBreak="0">
+  <w:abstractNum w:abstractNumId="13" w15:restartNumberingAfterBreak="0">
     <w:nsid w:val="351D5866"/>
     <w:multiLevelType w:val="multilevel"/>
     <w:tmpl w:val="FB2ECAC8"/>
@@ -8578,7 +10271,7 @@
       </w:rPr>
     </w:lvl>
   </w:abstractNum>
-  <w:abstractNum w:abstractNumId="13" w15:restartNumberingAfterBreak="0">
+  <w:abstractNum w:abstractNumId="14" w15:restartNumberingAfterBreak="0">
     <w:nsid w:val="35913AD7"/>
     <w:multiLevelType w:val="multilevel"/>
     <w:tmpl w:val="323A3D2C"/>
@@ -8719,7 +10412,7 @@
       </w:rPr>
     </w:lvl>
   </w:abstractNum>
-  <w:abstractNum w:abstractNumId="14" w15:restartNumberingAfterBreak="0">
+  <w:abstractNum w:abstractNumId="15" w15:restartNumberingAfterBreak="0">
     <w:nsid w:val="36CB3BDB"/>
     <w:multiLevelType w:val="multilevel"/>
     <w:tmpl w:val="18446BDA"/>
@@ -8868,7 +10561,7 @@
       </w:rPr>
     </w:lvl>
   </w:abstractNum>
-  <w:abstractNum w:abstractNumId="15" w15:restartNumberingAfterBreak="0">
+  <w:abstractNum w:abstractNumId="16" w15:restartNumberingAfterBreak="0">
     <w:nsid w:val="36FB64B9"/>
     <w:multiLevelType w:val="hybridMultilevel"/>
     <w:tmpl w:val="483ECF90"/>
@@ -8981,7 +10674,7 @@
       </w:rPr>
     </w:lvl>
   </w:abstractNum>
-  <w:abstractNum w:abstractNumId="16" w15:restartNumberingAfterBreak="0">
+  <w:abstractNum w:abstractNumId="17" w15:restartNumberingAfterBreak="0">
     <w:nsid w:val="3B83570D"/>
     <w:multiLevelType w:val="multilevel"/>
     <w:tmpl w:val="11066F98"/>
@@ -9130,7 +10823,7 @@
       </w:rPr>
     </w:lvl>
   </w:abstractNum>
-  <w:abstractNum w:abstractNumId="17" w15:restartNumberingAfterBreak="0">
+  <w:abstractNum w:abstractNumId="18" w15:restartNumberingAfterBreak="0">
     <w:nsid w:val="46A61E3F"/>
     <w:multiLevelType w:val="multilevel"/>
     <w:tmpl w:val="157EEDCC"/>
@@ -9243,7 +10936,7 @@
       </w:pPr>
     </w:lvl>
   </w:abstractNum>
-  <w:abstractNum w:abstractNumId="18" w15:restartNumberingAfterBreak="0">
+  <w:abstractNum w:abstractNumId="19" w15:restartNumberingAfterBreak="0">
     <w:nsid w:val="4A0155F9"/>
     <w:multiLevelType w:val="multilevel"/>
     <w:tmpl w:val="F2D2F164"/>
@@ -9392,7 +11085,7 @@
       </w:rPr>
     </w:lvl>
   </w:abstractNum>
-  <w:abstractNum w:abstractNumId="19" w15:restartNumberingAfterBreak="0">
+  <w:abstractNum w:abstractNumId="20" w15:restartNumberingAfterBreak="0">
     <w:nsid w:val="4B46119A"/>
     <w:multiLevelType w:val="multilevel"/>
     <w:tmpl w:val="157EEDCC"/>
@@ -9505,7 +11198,7 @@
       </w:pPr>
     </w:lvl>
   </w:abstractNum>
-  <w:abstractNum w:abstractNumId="20" w15:restartNumberingAfterBreak="0">
+  <w:abstractNum w:abstractNumId="21" w15:restartNumberingAfterBreak="0">
     <w:nsid w:val="4B8E485B"/>
     <w:multiLevelType w:val="multilevel"/>
     <w:tmpl w:val="11066F98"/>
@@ -9654,7 +11347,7 @@
       </w:rPr>
     </w:lvl>
   </w:abstractNum>
-  <w:abstractNum w:abstractNumId="21" w15:restartNumberingAfterBreak="0">
+  <w:abstractNum w:abstractNumId="22" w15:restartNumberingAfterBreak="0">
     <w:nsid w:val="5293132B"/>
     <w:multiLevelType w:val="hybridMultilevel"/>
     <w:tmpl w:val="2D66F0E0"/>
@@ -9767,7 +11460,7 @@
       </w:rPr>
     </w:lvl>
   </w:abstractNum>
-  <w:abstractNum w:abstractNumId="22" w15:restartNumberingAfterBreak="0">
+  <w:abstractNum w:abstractNumId="23" w15:restartNumberingAfterBreak="0">
     <w:nsid w:val="572E3AB1"/>
     <w:multiLevelType w:val="multilevel"/>
     <w:tmpl w:val="C41014BE"/>
@@ -9884,7 +11577,7 @@
       </w:pPr>
     </w:lvl>
   </w:abstractNum>
-  <w:abstractNum w:abstractNumId="23" w15:restartNumberingAfterBreak="0">
+  <w:abstractNum w:abstractNumId="24" w15:restartNumberingAfterBreak="0">
     <w:nsid w:val="5ED13208"/>
     <w:multiLevelType w:val="multilevel"/>
     <w:tmpl w:val="20D2693A"/>
@@ -10033,7 +11726,7 @@
       </w:rPr>
     </w:lvl>
   </w:abstractNum>
-  <w:abstractNum w:abstractNumId="24" w15:restartNumberingAfterBreak="0">
+  <w:abstractNum w:abstractNumId="25" w15:restartNumberingAfterBreak="0">
     <w:nsid w:val="6424168A"/>
     <w:multiLevelType w:val="multilevel"/>
     <w:tmpl w:val="B19E9DB2"/>
@@ -10182,7 +11875,7 @@
       </w:rPr>
     </w:lvl>
   </w:abstractNum>
-  <w:abstractNum w:abstractNumId="25" w15:restartNumberingAfterBreak="0">
+  <w:abstractNum w:abstractNumId="26" w15:restartNumberingAfterBreak="0">
     <w:nsid w:val="679B64A4"/>
     <w:multiLevelType w:val="multilevel"/>
     <w:tmpl w:val="157EEDCC"/>
@@ -10328,7 +12021,7 @@
       </w:rPr>
     </w:lvl>
   </w:abstractNum>
-  <w:abstractNum w:abstractNumId="26" w15:restartNumberingAfterBreak="0">
+  <w:abstractNum w:abstractNumId="27" w15:restartNumberingAfterBreak="0">
     <w:nsid w:val="6963465E"/>
     <w:multiLevelType w:val="multilevel"/>
     <w:tmpl w:val="7FCC432C"/>
@@ -10441,7 +12134,7 @@
       </w:pPr>
     </w:lvl>
   </w:abstractNum>
-  <w:abstractNum w:abstractNumId="27" w15:restartNumberingAfterBreak="0">
+  <w:abstractNum w:abstractNumId="28" w15:restartNumberingAfterBreak="0">
     <w:nsid w:val="6A2C786F"/>
     <w:multiLevelType w:val="multilevel"/>
     <w:tmpl w:val="F5C65456"/>
@@ -10590,7 +12283,7 @@
       </w:rPr>
     </w:lvl>
   </w:abstractNum>
-  <w:abstractNum w:abstractNumId="28" w15:restartNumberingAfterBreak="0">
+  <w:abstractNum w:abstractNumId="29" w15:restartNumberingAfterBreak="0">
     <w:nsid w:val="6C25198A"/>
     <w:multiLevelType w:val="multilevel"/>
     <w:tmpl w:val="D74630DE"/>
@@ -10739,7 +12432,7 @@
       </w:rPr>
     </w:lvl>
   </w:abstractNum>
-  <w:abstractNum w:abstractNumId="29" w15:restartNumberingAfterBreak="0">
+  <w:abstractNum w:abstractNumId="30" w15:restartNumberingAfterBreak="0">
     <w:nsid w:val="7B9F5DA1"/>
     <w:multiLevelType w:val="multilevel"/>
     <w:tmpl w:val="764CC03C"/>
@@ -10889,53 +12582,53 @@
     </w:lvl>
   </w:abstractNum>
   <w:num w:numId="1" w16cid:durableId="1697004852">
-    <w:abstractNumId w:val="13"/>
+    <w:abstractNumId w:val="14"/>
     <w:lvlOverride w:ilvl="1">
       <w:startOverride w:val="1"/>
     </w:lvlOverride>
   </w:num>
   <w:num w:numId="2" w16cid:durableId="830557843">
-    <w:abstractNumId w:val="13"/>
+    <w:abstractNumId w:val="14"/>
     <w:lvlOverride w:ilvl="1"/>
     <w:lvlOverride w:ilvl="2">
       <w:startOverride w:val="1"/>
     </w:lvlOverride>
   </w:num>
   <w:num w:numId="3" w16cid:durableId="952977496">
-    <w:abstractNumId w:val="13"/>
+    <w:abstractNumId w:val="14"/>
     <w:lvlOverride w:ilvl="1">
       <w:startOverride w:val="6"/>
     </w:lvlOverride>
   </w:num>
   <w:num w:numId="4" w16cid:durableId="452359500">
-    <w:abstractNumId w:val="18"/>
+    <w:abstractNumId w:val="19"/>
   </w:num>
   <w:num w:numId="5" w16cid:durableId="102187756">
     <w:abstractNumId w:val="6"/>
   </w:num>
   <w:num w:numId="6" w16cid:durableId="190384433">
-    <w:abstractNumId w:val="28"/>
+    <w:abstractNumId w:val="29"/>
   </w:num>
   <w:num w:numId="7" w16cid:durableId="692925131">
-    <w:abstractNumId w:val="24"/>
+    <w:abstractNumId w:val="25"/>
   </w:num>
   <w:num w:numId="8" w16cid:durableId="1339961652">
-    <w:abstractNumId w:val="20"/>
+    <w:abstractNumId w:val="21"/>
   </w:num>
   <w:num w:numId="9" w16cid:durableId="1951357753">
-    <w:abstractNumId w:val="25"/>
+    <w:abstractNumId w:val="26"/>
   </w:num>
   <w:num w:numId="10" w16cid:durableId="99568332">
-    <w:abstractNumId w:val="12"/>
+    <w:abstractNumId w:val="13"/>
   </w:num>
   <w:num w:numId="11" w16cid:durableId="1628393834">
-    <w:abstractNumId w:val="26"/>
+    <w:abstractNumId w:val="27"/>
     <w:lvlOverride w:ilvl="0">
       <w:startOverride w:val="1"/>
     </w:lvlOverride>
   </w:num>
   <w:num w:numId="12" w16cid:durableId="1239097313">
-    <w:abstractNumId w:val="26"/>
+    <w:abstractNumId w:val="27"/>
     <w:lvlOverride w:ilvl="0"/>
     <w:lvlOverride w:ilvl="1">
       <w:startOverride w:val="1"/>
@@ -10948,25 +12641,25 @@
     </w:lvlOverride>
   </w:num>
   <w:num w:numId="14" w16cid:durableId="1956517008">
-    <w:abstractNumId w:val="19"/>
+    <w:abstractNumId w:val="20"/>
   </w:num>
   <w:num w:numId="15" w16cid:durableId="656999463">
     <w:abstractNumId w:val="3"/>
   </w:num>
   <w:num w:numId="16" w16cid:durableId="1533035477">
-    <w:abstractNumId w:val="27"/>
+    <w:abstractNumId w:val="28"/>
   </w:num>
   <w:num w:numId="17" w16cid:durableId="961615563">
     <w:abstractNumId w:val="2"/>
   </w:num>
   <w:num w:numId="18" w16cid:durableId="2138061094">
-    <w:abstractNumId w:val="14"/>
+    <w:abstractNumId w:val="15"/>
   </w:num>
   <w:num w:numId="19" w16cid:durableId="1632249961">
     <w:abstractNumId w:val="7"/>
   </w:num>
   <w:num w:numId="20" w16cid:durableId="585069198">
-    <w:abstractNumId w:val="29"/>
+    <w:abstractNumId w:val="30"/>
   </w:num>
   <w:num w:numId="21" w16cid:durableId="610818748">
     <w:abstractNumId w:val="8"/>
@@ -10978,34 +12671,37 @@
     <w:abstractNumId w:val="5"/>
   </w:num>
   <w:num w:numId="24" w16cid:durableId="979461148">
+    <w:abstractNumId w:val="18"/>
+  </w:num>
+  <w:num w:numId="25" w16cid:durableId="1103261038">
+    <w:abstractNumId w:val="23"/>
+  </w:num>
+  <w:num w:numId="26" w16cid:durableId="995062853">
     <w:abstractNumId w:val="17"/>
   </w:num>
-  <w:num w:numId="25" w16cid:durableId="1103261038">
+  <w:num w:numId="27" w16cid:durableId="1005279804">
+    <w:abstractNumId w:val="24"/>
+  </w:num>
+  <w:num w:numId="28" w16cid:durableId="513031102">
+    <w:abstractNumId w:val="10"/>
+  </w:num>
+  <w:num w:numId="29" w16cid:durableId="785388356">
     <w:abstractNumId w:val="22"/>
   </w:num>
-  <w:num w:numId="26" w16cid:durableId="995062853">
+  <w:num w:numId="30" w16cid:durableId="1660572253">
+    <w:abstractNumId w:val="12"/>
+  </w:num>
+  <w:num w:numId="31" w16cid:durableId="2097745421">
     <w:abstractNumId w:val="16"/>
   </w:num>
-  <w:num w:numId="27" w16cid:durableId="1005279804">
-    <w:abstractNumId w:val="23"/>
-  </w:num>
-  <w:num w:numId="28" w16cid:durableId="513031102">
-    <w:abstractNumId w:val="9"/>
-  </w:num>
-  <w:num w:numId="29" w16cid:durableId="785388356">
-    <w:abstractNumId w:val="21"/>
-  </w:num>
-  <w:num w:numId="30" w16cid:durableId="1660572253">
+  <w:num w:numId="32" w16cid:durableId="336617943">
     <w:abstractNumId w:val="11"/>
-  </w:num>
-  <w:num w:numId="31" w16cid:durableId="2097745421">
-    <w:abstractNumId w:val="15"/>
-  </w:num>
-  <w:num w:numId="32" w16cid:durableId="336617943">
-    <w:abstractNumId w:val="10"/>
   </w:num>
   <w:num w:numId="33" w16cid:durableId="994992955">
     <w:abstractNumId w:val="4"/>
+  </w:num>
+  <w:num w:numId="34" w16cid:durableId="1822387631">
+    <w:abstractNumId w:val="9"/>
   </w:num>
 </w:numbering>
 </file>
@@ -11418,7 +13114,7 @@
   <w:style w:type="paragraph" w:default="1" w:styleId="Normal">
     <w:name w:val="Normal"/>
     <w:qFormat/>
-    <w:rsid w:val="005457C7"/>
+    <w:rsid w:val="00E47910"/>
     <w:rPr>
       <w:lang w:val="en-GB"/>
     </w:rPr>

</xml_diff>

<commit_message>
Added some functon to tools for wider usability
</commit_message>
<xml_diff>
--- a/exec/gitrepo/stage1/adcp_s55/Signature 55Hz processing guide.docx
+++ b/exec/gitrepo/stage1/adcp_s55/Signature 55Hz processing guide.docx
@@ -67,7 +67,7 @@
         <w:rPr>
           <w:noProof/>
         </w:rPr>
-        <w:t>10/02/2026 09:09:06</w:t>
+        <w:t>10/02/2026 15:04:48</w:t>
       </w:r>
       <w:r>
         <w:fldChar w:fldCharType="end"/>
@@ -2755,28 +2755,7 @@
             <w:rFonts w:ascii="Cambria Math" w:hAnsi="Cambria Math"/>
             <w:lang w:val="en-US"/>
           </w:rPr>
-          <m:t>=</m:t>
-        </m:r>
-        <m:r>
-          <w:rPr>
-            <w:rFonts w:ascii="Cambria Math" w:hAnsi="Cambria Math"/>
-            <w:lang w:val="en-US"/>
-          </w:rPr>
-          <m:t>atan</m:t>
-        </m:r>
-        <m:r>
-          <w:rPr>
-            <w:rFonts w:ascii="Cambria Math" w:hAnsi="Cambria Math"/>
-            <w:lang w:val="en-US"/>
-          </w:rPr>
-          <m:t>2</m:t>
-        </m:r>
-        <m:r>
-          <w:rPr>
-            <w:rFonts w:ascii="Cambria Math" w:hAnsi="Cambria Math"/>
-            <w:lang w:val="en-US"/>
-          </w:rPr>
-          <m:t>(-</m:t>
+          <m:t>=atan2(-</m:t>
         </m:r>
         <m:sSub>
           <m:sSubPr>
@@ -3092,17 +3071,7 @@
                 <w:rFonts w:ascii="Cambria Math" w:hAnsi="Cambria Math"/>
                 <w:lang w:val="en-US"/>
               </w:rPr>
-              <m:t>atan</m:t>
-            </m:r>
-            <m:r>
-              <m:rPr>
-                <m:sty m:val="p"/>
-              </m:rPr>
-              <w:rPr>
-                <w:rFonts w:ascii="Cambria Math" w:hAnsi="Cambria Math"/>
-                <w:lang w:val="en-US"/>
-              </w:rPr>
-              <m:t>2</m:t>
+              <m:t>atan2</m:t>
             </m:r>
           </m:fName>
           <m:e>
@@ -3122,14 +3091,7 @@
                     <w:rFonts w:ascii="Cambria Math" w:hAnsi="Cambria Math"/>
                     <w:lang w:val="en-US"/>
                   </w:rPr>
-                  <m:t>-</m:t>
-                </m:r>
-                <m:r>
-                  <w:rPr>
-                    <w:rFonts w:ascii="Cambria Math" w:hAnsi="Cambria Math"/>
-                    <w:lang w:val="en-US"/>
-                  </w:rPr>
-                  <m:t>(</m:t>
+                  <m:t>-(</m:t>
                 </m:r>
                 <m:sSub>
                   <m:sSubPr>
@@ -3201,14 +3163,7 @@
                     <w:rFonts w:ascii="Cambria Math" w:hAnsi="Cambria Math"/>
                     <w:lang w:val="en-US"/>
                   </w:rPr>
-                  <m:t>)</m:t>
-                </m:r>
-                <m:r>
-                  <w:rPr>
-                    <w:rFonts w:ascii="Cambria Math" w:hAnsi="Cambria Math"/>
-                    <w:lang w:val="en-US"/>
-                  </w:rPr>
-                  <m:t xml:space="preserve">, </m:t>
+                  <m:t xml:space="preserve">), </m:t>
                 </m:r>
                 <m:sSub>
                   <m:sSubPr>
@@ -3324,14 +3279,7 @@
               <w:rFonts w:ascii="Cambria Math" w:hAnsi="Cambria Math"/>
               <w:lang w:val="en-US"/>
             </w:rPr>
-            <m:t>ϵ</m:t>
-          </m:r>
-          <m:r>
-            <w:rPr>
-              <w:rFonts w:ascii="Cambria Math" w:hAnsi="Cambria Math"/>
-              <w:lang w:val="en-US"/>
-            </w:rPr>
-            <m:t>=</m:t>
+            <m:t>ϵ=</m:t>
           </m:r>
           <m:sSub>
             <m:sSubPr>
@@ -3912,14 +3860,7 @@
               <w:rFonts w:ascii="Cambria Math" w:eastAsiaTheme="minorEastAsia" w:hAnsi="Cambria Math"/>
               <w:lang w:val="en-US"/>
             </w:rPr>
-            <m:t>(</m:t>
-          </m:r>
-          <m:r>
-            <w:rPr>
-              <w:rFonts w:ascii="Cambria Math" w:eastAsiaTheme="minorEastAsia" w:hAnsi="Cambria Math"/>
-              <w:lang w:val="en-US"/>
-            </w:rPr>
-            <m:t>ϵ)</m:t>
+            <m:t>(ϵ)</m:t>
           </m:r>
         </m:oMath>
       </m:oMathPara>
@@ -4434,6 +4375,9 @@
       <w:r>
         <w:t>ost-processing</w:t>
       </w:r>
+      <w:r>
+        <w:t xml:space="preserve"> </w:t>
+      </w:r>
     </w:p>
     <w:p>
       <w:pPr>
@@ -4452,23 +4396,58 @@
         <w:rPr>
           <w:lang w:val="en-US"/>
         </w:rPr>
-        <w:t>tatus: outstanding</w:t>
-      </w:r>
-    </w:p>
-    <w:p>
-      <w:pPr>
-        <w:rPr>
-          <w:lang w:val="en-US"/>
-        </w:rPr>
-      </w:pPr>
-      <w:r>
-        <w:t>Script: m_moorproc_toolbox\exec\gitrepo\stage2\adcp_s55\</w:t>
-      </w:r>
-      <w:r>
-        <w:rPr>
-          <w:lang w:val="en-US"/>
-        </w:rPr>
-        <w:t>stage02_process_S55.m</w:t>
+        <w:t xml:space="preserve">tatus: </w:t>
+      </w:r>
+      <w:r>
+        <w:rPr>
+          <w:lang w:val="en-US"/>
+        </w:rPr>
+        <w:t>WIP</w:t>
+      </w:r>
+    </w:p>
+    <w:p>
+      <w:pPr>
+        <w:rPr>
+          <w:lang w:val="en-US"/>
+        </w:rPr>
+      </w:pPr>
+      <w:r>
+        <w:t xml:space="preserve">Script: </w:t>
+      </w:r>
+      <w:r>
+        <w:rPr>
+          <w:i/>
+          <w:iCs/>
+          <w:color w:val="C00000"/>
+        </w:rPr>
+        <w:t>m_moorproc_toolbox\exec\gitrepo\stage2\adcp_s55\</w:t>
+      </w:r>
+      <w:r>
+        <w:rPr>
+          <w:i/>
+          <w:iCs/>
+          <w:color w:val="C00000"/>
+          <w:lang w:val="en-US"/>
+        </w:rPr>
+        <w:t>stage02_proc_</w:t>
+      </w:r>
+      <w:r>
+        <w:rPr>
+          <w:i/>
+          <w:iCs/>
+          <w:color w:val="C00000"/>
+          <w:lang w:val="en-US"/>
+        </w:rPr>
+        <w:t>s</w:t>
+      </w:r>
+      <w:r>
+        <w:rPr>
+          <w:i/>
+          <w:iCs/>
+          <w:color w:val="C00000"/>
+          <w:lang w:val="en-US"/>
+        </w:rPr>
+        <w:t>55.m</w:t>
       </w:r>
     </w:p>
     <w:p>
@@ -13319,6 +13298,7 @@
   <w:style w:type="character" w:default="1" w:styleId="DefaultParagraphFont">
     <w:name w:val="Default Paragraph Font"/>
     <w:uiPriority w:val="1"/>
+    <w:semiHidden/>
     <w:unhideWhenUsed/>
   </w:style>
   <w:style w:type="table" w:default="1" w:styleId="TableNormal">

</xml_diff>

<commit_message>
Updated stage1 in guide
</commit_message>
<xml_diff>
--- a/exec/gitrepo/stage1/adcp_s55/Signature 55Hz processing guide.docx
+++ b/exec/gitrepo/stage1/adcp_s55/Signature 55Hz processing guide.docx
@@ -67,7 +67,7 @@
         <w:rPr>
           <w:noProof/>
         </w:rPr>
-        <w:t>11/02/2026 13:05:37</w:t>
+        <w:t>17/03/2026 15:44:20</w:t>
       </w:r>
       <w:r>
         <w:fldChar w:fldCharType="end"/>
@@ -1213,7 +1213,591 @@
     </w:p>
     <w:p>
       <w:r>
-        <w:lastRenderedPageBreak/>
+        <w:t>Output: Data</w:t>
+      </w:r>
+      <w:r>
+        <w:t xml:space="preserve">, </w:t>
+      </w:r>
+      <w:r>
+        <w:t>figures</w:t>
+      </w:r>
+      <w:r>
+        <w:t xml:space="preserve"> and log-file</w:t>
+      </w:r>
+    </w:p>
+    <w:p>
+      <w:pPr>
+        <w:rPr>
+          <w:i/>
+          <w:iCs/>
+          <w:color w:val="3A7C22" w:themeColor="accent6" w:themeShade="BF"/>
+          <w:lang w:val="en-US"/>
+        </w:rPr>
+      </w:pPr>
+      <w:r>
+        <w:rPr>
+          <w:lang w:val="en-US"/>
+        </w:rPr>
+        <w:t xml:space="preserve">Data </w:t>
+      </w:r>
+      <w:r>
+        <w:rPr>
+          <w:lang w:val="en-US"/>
+        </w:rPr>
+        <w:t>filename:</w:t>
+      </w:r>
+      <w:r>
+        <w:rPr>
+          <w:lang w:val="en-US"/>
+        </w:rPr>
+        <w:t xml:space="preserve"> </w:t>
+      </w:r>
+      <w:r>
+        <w:rPr>
+          <w:i/>
+          <w:iCs/>
+          <w:color w:val="3A7C22" w:themeColor="accent6" w:themeShade="BF"/>
+          <w:lang w:val="en-US"/>
+        </w:rPr>
+        <w:t>moor_id_sn_stage1.nc</w:t>
+      </w:r>
+      <w:r>
+        <w:rPr>
+          <w:lang w:val="en-US"/>
+        </w:rPr>
+        <w:t xml:space="preserve">,  e.g. for JC238: </w:t>
+      </w:r>
+      <w:r>
+        <w:rPr>
+          <w:i/>
+          <w:iCs/>
+          <w:color w:val="3A7C22" w:themeColor="accent6" w:themeShade="BF"/>
+          <w:lang w:val="en-US"/>
+        </w:rPr>
+        <w:t>rhadcp_01_2020_200044_stage1.nc</w:t>
+      </w:r>
+    </w:p>
+    <w:p>
+      <w:pPr>
+        <w:rPr>
+          <w:lang w:val="en-US"/>
+        </w:rPr>
+      </w:pPr>
+      <w:r>
+        <w:rPr>
+          <w:lang w:val="en-US"/>
+        </w:rPr>
+        <w:t>Figure</w:t>
+      </w:r>
+      <w:r>
+        <w:rPr>
+          <w:lang w:val="en-US"/>
+        </w:rPr>
+        <w:t xml:space="preserve">s </w:t>
+      </w:r>
+      <w:r>
+        <w:rPr>
+          <w:lang w:val="en-US"/>
+        </w:rPr>
+        <w:t>filenames</w:t>
+      </w:r>
+      <w:r>
+        <w:rPr>
+          <w:lang w:val="en-US"/>
+        </w:rPr>
+        <w:t>:</w:t>
+      </w:r>
+      <w:r>
+        <w:rPr>
+          <w:color w:val="3A7C22" w:themeColor="accent6" w:themeShade="BF"/>
+          <w:lang w:val="en-US"/>
+        </w:rPr>
+        <w:t xml:space="preserve"> </w:t>
+      </w:r>
+      <w:r>
+        <w:rPr>
+          <w:i/>
+          <w:iCs/>
+          <w:color w:val="3A7C22" w:themeColor="accent6" w:themeShade="BF"/>
+          <w:lang w:val="en-US"/>
+        </w:rPr>
+        <w:t>sn_stage</w:t>
+      </w:r>
+      <w:r>
+        <w:rPr>
+          <w:i/>
+          <w:iCs/>
+          <w:color w:val="3A7C22" w:themeColor="accent6" w:themeShade="BF"/>
+          <w:lang w:val="en-US"/>
+        </w:rPr>
+        <w:t>1</w:t>
+      </w:r>
+      <w:r>
+        <w:rPr>
+          <w:i/>
+          <w:iCs/>
+          <w:color w:val="3A7C22" w:themeColor="accent6" w:themeShade="BF"/>
+          <w:lang w:val="en-US"/>
+        </w:rPr>
+        <w:t>_f#_descriptor.png</w:t>
+      </w:r>
+      <w:r>
+        <w:rPr>
+          <w:lang w:val="en-US"/>
+        </w:rPr>
+        <w:t>, e.g. for JC238:</w:t>
+      </w:r>
+    </w:p>
+    <w:p>
+      <w:pPr>
+        <w:pStyle w:val="ListParagraph"/>
+        <w:numPr>
+          <w:ilvl w:val="0"/>
+          <w:numId w:val="38"/>
+        </w:numPr>
+        <w:rPr>
+          <w:i/>
+          <w:iCs/>
+          <w:color w:val="3A7C22" w:themeColor="accent6" w:themeShade="BF"/>
+          <w:lang w:val="en-US"/>
+        </w:rPr>
+      </w:pPr>
+      <w:r>
+        <w:rPr>
+          <w:i/>
+          <w:iCs/>
+          <w:color w:val="3A7C22" w:themeColor="accent6" w:themeShade="BF"/>
+          <w:lang w:val="en-US"/>
+        </w:rPr>
+        <w:t>200044_data_stage1_f1_pressure_tilt_heading_QC.png</w:t>
+      </w:r>
+    </w:p>
+    <w:p>
+      <w:pPr>
+        <w:pStyle w:val="ListParagraph"/>
+        <w:numPr>
+          <w:ilvl w:val="0"/>
+          <w:numId w:val="38"/>
+        </w:numPr>
+        <w:rPr>
+          <w:i/>
+          <w:iCs/>
+          <w:color w:val="3A7C22" w:themeColor="accent6" w:themeShade="BF"/>
+          <w:lang w:val="en-US"/>
+        </w:rPr>
+      </w:pPr>
+      <w:r>
+        <w:rPr>
+          <w:i/>
+          <w:iCs/>
+          <w:color w:val="3A7C22" w:themeColor="accent6" w:themeShade="BF"/>
+          <w:lang w:val="en-US"/>
+        </w:rPr>
+        <w:t>200044_data_stage1_f2_beam_amplitude_correlation_QC.png</w:t>
+      </w:r>
+    </w:p>
+    <w:p>
+      <w:pPr>
+        <w:pStyle w:val="ListParagraph"/>
+        <w:numPr>
+          <w:ilvl w:val="0"/>
+          <w:numId w:val="38"/>
+        </w:numPr>
+        <w:rPr>
+          <w:i/>
+          <w:iCs/>
+          <w:color w:val="3A7C22" w:themeColor="accent6" w:themeShade="BF"/>
+          <w:lang w:val="en-US"/>
+        </w:rPr>
+      </w:pPr>
+      <w:r>
+        <w:rPr>
+          <w:i/>
+          <w:iCs/>
+          <w:color w:val="3A7C22" w:themeColor="accent6" w:themeShade="BF"/>
+          <w:lang w:val="en-US"/>
+        </w:rPr>
+        <w:t>200044_data_stage1_f3_beam_amplitude_correlation_QC.png</w:t>
+      </w:r>
+    </w:p>
+    <w:p>
+      <w:pPr>
+        <w:pStyle w:val="ListParagraph"/>
+        <w:numPr>
+          <w:ilvl w:val="0"/>
+          <w:numId w:val="38"/>
+        </w:numPr>
+        <w:rPr>
+          <w:i/>
+          <w:iCs/>
+          <w:color w:val="3A7C22" w:themeColor="accent6" w:themeShade="BF"/>
+          <w:lang w:val="en-US"/>
+        </w:rPr>
+      </w:pPr>
+      <w:r>
+        <w:rPr>
+          <w:i/>
+          <w:iCs/>
+          <w:color w:val="3A7C22" w:themeColor="accent6" w:themeShade="BF"/>
+          <w:lang w:val="en-US"/>
+        </w:rPr>
+        <w:t>200044_data_stage1_f4_velocity_and_speed_QC.png</w:t>
+      </w:r>
+    </w:p>
+    <w:p>
+      <w:pPr>
+        <w:pStyle w:val="ListParagraph"/>
+        <w:numPr>
+          <w:ilvl w:val="0"/>
+          <w:numId w:val="38"/>
+        </w:numPr>
+        <w:rPr>
+          <w:i/>
+          <w:iCs/>
+          <w:color w:val="3A7C22" w:themeColor="accent6" w:themeShade="BF"/>
+          <w:lang w:val="en-US"/>
+        </w:rPr>
+      </w:pPr>
+      <w:r>
+        <w:rPr>
+          <w:i/>
+          <w:iCs/>
+          <w:color w:val="3A7C22" w:themeColor="accent6" w:themeShade="BF"/>
+          <w:lang w:val="en-US"/>
+        </w:rPr>
+        <w:t>200044_data_stage1_f5_horizontal_magnetometer_QC.png</w:t>
+      </w:r>
+    </w:p>
+    <w:p>
+      <w:pPr>
+        <w:pStyle w:val="ListParagraph"/>
+        <w:numPr>
+          <w:ilvl w:val="0"/>
+          <w:numId w:val="38"/>
+        </w:numPr>
+        <w:rPr>
+          <w:i/>
+          <w:iCs/>
+          <w:color w:val="3A7C22" w:themeColor="accent6" w:themeShade="BF"/>
+          <w:lang w:val="en-US"/>
+        </w:rPr>
+      </w:pPr>
+      <w:r>
+        <w:rPr>
+          <w:i/>
+          <w:iCs/>
+          <w:color w:val="3A7C22" w:themeColor="accent6" w:themeShade="BF"/>
+          <w:lang w:val="en-US"/>
+        </w:rPr>
+        <w:t>200044_data_stage1_f6_sensor_diagnostics.png</w:t>
+      </w:r>
+    </w:p>
+    <w:p>
+      <w:pPr>
+        <w:rPr>
+          <w:i/>
+          <w:iCs/>
+          <w:color w:val="3A7C22" w:themeColor="accent6" w:themeShade="BF"/>
+          <w:lang w:val="en-US"/>
+        </w:rPr>
+      </w:pPr>
+      <w:r>
+        <w:rPr>
+          <w:lang w:val="en-US"/>
+        </w:rPr>
+        <w:t>Log file</w:t>
+      </w:r>
+      <w:r>
+        <w:rPr>
+          <w:lang w:val="en-US"/>
+        </w:rPr>
+        <w:t xml:space="preserve"> filename: </w:t>
+      </w:r>
+      <w:r>
+        <w:rPr>
+          <w:i/>
+          <w:iCs/>
+          <w:color w:val="3A7C22" w:themeColor="accent6" w:themeShade="BF"/>
+          <w:lang w:val="en-US"/>
+        </w:rPr>
+        <w:t>moor_id_</w:t>
+      </w:r>
+      <w:r>
+        <w:rPr>
+          <w:i/>
+          <w:iCs/>
+          <w:color w:val="3A7C22" w:themeColor="accent6" w:themeShade="BF"/>
+          <w:lang w:val="en-US"/>
+        </w:rPr>
+        <w:t>ADCP</w:t>
+      </w:r>
+      <w:r>
+        <w:rPr>
+          <w:i/>
+          <w:iCs/>
+          <w:color w:val="3A7C22" w:themeColor="accent6" w:themeShade="BF"/>
+          <w:lang w:val="en-US"/>
+        </w:rPr>
+        <w:t>_stage1.nc</w:t>
+      </w:r>
+      <w:r>
+        <w:rPr>
+          <w:lang w:val="en-US"/>
+        </w:rPr>
+        <w:t xml:space="preserve">,  e.g. for JC238: </w:t>
+      </w:r>
+      <w:r>
+        <w:rPr>
+          <w:i/>
+          <w:iCs/>
+          <w:color w:val="3A7C22" w:themeColor="accent6" w:themeShade="BF"/>
+          <w:lang w:val="en-US"/>
+        </w:rPr>
+        <w:t>rhadcp_0</w:t>
+      </w:r>
+      <w:r>
+        <w:rPr>
+          <w:i/>
+          <w:iCs/>
+          <w:color w:val="3A7C22" w:themeColor="accent6" w:themeShade="BF"/>
+          <w:lang w:val="en-US"/>
+        </w:rPr>
+        <w:t>1</w:t>
+      </w:r>
+      <w:r>
+        <w:rPr>
+          <w:i/>
+          <w:iCs/>
+          <w:color w:val="3A7C22" w:themeColor="accent6" w:themeShade="BF"/>
+          <w:lang w:val="en-US"/>
+        </w:rPr>
+        <w:t>_202</w:t>
+      </w:r>
+      <w:r>
+        <w:rPr>
+          <w:i/>
+          <w:iCs/>
+          <w:color w:val="3A7C22" w:themeColor="accent6" w:themeShade="BF"/>
+          <w:lang w:val="en-US"/>
+        </w:rPr>
+        <w:t>0</w:t>
+      </w:r>
+      <w:r>
+        <w:rPr>
+          <w:i/>
+          <w:iCs/>
+          <w:color w:val="3A7C22" w:themeColor="accent6" w:themeShade="BF"/>
+          <w:lang w:val="en-US"/>
+        </w:rPr>
+        <w:t>_ADCP_stage1.log</w:t>
+      </w:r>
+    </w:p>
+    <w:p>
+      <w:pPr>
+        <w:rPr>
+          <w:i/>
+          <w:iCs/>
+          <w:color w:val="4EA72E" w:themeColor="accent6"/>
+          <w:lang w:val="en-US"/>
+        </w:rPr>
+      </w:pPr>
+      <w:r>
+        <w:rPr>
+          <w:lang w:val="en-US"/>
+        </w:rPr>
+        <w:t xml:space="preserve">Data directory:  </w:t>
+      </w:r>
+      <w:r>
+        <w:rPr>
+          <w:i/>
+          <w:iCs/>
+          <w:color w:val="4C94D8" w:themeColor="text2" w:themeTint="80"/>
+          <w:lang w:val="en-US"/>
+        </w:rPr>
+        <w:t>osnap</w:t>
+      </w:r>
+      <w:r>
+        <w:rPr>
+          <w:i/>
+          <w:iCs/>
+          <w:color w:val="4C94D8" w:themeColor="text2" w:themeTint="80"/>
+          <w:lang w:val="en-US"/>
+        </w:rPr>
+        <w:t>\</w:t>
+      </w:r>
+      <w:r>
+        <w:rPr>
+          <w:i/>
+          <w:iCs/>
+          <w:color w:val="4C94D8" w:themeColor="text2" w:themeTint="80"/>
+          <w:lang w:val="en-US"/>
+        </w:rPr>
+        <w:t>data</w:t>
+      </w:r>
+      <w:r>
+        <w:rPr>
+          <w:i/>
+          <w:iCs/>
+          <w:color w:val="4C94D8" w:themeColor="text2" w:themeTint="80"/>
+          <w:lang w:val="en-US"/>
+        </w:rPr>
+        <w:t>\</w:t>
+      </w:r>
+      <w:r>
+        <w:rPr>
+          <w:i/>
+          <w:iCs/>
+          <w:color w:val="4C94D8" w:themeColor="text2" w:themeTint="80"/>
+          <w:lang w:val="en-US"/>
+        </w:rPr>
+        <w:t>moor</w:t>
+      </w:r>
+      <w:r>
+        <w:rPr>
+          <w:i/>
+          <w:iCs/>
+          <w:color w:val="4C94D8" w:themeColor="text2" w:themeTint="80"/>
+          <w:lang w:val="en-US"/>
+        </w:rPr>
+        <w:t>\</w:t>
+      </w:r>
+      <w:r>
+        <w:rPr>
+          <w:i/>
+          <w:iCs/>
+          <w:color w:val="4C94D8" w:themeColor="text2" w:themeTint="80"/>
+          <w:lang w:val="en-US"/>
+        </w:rPr>
+        <w:t>proc</w:t>
+      </w:r>
+      <w:r>
+        <w:rPr>
+          <w:i/>
+          <w:iCs/>
+          <w:color w:val="4C94D8" w:themeColor="text2" w:themeTint="80"/>
+          <w:lang w:val="en-US"/>
+        </w:rPr>
+        <w:t>\</w:t>
+      </w:r>
+      <w:r>
+        <w:rPr>
+          <w:i/>
+          <w:iCs/>
+          <w:color w:val="4C94D8" w:themeColor="text2" w:themeTint="80"/>
+          <w:lang w:val="en-US"/>
+        </w:rPr>
+        <w:t>moor_id</w:t>
+      </w:r>
+      <w:r>
+        <w:rPr>
+          <w:i/>
+          <w:iCs/>
+          <w:color w:val="4C94D8" w:themeColor="text2" w:themeTint="80"/>
+          <w:lang w:val="en-US"/>
+        </w:rPr>
+        <w:t>\</w:t>
+      </w:r>
+      <w:r>
+        <w:rPr>
+          <w:i/>
+          <w:iCs/>
+          <w:color w:val="4C94D8" w:themeColor="text2" w:themeTint="80"/>
+          <w:lang w:val="en-US"/>
+        </w:rPr>
+        <w:t>adcp_S55</w:t>
+      </w:r>
+      <w:r>
+        <w:rPr>
+          <w:i/>
+          <w:iCs/>
+          <w:color w:val="4C94D8" w:themeColor="text2" w:themeTint="80"/>
+          <w:lang w:val="en-US"/>
+        </w:rPr>
+        <w:t>\</w:t>
+      </w:r>
+    </w:p>
+    <w:p>
+      <w:pPr>
+        <w:rPr>
+          <w:i/>
+          <w:iCs/>
+          <w:color w:val="4EA72E" w:themeColor="accent6"/>
+          <w:lang w:val="en-US"/>
+        </w:rPr>
+      </w:pPr>
+      <w:r>
+        <w:rPr>
+          <w:lang w:val="en-US"/>
+        </w:rPr>
+        <w:t xml:space="preserve">E.g. for JC238:  </w:t>
+      </w:r>
+      <w:r>
+        <w:rPr>
+          <w:i/>
+          <w:iCs/>
+          <w:color w:val="4C94D8" w:themeColor="text2" w:themeTint="80"/>
+          <w:lang w:val="en-US"/>
+        </w:rPr>
+        <w:t>osnap\data\moor\proc\rhadcp_01_2020\adcp_S55\</w:t>
+      </w:r>
+    </w:p>
+    <w:p>
+      <w:pPr>
+        <w:rPr>
+          <w:lang w:val="en-US"/>
+        </w:rPr>
+      </w:pPr>
+      <w:r>
+        <w:rPr>
+          <w:lang w:val="en-US"/>
+        </w:rPr>
+        <w:t xml:space="preserve">The function </w:t>
+      </w:r>
+      <w:r>
+        <w:rPr>
+          <w:i/>
+          <w:iCs/>
+          <w:color w:val="C00000"/>
+          <w:lang w:val="en-US"/>
+        </w:rPr>
+        <w:t>s55_load_nc_as_struct.m</w:t>
+      </w:r>
+      <w:r>
+        <w:rPr>
+          <w:i/>
+          <w:iCs/>
+          <w:lang w:val="en-US"/>
+        </w:rPr>
+        <w:t xml:space="preserve"> </w:t>
+      </w:r>
+      <w:r>
+        <w:rPr>
+          <w:lang w:val="en-US"/>
+        </w:rPr>
+        <w:t>load</w:t>
+      </w:r>
+      <w:r>
+        <w:rPr>
+          <w:lang w:val="en-US"/>
+        </w:rPr>
+        <w:t>s</w:t>
+      </w:r>
+      <w:r>
+        <w:rPr>
+          <w:lang w:val="en-US"/>
+        </w:rPr>
+        <w:t xml:space="preserve"> saved</w:t>
+      </w:r>
+      <w:r>
+        <w:rPr>
+          <w:lang w:val="en-US"/>
+        </w:rPr>
+        <w:t xml:space="preserve"> nc-file as matlab structure.</w:t>
+      </w:r>
+    </w:p>
+    <w:p/>
+    <w:p>
+      <w:r>
         <w:t>All checks should use plots showing original and flagged data</w:t>
       </w:r>
       <w:r>
@@ -1267,6 +1851,12 @@
           <w:lang w:val="en-US"/>
         </w:rPr>
         <w:t>: Must be reasonable; shallow readings may indicate deployment/retrieval and invalidate profiles.</w:t>
+      </w:r>
+      <w:r>
+        <w:rPr>
+          <w:lang w:val="en-US"/>
+        </w:rPr>
+        <w:t xml:space="preserve"> (deployment and retrieval automatically flagged)</w:t>
       </w:r>
     </w:p>
     <w:p>
@@ -1296,62 +1886,143 @@
         </w:rPr>
         <w:t>:</w:t>
       </w:r>
-    </w:p>
-    <w:p>
-      <w:pPr>
+      <w:r>
+        <w:rPr>
+          <w:lang w:val="en-US"/>
+        </w:rPr>
+        <w:t xml:space="preserve"> </w:t>
+      </w:r>
+    </w:p>
+    <w:p>
+      <w:pPr>
+        <w:pStyle w:val="ListParagraph"/>
         <w:numPr>
           <w:ilvl w:val="1"/>
-          <w:numId w:val="22"/>
+          <w:numId w:val="21"/>
         </w:numPr>
         <w:spacing w:after="0"/>
-        <w:ind w:left="1134" w:hanging="357"/>
-        <w:rPr>
-          <w:lang w:val="en-US"/>
-        </w:rPr>
-      </w:pPr>
-      <w:r>
-        <w:rPr>
-          <w:lang w:val="en-US"/>
-        </w:rPr>
-        <w:t>Tilt &lt;10°: good</w:t>
-      </w:r>
-    </w:p>
-    <w:p>
-      <w:pPr>
+        <w:rPr>
+          <w:lang w:val="en-US"/>
+        </w:rPr>
+      </w:pPr>
+      <w:r>
+        <w:rPr>
+          <w:lang w:val="en-US"/>
+        </w:rPr>
+        <w:t>Tilt</w:t>
+      </w:r>
+      <w:r>
+        <w:rPr>
+          <w:lang w:val="en-US"/>
+        </w:rPr>
+        <w:t xml:space="preserve"> (</w:t>
+      </w:r>
+      <w:r>
+        <w:rPr>
+          <w:lang w:val="en-US"/>
+        </w:rPr>
+        <w:t>R</w:t>
+      </w:r>
+      <w:r>
+        <w:rPr>
+          <w:lang w:val="en-US"/>
+        </w:rPr>
+        <w:t xml:space="preserve">oll and </w:t>
+      </w:r>
+      <w:r>
+        <w:rPr>
+          <w:lang w:val="en-US"/>
+        </w:rPr>
+        <w:t>P</w:t>
+      </w:r>
+      <w:r>
+        <w:rPr>
+          <w:lang w:val="en-US"/>
+        </w:rPr>
+        <w:t>itch)</w:t>
+      </w:r>
+      <w:r>
+        <w:rPr>
+          <w:lang w:val="en-US"/>
+        </w:rPr>
+        <w:t xml:space="preserve"> &lt;10°: </w:t>
+      </w:r>
+      <w:r>
+        <w:t>Ideal; data is within optimal design limits.</w:t>
+      </w:r>
+    </w:p>
+    <w:p>
+      <w:pPr>
+        <w:pStyle w:val="ListParagraph"/>
         <w:numPr>
           <w:ilvl w:val="1"/>
-          <w:numId w:val="22"/>
+          <w:numId w:val="21"/>
         </w:numPr>
         <w:spacing w:after="0"/>
-        <w:ind w:left="1134" w:hanging="357"/>
-        <w:rPr>
-          <w:lang w:val="en-US"/>
-        </w:rPr>
-      </w:pPr>
-      <w:r>
-        <w:rPr>
-          <w:lang w:val="en-US"/>
-        </w:rPr>
-        <w:t>Tilt 10–30°: post-processing possible</w:t>
-      </w:r>
-    </w:p>
-    <w:p>
-      <w:pPr>
+        <w:rPr>
+          <w:lang w:val="en-US"/>
+        </w:rPr>
+      </w:pPr>
+      <w:r>
+        <w:rPr>
+          <w:lang w:val="en-US"/>
+        </w:rPr>
+        <w:t xml:space="preserve">Tilt 10–30°: </w:t>
+      </w:r>
+      <w:r>
+        <w:t>Compass and velocity errors increase—automatically flagged as</w:t>
+      </w:r>
+      <w:r>
+        <w:rPr>
+          <w:lang w:val="en-US"/>
+        </w:rPr>
+        <w:t xml:space="preserve"> </w:t>
+      </w:r>
+      <w:r>
+        <w:rPr>
+          <w:lang w:val="en-US"/>
+        </w:rPr>
+        <w:t>QC_PROBABLY_BAD</w:t>
+      </w:r>
+      <w:r>
+        <w:rPr>
+          <w:lang w:val="en-US"/>
+        </w:rPr>
+        <w:t xml:space="preserve"> (3)</w:t>
+      </w:r>
+    </w:p>
+    <w:p>
+      <w:pPr>
+        <w:pStyle w:val="ListParagraph"/>
         <w:numPr>
           <w:ilvl w:val="1"/>
-          <w:numId w:val="22"/>
+          <w:numId w:val="21"/>
         </w:numPr>
         <w:spacing w:after="0"/>
-        <w:ind w:left="1134" w:hanging="357"/>
-        <w:rPr>
-          <w:lang w:val="en-US"/>
-        </w:rPr>
-      </w:pPr>
-      <w:r>
-        <w:rPr>
-          <w:lang w:val="en-US"/>
-        </w:rPr>
-        <w:t>Tilt &gt;30°: profiles likely erroneous (one transducer horizontal, velocity component undetectable)</w:t>
+        <w:rPr>
+          <w:lang w:val="en-US"/>
+        </w:rPr>
+      </w:pPr>
+      <w:r>
+        <w:rPr>
+          <w:lang w:val="en-US"/>
+        </w:rPr>
+        <w:t xml:space="preserve">Tilt &gt;30°: </w:t>
+      </w:r>
+      <w:r>
+        <w:t> Profiles likely erroneous (one transducer may be near-horizontal, making that velocity component undetectable)—automatically flagged as </w:t>
+      </w:r>
+      <w:r>
+        <w:rPr>
+          <w:lang w:val="en-US"/>
+        </w:rPr>
+        <w:t>QC_BAD</w:t>
+      </w:r>
+      <w:r>
+        <w:rPr>
+          <w:lang w:val="en-US"/>
+        </w:rPr>
+        <w:t xml:space="preserve"> (4)</w:t>
       </w:r>
     </w:p>
     <w:p>
@@ -1371,13 +2042,131 @@
           <w:bCs/>
           <w:lang w:val="en-US"/>
         </w:rPr>
-        <w:t>Tilt &amp; Heading</w:t>
-      </w:r>
-      <w:r>
-        <w:rPr>
-          <w:lang w:val="en-US"/>
-        </w:rPr>
-        <w:t>: Should remain fairly constant during deployment.</w:t>
+        <w:t>Action</w:t>
+      </w:r>
+      <w:r>
+        <w:rPr>
+          <w:lang w:val="en-US"/>
+        </w:rPr>
+        <w:t>:</w:t>
+      </w:r>
+      <w:r>
+        <w:rPr>
+          <w:lang w:val="en-US"/>
+        </w:rPr>
+        <w:t xml:space="preserve"> </w:t>
+      </w:r>
+    </w:p>
+    <w:p>
+      <w:pPr>
+        <w:pStyle w:val="ListParagraph"/>
+        <w:numPr>
+          <w:ilvl w:val="1"/>
+          <w:numId w:val="21"/>
+        </w:numPr>
+        <w:rPr>
+          <w:lang w:val="en-US"/>
+        </w:rPr>
+      </w:pPr>
+      <w:r>
+        <w:rPr>
+          <w:b/>
+          <w:bCs/>
+        </w:rPr>
+        <w:t>Pressure:</w:t>
+      </w:r>
+      <w:r>
+        <w:t> Verify readings are consistent with the deployment depth; data outside this range is automatically flagged</w:t>
+      </w:r>
+      <w:r>
+        <w:t>.</w:t>
+      </w:r>
+    </w:p>
+    <w:p>
+      <w:pPr>
+        <w:pStyle w:val="ListParagraph"/>
+        <w:numPr>
+          <w:ilvl w:val="1"/>
+          <w:numId w:val="21"/>
+        </w:numPr>
+        <w:rPr>
+          <w:lang w:val="en-US"/>
+        </w:rPr>
+      </w:pPr>
+      <w:r>
+        <w:rPr>
+          <w:b/>
+          <w:bCs/>
+        </w:rPr>
+        <w:t>Orientation:</w:t>
+      </w:r>
+      <w:r>
+        <w:t> Tilt and Heading should remain stable. Large fluctuations suggest mooring instability or "knock-downs" by strong currents</w:t>
+      </w:r>
+      <w:r>
+        <w:t xml:space="preserve"> </w:t>
+      </w:r>
+      <w:r>
+        <w:t>–</w:t>
+      </w:r>
+      <w:r>
+        <w:t xml:space="preserve"> unlikely</w:t>
+      </w:r>
+      <w:r>
+        <w:t xml:space="preserve"> for RHADCP</w:t>
+      </w:r>
+      <w:r>
+        <w:t>.</w:t>
+      </w:r>
+      <w:r>
+        <w:rPr>
+          <w:lang w:val="en-US"/>
+        </w:rPr>
+        <w:t xml:space="preserve"> </w:t>
+      </w:r>
+    </w:p>
+    <w:p>
+      <w:pPr>
+        <w:pStyle w:val="ListParagraph"/>
+        <w:numPr>
+          <w:ilvl w:val="1"/>
+          <w:numId w:val="21"/>
+        </w:numPr>
+        <w:rPr>
+          <w:lang w:val="en-US"/>
+        </w:rPr>
+      </w:pPr>
+      <w:r>
+        <w:rPr>
+          <w:rStyle w:val="Strong"/>
+          <w:rFonts w:eastAsiaTheme="majorEastAsia" w:cs="Arial"/>
+          <w:color w:val="0A0A0A"/>
+        </w:rPr>
+        <w:t>Tilt 10–30°:</w:t>
+      </w:r>
+      <w:r>
+        <w:rPr>
+          <w:rStyle w:val="t286pc"/>
+          <w:rFonts w:eastAsiaTheme="majorEastAsia" w:cs="Arial"/>
+          <w:color w:val="0A0A0A"/>
+        </w:rPr>
+        <w:t xml:space="preserve"> Standard post-processing (e.g., bin-mapping) is not currently implemented. Development of these routines is only advisable if significant data gaps occur </w:t>
+      </w:r>
+      <w:r>
+        <w:rPr>
+          <w:rStyle w:val="t286pc"/>
+          <w:rFonts w:eastAsiaTheme="majorEastAsia" w:cs="Arial"/>
+          <w:color w:val="0A0A0A"/>
+        </w:rPr>
+        <w:t>because of</w:t>
+      </w:r>
+      <w:r>
+        <w:rPr>
+          <w:rStyle w:val="t286pc"/>
+          <w:rFonts w:eastAsiaTheme="majorEastAsia" w:cs="Arial"/>
+          <w:color w:val="0A0A0A"/>
+        </w:rPr>
+        <w:t xml:space="preserve"> high-tilt periods.</w:t>
       </w:r>
     </w:p>
     <w:p>
@@ -1415,19 +2204,7 @@
         <w:rPr>
           <w:lang w:val="en-US"/>
         </w:rPr>
-        <w:t>done (</w:t>
-      </w:r>
-      <w:r>
-        <w:rPr>
-          <w:lang w:val="en-US"/>
-        </w:rPr>
-        <w:t>point 6 pending</w:t>
-      </w:r>
-      <w:r>
-        <w:rPr>
-          <w:lang w:val="en-US"/>
-        </w:rPr>
-        <w:t>)</w:t>
+        <w:t xml:space="preserve">done </w:t>
       </w:r>
     </w:p>
     <w:p>
@@ -1501,7 +2278,19 @@
         <w:rPr>
           <w:lang w:val="en-US"/>
         </w:rPr>
-        <w:t>Sudden increase = surface boundary; affected cells likely corrupted.</w:t>
+        <w:t>Sudden increase</w:t>
+      </w:r>
+      <w:r>
+        <w:rPr>
+          <w:lang w:val="en-US"/>
+        </w:rPr>
+        <w:t xml:space="preserve"> at end of bin range</w:t>
+      </w:r>
+      <w:r>
+        <w:rPr>
+          <w:lang w:val="en-US"/>
+        </w:rPr>
+        <w:t xml:space="preserve"> = surface boundary; affected cells likely corrupted.</w:t>
       </w:r>
     </w:p>
     <w:p>
@@ -1520,7 +2309,31 @@
         <w:rPr>
           <w:lang w:val="en-US"/>
         </w:rPr>
-        <w:t>If no boundary, signal stabilizes; valid if above noise floor.</w:t>
+        <w:t>If no boundary, signal stabilizes; valid if above noise floor</w:t>
+      </w:r>
+      <w:r>
+        <w:rPr>
+          <w:lang w:val="en-US"/>
+        </w:rPr>
+        <w:t xml:space="preserve"> (correlation &gt; 50</w:t>
+      </w:r>
+      <w:r>
+        <w:rPr>
+          <w:lang w:val="en-US"/>
+        </w:rPr>
+        <w:t>%</w:t>
+      </w:r>
+      <w:r>
+        <w:rPr>
+          <w:lang w:val="en-US"/>
+        </w:rPr>
+        <w:t>)</w:t>
+      </w:r>
+      <w:r>
+        <w:rPr>
+          <w:lang w:val="en-US"/>
+        </w:rPr>
+        <w:t>.</w:t>
       </w:r>
     </w:p>
     <w:p>
@@ -1539,28 +2352,49 @@
         <w:rPr>
           <w:lang w:val="en-US"/>
         </w:rPr>
-        <w:t>Cells near noise floor are invalid; measurements beyond this range are erroneous.</w:t>
-      </w:r>
-    </w:p>
-    <w:p>
-      <w:pPr>
-        <w:numPr>
-          <w:ilvl w:val="1"/>
-          <w:numId w:val="23"/>
-        </w:numPr>
-        <w:spacing w:after="0"/>
-        <w:ind w:left="1134" w:hanging="357"/>
-        <w:rPr>
-          <w:highlight w:val="yellow"/>
-          <w:lang w:val="en-US"/>
-        </w:rPr>
-      </w:pPr>
-      <w:r>
-        <w:rPr>
-          <w:highlight w:val="yellow"/>
-          <w:lang w:val="en-US"/>
-        </w:rPr>
-        <w:t>Do we have a minimal signal strength?</w:t>
+        <w:t>Cells near noise floor are invalid; measurements beyond this range are erroneous</w:t>
+      </w:r>
+      <w:r>
+        <w:rPr>
+          <w:lang w:val="en-US"/>
+        </w:rPr>
+        <w:t xml:space="preserve">, i.e. all values with </w:t>
+      </w:r>
+      <w:r>
+        <w:rPr>
+          <w:lang w:val="en-US"/>
+        </w:rPr>
+        <w:t>c</w:t>
+      </w:r>
+      <w:r>
+        <w:rPr>
+          <w:lang w:val="en-US"/>
+        </w:rPr>
+        <w:t>orrelation &lt;50</w:t>
+      </w:r>
+      <w:r>
+        <w:rPr>
+          <w:lang w:val="en-US"/>
+        </w:rPr>
+        <w:t>%</w:t>
+      </w:r>
+      <w:r>
+        <w:rPr>
+          <w:lang w:val="en-US"/>
+        </w:rPr>
+        <w:t xml:space="preserve"> will be </w:t>
+      </w:r>
+      <w:r>
+        <w:rPr>
+          <w:lang w:val="en-US"/>
+        </w:rPr>
+        <w:t>flagged as QC_BAD</w:t>
+      </w:r>
+      <w:r>
+        <w:rPr>
+          <w:lang w:val="en-US"/>
+        </w:rPr>
+        <w:t>.</w:t>
       </w:r>
     </w:p>
     <w:p>
@@ -1571,8 +2405,6 @@
           <w:numId w:val="21"/>
         </w:numPr>
         <w:rPr>
-          <w:strike/>
-          <w:highlight w:val="yellow"/>
           <w:lang w:val="en-US"/>
         </w:rPr>
       </w:pPr>
@@ -1580,27 +2412,357 @@
         <w:rPr>
           <w:b/>
           <w:bCs/>
-          <w:strike/>
-          <w:highlight w:val="yellow"/>
-          <w:lang w:val="en-US"/>
-        </w:rPr>
-        <w:t>Single Bad Beam</w:t>
-      </w:r>
-      <w:r>
-        <w:rPr>
-          <w:strike/>
-          <w:highlight w:val="yellow"/>
-          <w:lang w:val="en-US"/>
-        </w:rPr>
-        <w:t>: If one beam is near noise floor throughout</w:t>
-      </w:r>
-      <w:r>
-        <w:rPr>
-          <w:strike/>
-          <w:highlight w:val="yellow"/>
-          <w:lang w:val="en-US"/>
-        </w:rPr>
-        <w:t xml:space="preserve"> would we need to discard all data as we only have 3 beams to start with?</w:t>
+          <w:lang w:val="en-US"/>
+        </w:rPr>
+        <w:t>Spikes in Signal</w:t>
+      </w:r>
+      <w:r>
+        <w:rPr>
+          <w:b/>
+          <w:bCs/>
+          <w:lang w:val="en-US"/>
+        </w:rPr>
+        <w:t xml:space="preserve"> Strength</w:t>
+      </w:r>
+      <w:r>
+        <w:rPr>
+          <w:lang w:val="en-US"/>
+        </w:rPr>
+        <w:t xml:space="preserve">: </w:t>
+      </w:r>
+      <w:r>
+        <w:rPr>
+          <w:lang w:val="en-US"/>
+        </w:rPr>
+        <w:t>Flag and remove affected cells</w:t>
+      </w:r>
+    </w:p>
+    <w:p>
+      <w:pPr>
+        <w:pStyle w:val="ListParagraph"/>
+        <w:numPr>
+          <w:ilvl w:val="1"/>
+          <w:numId w:val="21"/>
+        </w:numPr>
+        <w:rPr>
+          <w:lang w:val="en-US"/>
+        </w:rPr>
+      </w:pPr>
+      <w:r>
+        <w:rPr>
+          <w:rFonts w:eastAsia="Times New Roman" w:cs="Arial"/>
+          <w:b/>
+          <w:bCs/>
+          <w:color w:val="0A0A0A"/>
+          <w:kern w:val="0"/>
+          <w:lang w:val="en-US"/>
+          <w14:ligatures w14:val="none"/>
+        </w:rPr>
+        <w:t>Mooring or Frame Interference</w:t>
+      </w:r>
+    </w:p>
+    <w:p>
+      <w:pPr>
+        <w:pStyle w:val="ListParagraph"/>
+        <w:numPr>
+          <w:ilvl w:val="2"/>
+          <w:numId w:val="21"/>
+        </w:numPr>
+        <w:rPr>
+          <w:rFonts w:eastAsia="Times New Roman" w:cs="Arial"/>
+          <w:color w:val="0A0A0A"/>
+          <w:kern w:val="0"/>
+          <w:lang w:val="en-US"/>
+          <w14:ligatures w14:val="none"/>
+        </w:rPr>
+      </w:pPr>
+      <w:r>
+        <w:rPr>
+          <w:rFonts w:eastAsia="Times New Roman" w:cs="Arial"/>
+          <w:b/>
+          <w:bCs/>
+          <w:color w:val="0A0A0A"/>
+          <w:kern w:val="0"/>
+          <w:lang w:val="en-US"/>
+          <w14:ligatures w14:val="none"/>
+        </w:rPr>
+        <w:t>Appearance:</w:t>
+      </w:r>
+      <w:r>
+        <w:rPr>
+          <w:rFonts w:eastAsia="Times New Roman" w:cs="Arial"/>
+          <w:color w:val="0A0A0A"/>
+          <w:kern w:val="0"/>
+          <w:lang w:val="en-US"/>
+          <w14:ligatures w14:val="none"/>
+        </w:rPr>
+        <w:t> Persistent "stripes" or constant high values at a specific depth in the amplitude plots (Figure 2).</w:t>
+      </w:r>
+    </w:p>
+    <w:p>
+      <w:pPr>
+        <w:pStyle w:val="ListParagraph"/>
+        <w:numPr>
+          <w:ilvl w:val="2"/>
+          <w:numId w:val="21"/>
+        </w:numPr>
+        <w:rPr>
+          <w:rFonts w:eastAsia="Times New Roman" w:cs="Arial"/>
+          <w:color w:val="0A0A0A"/>
+          <w:kern w:val="0"/>
+          <w:lang w:val="en-US"/>
+          <w14:ligatures w14:val="none"/>
+        </w:rPr>
+      </w:pPr>
+      <w:r>
+        <w:rPr>
+          <w:rFonts w:eastAsia="Times New Roman" w:cs="Arial"/>
+          <w:b/>
+          <w:bCs/>
+          <w:color w:val="0A0A0A"/>
+          <w:kern w:val="0"/>
+          <w:lang w:val="en-US"/>
+          <w14:ligatures w14:val="none"/>
+        </w:rPr>
+        <w:t>Risk:</w:t>
+      </w:r>
+      <w:r>
+        <w:rPr>
+          <w:rFonts w:eastAsia="Times New Roman" w:cs="Arial"/>
+          <w:color w:val="0A0A0A"/>
+          <w:kern w:val="0"/>
+          <w:lang w:val="en-US"/>
+          <w14:ligatures w14:val="none"/>
+        </w:rPr>
+        <w:t> Low, as the ADCP is top-mounted.</w:t>
+      </w:r>
+    </w:p>
+    <w:p>
+      <w:pPr>
+        <w:pStyle w:val="ListParagraph"/>
+        <w:numPr>
+          <w:ilvl w:val="2"/>
+          <w:numId w:val="21"/>
+        </w:numPr>
+        <w:rPr>
+          <w:rFonts w:eastAsia="Times New Roman" w:cs="Arial"/>
+          <w:color w:val="0A0A0A"/>
+          <w:kern w:val="0"/>
+          <w:lang w:val="en-US"/>
+          <w14:ligatures w14:val="none"/>
+        </w:rPr>
+      </w:pPr>
+      <w:r>
+        <w:rPr>
+          <w:rFonts w:eastAsia="Times New Roman" w:cs="Arial"/>
+          <w:b/>
+          <w:bCs/>
+          <w:color w:val="0A0A0A"/>
+          <w:kern w:val="0"/>
+          <w:lang w:val="en-US"/>
+          <w14:ligatures w14:val="none"/>
+        </w:rPr>
+        <w:t>Action:</w:t>
+      </w:r>
+      <w:r>
+        <w:rPr>
+          <w:rFonts w:eastAsia="Times New Roman" w:cs="Arial"/>
+          <w:color w:val="0A0A0A"/>
+          <w:kern w:val="0"/>
+          <w:lang w:val="en-US"/>
+          <w14:ligatures w14:val="none"/>
+        </w:rPr>
+        <w:t> Visually inspect Figure 2. Any constant horizontal stripe—outside of known surface bins—indicates a potential obstruction that requires manual flagging.</w:t>
+      </w:r>
+    </w:p>
+    <w:p>
+      <w:pPr>
+        <w:pStyle w:val="ListParagraph"/>
+        <w:numPr>
+          <w:ilvl w:val="1"/>
+          <w:numId w:val="21"/>
+        </w:numPr>
+        <w:rPr>
+          <w:rFonts w:eastAsia="Times New Roman" w:cs="Arial"/>
+          <w:b/>
+          <w:bCs/>
+          <w:color w:val="0A0A0A"/>
+          <w:kern w:val="0"/>
+          <w:lang w:val="en-US"/>
+          <w14:ligatures w14:val="none"/>
+        </w:rPr>
+      </w:pPr>
+      <w:r>
+        <w:rPr>
+          <w:b/>
+          <w:bCs/>
+          <w:lang w:val="en-US"/>
+        </w:rPr>
+        <w:t>Transient Spikes (Fish, Bubbles, etc.)</w:t>
+      </w:r>
+    </w:p>
+    <w:p>
+      <w:pPr>
+        <w:pStyle w:val="ListParagraph"/>
+        <w:numPr>
+          <w:ilvl w:val="2"/>
+          <w:numId w:val="21"/>
+        </w:numPr>
+        <w:rPr>
+          <w:rFonts w:eastAsia="Times New Roman" w:cs="Arial"/>
+          <w:b/>
+          <w:bCs/>
+          <w:color w:val="0A0A0A"/>
+          <w:kern w:val="0"/>
+          <w:lang w:val="en-US"/>
+          <w14:ligatures w14:val="none"/>
+        </w:rPr>
+      </w:pPr>
+      <w:r>
+        <w:rPr>
+          <w:b/>
+          <w:bCs/>
+          <w:lang w:val="en-US"/>
+        </w:rPr>
+        <w:t>Time-Burst Criterion</w:t>
+      </w:r>
+      <w:r>
+        <w:rPr>
+          <w:lang w:val="en-US"/>
+        </w:rPr>
+        <w:t>: Calculates the Median and Median Absolute Deviation (MAD) for each 10-sample burst. Ensembles exceeding the burst median by 3 × MAD and a minimum 10 dB jump are identified as spikes.</w:t>
+      </w:r>
+    </w:p>
+    <w:p>
+      <w:pPr>
+        <w:pStyle w:val="ListParagraph"/>
+        <w:numPr>
+          <w:ilvl w:val="2"/>
+          <w:numId w:val="21"/>
+        </w:numPr>
+        <w:rPr>
+          <w:rFonts w:eastAsia="Times New Roman" w:cs="Arial"/>
+          <w:b/>
+          <w:bCs/>
+          <w:color w:val="0A0A0A"/>
+          <w:kern w:val="0"/>
+          <w:lang w:val="en-US"/>
+          <w14:ligatures w14:val="none"/>
+        </w:rPr>
+      </w:pPr>
+      <w:r>
+        <w:rPr>
+          <w:b/>
+          <w:bCs/>
+          <w:lang w:val="en-US"/>
+        </w:rPr>
+        <w:t>Vertical Criterion:</w:t>
+      </w:r>
+      <w:r>
+        <w:rPr>
+          <w:lang w:val="en-US"/>
+        </w:rPr>
+        <w:t xml:space="preserve"> Monitors sudden amplitude changes along the depth profile. Bins deviating from their vertical neighbors by more than 3 × MAD and </w:t>
+      </w:r>
+      <w:r>
+        <w:rPr>
+          <w:lang w:val="en-US"/>
+        </w:rPr>
+        <w:t xml:space="preserve">a minimum </w:t>
+      </w:r>
+      <w:r>
+        <w:rPr>
+          <w:lang w:val="en-US"/>
+        </w:rPr>
+        <w:t>10 dB are flagged.</w:t>
+      </w:r>
+    </w:p>
+    <w:p>
+      <w:pPr>
+        <w:pStyle w:val="ListParagraph"/>
+        <w:numPr>
+          <w:ilvl w:val="2"/>
+          <w:numId w:val="21"/>
+        </w:numPr>
+        <w:rPr>
+          <w:rFonts w:eastAsia="Times New Roman" w:cs="Arial"/>
+          <w:b/>
+          <w:bCs/>
+          <w:color w:val="0A0A0A"/>
+          <w:kern w:val="0"/>
+          <w:lang w:val="en-US"/>
+          <w14:ligatures w14:val="none"/>
+        </w:rPr>
+      </w:pPr>
+      <w:r>
+        <w:rPr>
+          <w:b/>
+          <w:bCs/>
+          <w:lang w:val="en-US"/>
+        </w:rPr>
+        <w:t>Logic</w:t>
+      </w:r>
+      <w:r>
+        <w:rPr>
+          <w:lang w:val="en-US"/>
+        </w:rPr>
+        <w:t>: These "Loud" jumps (&gt;10 dB, representing a 10-fold power increase) are flagged as QC_BAD</w:t>
+      </w:r>
+      <w:r>
+        <w:t>, which ensures the corresponding velocit</w:t>
+      </w:r>
+      <w:r>
+        <w:t>y values</w:t>
+      </w:r>
+      <w:r>
+        <w:t xml:space="preserve"> are </w:t>
+      </w:r>
+      <w:r>
+        <w:t>removed</w:t>
+      </w:r>
+      <w:r>
+        <w:rPr>
+          <w:lang w:val="en-US"/>
+        </w:rPr>
+        <w:t>.</w:t>
+      </w:r>
+    </w:p>
+    <w:p>
+      <w:pPr>
+        <w:pStyle w:val="ListParagraph"/>
+        <w:ind w:left="1440"/>
+      </w:pPr>
+    </w:p>
+    <w:p>
+      <w:pPr>
+        <w:pStyle w:val="Heading3"/>
+        <w:rPr>
+          <w:lang w:val="en-US"/>
+        </w:rPr>
+      </w:pPr>
+      <w:r>
+        <w:rPr>
+          <w:lang w:val="en-US"/>
+        </w:rPr>
+        <w:t xml:space="preserve">Figure </w:t>
+      </w:r>
+      <w:r>
+        <w:rPr>
+          <w:lang w:val="en-US"/>
+        </w:rPr>
+        <w:t>4</w:t>
+      </w:r>
+      <w:r>
+        <w:rPr>
+          <w:lang w:val="en-US"/>
+        </w:rPr>
+        <w:t xml:space="preserve"> – status: </w:t>
+      </w:r>
+      <w:r>
+        <w:rPr>
+          <w:lang w:val="en-US"/>
+        </w:rPr>
+        <w:t>done</w:t>
       </w:r>
     </w:p>
     <w:p>
@@ -1611,609 +2773,102 @@
           <w:numId w:val="21"/>
         </w:numPr>
         <w:rPr>
-          <w:lang w:val="en-US"/>
-        </w:rPr>
-      </w:pPr>
-      <w:commentRangeStart w:id="4"/>
-      <w:r>
-        <w:rPr>
           <w:b/>
           <w:bCs/>
           <w:lang w:val="en-US"/>
         </w:rPr>
-        <w:t>Spikes in Signal</w:t>
-      </w:r>
+      </w:pPr>
       <w:r>
         <w:rPr>
           <w:b/>
           <w:bCs/>
-          <w:lang w:val="en-US"/>
-        </w:rPr>
-        <w:t xml:space="preserve"> Strength</w:t>
-      </w:r>
-      <w:r>
-        <w:rPr>
-          <w:lang w:val="en-US"/>
+        </w:rPr>
+        <w:t>Velocity Quality Control</w:t>
+      </w:r>
+      <w:r>
+        <w:rPr>
+          <w:b/>
+          <w:bCs/>
         </w:rPr>
         <w:t xml:space="preserve">: </w:t>
       </w:r>
       <w:r>
-        <w:rPr>
-          <w:lang w:val="en-US"/>
-        </w:rPr>
-        <w:t>Flag and remove affected cells; develop auto-processing algorithm.</w:t>
+        <w:t>Suspicious velocity values are f</w:t>
+      </w:r>
+      <w:r>
+        <w:rPr>
+          <w:lang w:val="en-US"/>
+        </w:rPr>
+        <w:t>lagged as QC_BAD (4) based on:</w:t>
       </w:r>
     </w:p>
     <w:p>
       <w:pPr>
         <w:pStyle w:val="ListParagraph"/>
         <w:numPr>
-          <w:ilvl w:val="0"/>
-          <w:numId w:val="33"/>
+          <w:ilvl w:val="1"/>
+          <w:numId w:val="21"/>
         </w:numPr>
-        <w:ind w:left="993"/>
-        <w:rPr>
-          <w:lang w:val="en-US"/>
-        </w:rPr>
-      </w:pPr>
-      <w:r>
-        <w:rPr>
-          <w:lang w:val="en-US"/>
-        </w:rPr>
-        <w:t>Caused by frame, mooring parts</w:t>
-      </w:r>
-      <w:r>
-        <w:rPr>
-          <w:lang w:val="en-US"/>
-        </w:rPr>
-        <w:t xml:space="preserve">: appears as constant stripe in </w:t>
-      </w:r>
-      <w:r>
-        <w:rPr>
-          <w:lang w:val="en-US"/>
-        </w:rPr>
-        <w:t>a</w:t>
-      </w:r>
-      <w:r>
-        <w:rPr>
-          <w:lang w:val="en-US"/>
-        </w:rPr>
-        <w:t>mplitude</w:t>
+        <w:rPr>
+          <w:b/>
+          <w:bCs/>
+          <w:lang w:val="en-US"/>
+        </w:rPr>
+      </w:pPr>
+      <w:r>
+        <w:rPr>
+          <w:lang w:val="en-US"/>
+        </w:rPr>
+        <w:t>Horizontal spikes (|dU/dz|, |dV/dz|) &gt; 1.00 m/s</w:t>
       </w:r>
     </w:p>
     <w:p>
       <w:pPr>
         <w:pStyle w:val="ListParagraph"/>
         <w:numPr>
-          <w:ilvl w:val="0"/>
-          <w:numId w:val="33"/>
+          <w:ilvl w:val="1"/>
+          <w:numId w:val="21"/>
         </w:numPr>
-        <w:ind w:left="993"/>
-        <w:rPr>
-          <w:lang w:val="en-US"/>
-        </w:rPr>
-      </w:pPr>
-      <w:r>
-        <w:rPr>
-          <w:lang w:val="en-US"/>
-        </w:rPr>
-        <w:t>F</w:t>
-      </w:r>
-      <w:r>
-        <w:rPr>
-          <w:lang w:val="en-US"/>
-        </w:rPr>
-        <w:t>ish, etc.</w:t>
-      </w:r>
-      <w:r>
-        <w:rPr>
-          <w:lang w:val="en-US"/>
-        </w:rPr>
-        <w:t>:</w:t>
+        <w:rPr>
+          <w:b/>
+          <w:bCs/>
+          <w:lang w:val="en-US"/>
+        </w:rPr>
+      </w:pPr>
+      <w:r>
+        <w:rPr>
+          <w:lang w:val="en-US"/>
+        </w:rPr>
+        <w:t>Statistical outliers &gt; 3 standard deviations (per depth bin)</w:t>
       </w:r>
     </w:p>
     <w:p>
       <w:pPr>
         <w:pStyle w:val="ListParagraph"/>
         <w:numPr>
-          <w:ilvl w:val="0"/>
-          <w:numId w:val="33"/>
-        </w:numPr>
-        <w:rPr>
-          <w:lang w:val="en-US"/>
-        </w:rPr>
-      </w:pPr>
-      <w:r>
-        <w:t>GO-SHIP vmADCP:</w:t>
-      </w:r>
-      <w:r>
-        <w:t xml:space="preserve"> </w:t>
-      </w:r>
-      <w:r>
-        <w:t>three-profile running median of the received amplitude for each beam</w:t>
-      </w:r>
-      <w:r>
-        <w:t xml:space="preserve"> </w:t>
-      </w:r>
-      <w:r>
-        <w:t>– not sure how to apply that post processing</w:t>
-      </w:r>
-    </w:p>
-    <w:p>
-      <w:pPr>
-        <w:pStyle w:val="ListParagraph"/>
-        <w:numPr>
-          <w:ilvl w:val="0"/>
-          <w:numId w:val="33"/>
-        </w:numPr>
-        <w:rPr>
-          <w:lang w:val="en-US"/>
-        </w:rPr>
-      </w:pPr>
-      <w:r>
-        <w:t>I calc median and standard deviation</w:t>
-      </w:r>
-      <w:r>
-        <w:t xml:space="preserve"> </w:t>
-      </w:r>
-      <w:r>
-        <w:t xml:space="preserve">of </w:t>
-      </w:r>
-      <w:r>
-        <w:t>10samples/10second ensemble</w:t>
-      </w:r>
-      <w:r>
-        <w:t>s</w:t>
-      </w:r>
-      <w:r>
-        <w:t>:</w:t>
-      </w:r>
-      <w:r>
-        <w:t xml:space="preserve"> if larger then median plus </w:t>
-      </w:r>
-      <w:r>
-        <w:t>3</w:t>
-      </w:r>
-      <w:r>
-        <w:t>*standard deviation (</w:t>
-      </w:r>
-      <w:r>
-        <w:t xml:space="preserve">~ </w:t>
-      </w:r>
-      <w:r>
-        <w:t>0.05</w:t>
-      </w:r>
-      <w:r>
-        <w:t>% of data) th</w:t>
-      </w:r>
-      <w:r>
-        <w:t>en</w:t>
-      </w:r>
-      <w:r>
-        <w:t xml:space="preserve"> </w:t>
-      </w:r>
-      <w:r>
-        <w:t>flag</w:t>
-      </w:r>
-      <w:r>
-        <w:t>.</w:t>
-      </w:r>
-    </w:p>
-    <w:p>
-      <w:pPr>
-        <w:pStyle w:val="ListParagraph"/>
-        <w:numPr>
-          <w:ilvl w:val="0"/>
-          <w:numId w:val="33"/>
-        </w:numPr>
-      </w:pPr>
-      <w:r>
-        <w:t>Along depth dimension I calc diff of ensemble median</w:t>
-      </w:r>
-      <w:r>
-        <w:t>, then flag any diff larger then</w:t>
-      </w:r>
-      <w:r>
-        <w:t xml:space="preserve"> </w:t>
-      </w:r>
-      <w:r>
-        <w:t>median+</w:t>
-      </w:r>
-      <w:r>
-        <w:t>/-</w:t>
-      </w:r>
-      <w:r>
-        <w:t>3*std of diff</w:t>
-      </w:r>
-      <w:r>
-        <w:t xml:space="preserve"> and </w:t>
-      </w:r>
-      <w:r>
-        <w:t>remap to oridinal size (0% data). I do not apply these flags at the moment. Just print out a suggestion to smooth</w:t>
-      </w:r>
-      <w:r>
-        <w:t>/despike velocity</w:t>
-      </w:r>
-      <w:commentRangeEnd w:id="4"/>
-      <w:r>
-        <w:rPr>
-          <w:rStyle w:val="CommentReference"/>
-          <w:sz w:val="24"/>
-          <w:szCs w:val="24"/>
-        </w:rPr>
-        <w:commentReference w:id="4"/>
-      </w:r>
-    </w:p>
-    <w:p>
-      <w:pPr>
-        <w:pStyle w:val="ListParagraph"/>
-        <w:ind w:left="1440"/>
-      </w:pPr>
-    </w:p>
-    <w:p>
-      <w:pPr>
-        <w:pStyle w:val="ListParagraph"/>
-        <w:numPr>
-          <w:ilvl w:val="0"/>
+          <w:ilvl w:val="1"/>
           <w:numId w:val="21"/>
         </w:numPr>
         <w:rPr>
-          <w:lang w:val="en-US"/>
-        </w:rPr>
-      </w:pPr>
-      <w:r>
-        <w:rPr>
           <w:b/>
           <w:bCs/>
           <w:lang w:val="en-US"/>
         </w:rPr>
-        <w:lastRenderedPageBreak/>
-        <w:t>Just check again Correlation (&lt;50 will be set to NaN by default)</w:t>
+      </w:pPr>
+      <w:r>
+        <w:rPr>
+          <w:lang w:val="en-US"/>
+        </w:rPr>
+        <w:t>Vertical velocity outliers (|W|) &gt; 0.10 m/s</w:t>
       </w:r>
     </w:p>
     <w:p>
       <w:pPr>
         <w:pStyle w:val="ListParagraph"/>
-        <w:numPr>
-          <w:ilvl w:val="0"/>
-          <w:numId w:val="21"/>
-        </w:numPr>
-        <w:rPr>
-          <w:lang w:val="en-US"/>
-        </w:rPr>
-      </w:pPr>
-      <w:r>
-        <w:rPr>
-          <w:b/>
-          <w:bCs/>
-          <w:lang w:val="en-US"/>
-        </w:rPr>
-        <w:t>Check side lobe interference:</w:t>
-      </w:r>
-    </w:p>
-    <w:p>
-      <w:pPr>
-        <w:pStyle w:val="ListParagraph"/>
-        <w:ind w:left="502"/>
-        <w:rPr>
-          <w:lang w:val="en-US"/>
-        </w:rPr>
-      </w:pPr>
-      <w:r>
-        <w:rPr>
-          <w:lang w:val="en-US"/>
-        </w:rPr>
-        <w:t xml:space="preserve">As RHADCP is mounted on string I applied the following including </w:t>
-      </w:r>
-      <w:r>
-        <w:rPr>
-          <w:lang w:val="en-US"/>
-        </w:rPr>
-        <w:t>tilt</w:t>
-      </w:r>
-      <w:r>
-        <w:rPr>
-          <w:lang w:val="en-US"/>
-        </w:rPr>
-        <w:t xml:space="preserve"> </w:t>
-      </w:r>
-      <w:r>
-        <w:rPr>
-          <w:lang w:val="en-US"/>
-        </w:rPr>
-        <w:t>β</w:t>
-      </w:r>
-      <w:r>
-        <w:rPr>
-          <w:lang w:val="en-US"/>
-        </w:rPr>
-        <w:t>.</w:t>
-      </w:r>
-      <w:r>
-        <w:rPr>
-          <w:lang w:val="en-US"/>
-        </w:rPr>
-        <w:t xml:space="preserve"> This is calc as:</w:t>
-      </w:r>
-    </w:p>
-    <w:p>
-      <w:pPr>
-        <w:pStyle w:val="ListParagraph"/>
-        <w:ind w:left="502"/>
-        <w:rPr>
-          <w:lang w:val="en-US"/>
-        </w:rPr>
-      </w:pPr>
-    </w:p>
-    <w:p>
-      <w:pPr>
-        <w:pStyle w:val="ListParagraph"/>
-        <w:ind w:left="502"/>
-        <w:rPr>
-          <w:lang w:val="en-US"/>
-        </w:rPr>
-      </w:pPr>
-    </w:p>
-    <w:p>
-      <w:pPr>
-        <w:pStyle w:val="ListParagraph"/>
-        <w:ind w:left="502"/>
-        <w:rPr>
-          <w:rFonts w:eastAsiaTheme="minorEastAsia"/>
-          <w:lang w:val="en-US"/>
-        </w:rPr>
-      </w:pPr>
-      <m:oMathPara>
-        <m:oMath>
-          <m:sSub>
-            <m:sSubPr>
-              <m:ctrlPr>
-                <w:rPr>
-                  <w:rFonts w:ascii="Cambria Math" w:hAnsi="Cambria Math"/>
-                  <w:lang w:val="en-US"/>
-                </w:rPr>
-              </m:ctrlPr>
-            </m:sSubPr>
-            <m:e>
-              <m:r>
-                <m:rPr>
-                  <m:sty m:val="p"/>
-                </m:rPr>
-                <w:rPr>
-                  <w:rFonts w:ascii="Cambria Math" w:hAnsi="Cambria Math"/>
-                  <w:lang w:val="en-US"/>
-                </w:rPr>
-                <m:t>R</m:t>
-              </m:r>
-            </m:e>
-            <m:sub>
-              <m:r>
-                <m:rPr>
-                  <m:sty m:val="p"/>
-                </m:rPr>
-                <w:rPr>
-                  <w:rFonts w:ascii="Cambria Math" w:hAnsi="Cambria Math"/>
-                  <w:lang w:val="en-US"/>
-                </w:rPr>
-                <m:t>max</m:t>
-              </m:r>
-            </m:sub>
-          </m:sSub>
-          <m:r>
-            <m:rPr>
-              <m:sty m:val="p"/>
-            </m:rPr>
-            <w:rPr>
-              <w:rFonts w:ascii="Cambria Math" w:hAnsi="Cambria Math"/>
-              <w:lang w:val="en-US"/>
-            </w:rPr>
-            <m:t>=</m:t>
-          </m:r>
-          <m:r>
-            <w:rPr>
-              <w:rFonts w:ascii="Cambria Math" w:hAnsi="Cambria Math"/>
-            </w:rPr>
-            <m:t>H</m:t>
-          </m:r>
-          <m:r>
-            <m:rPr>
-              <m:sty m:val="p"/>
-            </m:rPr>
-            <w:rPr>
-              <w:rFonts w:ascii="Cambria Math" w:hAnsi="Cambria Math"/>
-              <w:lang w:val="en-US"/>
-            </w:rPr>
-            <m:t xml:space="preserve"> cos</m:t>
-          </m:r>
-          <m:d>
-            <m:dPr>
-              <m:ctrlPr>
-                <w:rPr>
-                  <w:rFonts w:ascii="Cambria Math" w:hAnsi="Cambria Math"/>
-                  <w:lang w:val="en-US"/>
-                </w:rPr>
-              </m:ctrlPr>
-            </m:dPr>
-            <m:e>
-              <m:r>
-                <w:rPr>
-                  <w:rFonts w:ascii="Cambria Math" w:hAnsi="Cambria Math"/>
-                </w:rPr>
-                <m:t>β</m:t>
-              </m:r>
-            </m:e>
-          </m:d>
-          <m:r>
-            <m:rPr>
-              <m:sty m:val="p"/>
-            </m:rPr>
-            <w:rPr>
-              <w:rFonts w:ascii="Cambria Math" w:hAnsi="Cambria Math"/>
-              <w:lang w:val="en-US"/>
-            </w:rPr>
-            <m:t>-Cell Size</m:t>
-          </m:r>
-        </m:oMath>
-      </m:oMathPara>
-    </w:p>
-    <w:p>
-      <w:pPr>
-        <w:spacing w:after="0" w:line="240" w:lineRule="auto"/>
-        <w:ind w:firstLine="502"/>
-        <w:rPr>
-          <w:rFonts w:eastAsiaTheme="minorEastAsia"/>
-          <w:lang w:val="en-US"/>
-        </w:rPr>
-      </w:pPr>
-      <m:oMath>
-        <m:sSub>
-          <m:sSubPr>
-            <m:ctrlPr>
-              <w:rPr>
-                <w:rFonts w:ascii="Cambria Math" w:hAnsi="Cambria Math"/>
-                <w:lang w:val="en-US"/>
-              </w:rPr>
-            </m:ctrlPr>
-          </m:sSubPr>
-          <m:e>
-            <m:r>
-              <m:rPr>
-                <m:sty m:val="p"/>
-              </m:rPr>
-              <w:rPr>
-                <w:rFonts w:ascii="Cambria Math" w:hAnsi="Cambria Math"/>
-                <w:lang w:val="en-US"/>
-              </w:rPr>
-              <m:t>R</m:t>
-            </m:r>
-          </m:e>
-          <m:sub>
-            <m:r>
-              <m:rPr>
-                <m:sty m:val="p"/>
-              </m:rPr>
-              <w:rPr>
-                <w:rFonts w:ascii="Cambria Math" w:hAnsi="Cambria Math"/>
-                <w:lang w:val="en-US"/>
-              </w:rPr>
-              <m:t>max</m:t>
-            </m:r>
-          </m:sub>
-        </m:sSub>
-      </m:oMath>
-      <w:r>
-        <w:rPr>
-          <w:rFonts w:eastAsiaTheme="minorEastAsia"/>
-          <w:lang w:val="en-US"/>
-        </w:rPr>
-        <w:t>:</w:t>
-      </w:r>
-      <w:r>
-        <w:rPr>
-          <w:rFonts w:eastAsiaTheme="minorEastAsia"/>
-          <w:lang w:val="en-US"/>
-        </w:rPr>
-        <w:tab/>
-      </w:r>
-      <w:r>
-        <w:rPr>
-          <w:rFonts w:eastAsiaTheme="minorEastAsia"/>
-          <w:lang w:val="en-US"/>
-        </w:rPr>
-        <w:t>maximum range without sidelobe interference</w:t>
-      </w:r>
-    </w:p>
-    <w:p>
-      <w:pPr>
-        <w:spacing w:after="0" w:line="240" w:lineRule="auto"/>
-        <w:ind w:left="1440" w:hanging="938"/>
-        <w:rPr>
-          <w:rFonts w:eastAsiaTheme="minorEastAsia"/>
-          <w:lang w:val="en-US"/>
-        </w:rPr>
-      </w:pPr>
-      <m:oMath>
-        <m:r>
-          <w:rPr>
-            <w:rFonts w:ascii="Cambria Math" w:hAnsi="Cambria Math"/>
-          </w:rPr>
-          <m:t>H</m:t>
-        </m:r>
-      </m:oMath>
-      <w:r>
-        <w:rPr>
-          <w:rFonts w:eastAsiaTheme="minorEastAsia"/>
-        </w:rPr>
-        <w:t>:</w:t>
-      </w:r>
-      <w:r>
-        <w:rPr>
-          <w:rFonts w:eastAsiaTheme="minorEastAsia"/>
-          <w:lang w:val="en-US"/>
-        </w:rPr>
-        <w:tab/>
-      </w:r>
-      <w:r>
-        <w:rPr>
-          <w:rFonts w:eastAsiaTheme="minorEastAsia"/>
-          <w:lang w:val="en-US"/>
-        </w:rPr>
-        <w:t>instrument depth</w:t>
-      </w:r>
-      <w:r>
-        <w:rPr>
-          <w:rFonts w:eastAsiaTheme="minorEastAsia"/>
-          <w:lang w:val="en-US"/>
-        </w:rPr>
-        <w:t xml:space="preserve"> (max out of user set nominal depth </w:t>
-      </w:r>
-      <w:r>
-        <w:rPr>
-          <w:rFonts w:eastAsiaTheme="minorEastAsia"/>
-          <w:lang w:val="en-US"/>
-        </w:rPr>
-        <w:t>and temporal mean based on pressure sensor</w:t>
-      </w:r>
-    </w:p>
-    <w:p>
-      <w:pPr>
-        <w:spacing w:after="0" w:line="240" w:lineRule="auto"/>
-        <w:ind w:left="1440" w:hanging="938"/>
-        <w:rPr>
-          <w:rFonts w:eastAsiaTheme="minorEastAsia"/>
-          <w:lang w:val="en-US"/>
-        </w:rPr>
-      </w:pPr>
-      <w:r>
-        <w:rPr>
-          <w:rFonts w:eastAsiaTheme="minorEastAsia"/>
-        </w:rPr>
-        <w:t>β</w:t>
-      </w:r>
-      <w:r>
-        <w:rPr>
-          <w:rFonts w:eastAsiaTheme="minorEastAsia"/>
-        </w:rPr>
-        <w:t>:</w:t>
-      </w:r>
-      <w:r>
-        <w:rPr>
-          <w:rFonts w:eastAsiaTheme="minorEastAsia"/>
-        </w:rPr>
-        <w:tab/>
-      </w:r>
-      <w:r>
-        <w:rPr>
-          <w:rFonts w:eastAsiaTheme="minorEastAsia"/>
-        </w:rPr>
-        <w:t>time varying maximum tilt</w:t>
-      </w:r>
-      <w:r>
-        <w:rPr>
-          <w:rFonts w:eastAsiaTheme="minorEastAsia"/>
-        </w:rPr>
-        <w:t xml:space="preserve"> of three beams compared to vertical</w:t>
-      </w:r>
+        <w:rPr>
+          <w:lang w:val="en-US"/>
+        </w:rPr>
+      </w:pPr>
     </w:p>
     <w:p>
       <w:pPr>
@@ -2224,91 +2879,17 @@
       </w:pPr>
       <w:r>
         <w:rPr>
-          <w:lang w:val="en-US"/>
-        </w:rPr>
-        <w:t xml:space="preserve">Figure </w:t>
-      </w:r>
-      <w:r>
-        <w:rPr>
-          <w:lang w:val="en-US"/>
-        </w:rPr>
-        <w:t>4</w:t>
-      </w:r>
-      <w:r>
-        <w:rPr>
-          <w:lang w:val="en-US"/>
-        </w:rPr>
-        <w:t xml:space="preserve"> – status: </w:t>
-      </w:r>
-      <w:r>
-        <w:rPr>
-          <w:lang w:val="en-US"/>
-        </w:rPr>
-        <w:t>done</w:t>
-      </w:r>
-    </w:p>
-    <w:p>
-      <w:pPr>
-        <w:pStyle w:val="ListParagraph"/>
-        <w:numPr>
-          <w:ilvl w:val="0"/>
-          <w:numId w:val="21"/>
-        </w:numPr>
-        <w:rPr>
-          <w:lang w:val="en-US"/>
-        </w:rPr>
-      </w:pPr>
-      <w:r>
-        <w:rPr>
-          <w:b/>
-          <w:bCs/>
-          <w:lang w:val="en-US"/>
-        </w:rPr>
-        <w:t>Unrealistic Current Variations</w:t>
-      </w:r>
-      <w:r>
-        <w:rPr>
-          <w:lang w:val="en-US"/>
-        </w:rPr>
-        <w:t>: &gt;1 m/s over few meters or</w:t>
-      </w:r>
-      <w:r>
-        <w:rPr>
-          <w:lang w:val="en-US"/>
-        </w:rPr>
-        <w:t xml:space="preserve"> velocities</w:t>
-      </w:r>
-      <w:r>
-        <w:rPr>
-          <w:lang w:val="en-US"/>
-        </w:rPr>
-        <w:t xml:space="preserve"> far from mean should be removed.</w:t>
-      </w:r>
-    </w:p>
-    <w:p>
-      <w:pPr>
-        <w:pStyle w:val="ListParagraph"/>
-        <w:numPr>
-          <w:ilvl w:val="0"/>
-          <w:numId w:val="21"/>
-        </w:numPr>
-        <w:rPr>
-          <w:lang w:val="en-US"/>
-        </w:rPr>
-      </w:pPr>
-      <w:r>
-        <w:rPr>
           <w:noProof/>
           <w:lang w:val="en-US"/>
         </w:rPr>
         <w:drawing>
-          <wp:anchor distT="0" distB="0" distL="114300" distR="114300" simplePos="0" relativeHeight="251658240" behindDoc="1" locked="0" layoutInCell="1" allowOverlap="1" wp14:anchorId="7A11EBCF" wp14:editId="79D1ABA0">
+          <wp:anchor distT="0" distB="0" distL="114300" distR="114300" simplePos="0" relativeHeight="251658240" behindDoc="1" locked="0" layoutInCell="1" allowOverlap="1" wp14:anchorId="7A11EBCF" wp14:editId="4F7DFE39">
             <wp:simplePos x="0" y="0"/>
             <wp:positionH relativeFrom="column">
-              <wp:posOffset>3651437</wp:posOffset>
+              <wp:posOffset>3889375</wp:posOffset>
             </wp:positionH>
             <wp:positionV relativeFrom="paragraph">
-              <wp:posOffset>389255</wp:posOffset>
+              <wp:posOffset>8890</wp:posOffset>
             </wp:positionV>
             <wp:extent cx="2340257" cy="2671526"/>
             <wp:effectExtent l="0" t="0" r="3175" b="0"/>
@@ -2374,64 +2955,6 @@
       </w:r>
       <w:r>
         <w:rPr>
-          <w:b/>
-          <w:bCs/>
-          <w:lang w:val="en-US"/>
-        </w:rPr>
-        <w:t>Vertical Velocity Check</w:t>
-      </w:r>
-      <w:r>
-        <w:rPr>
-          <w:lang w:val="en-US"/>
-        </w:rPr>
-        <w:t xml:space="preserve">: </w:t>
-      </w:r>
-      <w:r>
-        <w:rPr>
-          <w:lang w:val="en-US"/>
-        </w:rPr>
-        <w:t xml:space="preserve">Should be near zero. </w:t>
-      </w:r>
-      <w:r>
-        <w:rPr>
-          <w:lang w:val="en-US"/>
-        </w:rPr>
-        <w:t>Cells with implausible vertical velocities</w:t>
-      </w:r>
-      <w:r>
-        <w:rPr>
-          <w:lang w:val="en-US"/>
-        </w:rPr>
-        <w:t xml:space="preserve"> (&gt;</w:t>
-      </w:r>
-      <w:r>
-        <w:rPr>
-          <w:lang w:val="en-US"/>
-        </w:rPr>
-        <w:t>0.1m/s</w:t>
-      </w:r>
-      <w:r>
-        <w:rPr>
-          <w:lang w:val="en-US"/>
-        </w:rPr>
-        <w:t>)</w:t>
-      </w:r>
-      <w:r>
-        <w:rPr>
-          <w:lang w:val="en-US"/>
-        </w:rPr>
-        <w:t xml:space="preserve"> should be discarded.</w:t>
-      </w:r>
-    </w:p>
-    <w:p>
-      <w:pPr>
-        <w:pStyle w:val="Heading3"/>
-        <w:rPr>
-          <w:lang w:val="en-US"/>
-        </w:rPr>
-      </w:pPr>
-      <w:r>
-        <w:rPr>
           <w:lang w:val="en-US"/>
         </w:rPr>
         <w:t xml:space="preserve">Figure </w:t>
@@ -2446,13 +2969,13 @@
         <w:rPr>
           <w:lang w:val="en-US"/>
         </w:rPr>
-        <w:t xml:space="preserve"> – status: </w:t>
-      </w:r>
-      <w:r>
-        <w:rPr>
-          <w:lang w:val="en-US"/>
-        </w:rPr>
-        <w:t>WIP</w:t>
+        <w:t xml:space="preserve"> – status:</w:t>
+      </w:r>
+      <w:r>
+        <w:rPr>
+          <w:lang w:val="en-US"/>
+        </w:rPr>
+        <w:t xml:space="preserve"> done</w:t>
       </w:r>
     </w:p>
     <w:p>
@@ -2468,7 +2991,7 @@
           <w:lang w:val="en-US"/>
         </w:rPr>
       </w:pPr>
-      <w:commentRangeStart w:id="5"/>
+      <w:commentRangeStart w:id="4"/>
       <w:r>
         <w:rPr>
           <w:b/>
@@ -2483,7 +3006,7 @@
         </w:rPr>
         <w:t>:</w:t>
       </w:r>
-      <w:commentRangeEnd w:id="5"/>
+      <w:commentRangeEnd w:id="4"/>
       <w:r>
         <w:rPr>
           <w:rStyle w:val="CommentReference"/>
@@ -2491,7 +3014,7 @@
           <w:szCs w:val="24"/>
           <w:lang w:val="en-US"/>
         </w:rPr>
-        <w:commentReference w:id="5"/>
+        <w:commentReference w:id="4"/>
       </w:r>
       <w:r>
         <w:rPr>
@@ -2567,7 +3090,49 @@
           <w:highlight w:val="yellow"/>
           <w:lang w:val="en-US"/>
         </w:rPr>
-        <w:t>ONLY check and flag, processing is stage 2</w:t>
+        <w:t>ONLY check</w:t>
+      </w:r>
+      <w:r>
+        <w:rPr>
+          <w:highlight w:val="yellow"/>
+          <w:lang w:val="en-US"/>
+        </w:rPr>
+        <w:t xml:space="preserve"> that compass is resonable</w:t>
+      </w:r>
+      <w:r>
+        <w:rPr>
+          <w:highlight w:val="yellow"/>
+          <w:lang w:val="en-US"/>
+        </w:rPr>
+        <w:t>,</w:t>
+      </w:r>
+      <w:r>
+        <w:rPr>
+          <w:highlight w:val="yellow"/>
+          <w:lang w:val="en-US"/>
+        </w:rPr>
+        <w:t xml:space="preserve"> hard iron compass correction is done</w:t>
+      </w:r>
+      <w:r>
+        <w:rPr>
+          <w:highlight w:val="yellow"/>
+          <w:lang w:val="en-US"/>
+        </w:rPr>
+        <w:t xml:space="preserve"> i</w:t>
+      </w:r>
+      <w:r>
+        <w:rPr>
+          <w:highlight w:val="yellow"/>
+          <w:lang w:val="en-US"/>
+        </w:rPr>
+        <w:t>n</w:t>
+      </w:r>
+      <w:r>
+        <w:rPr>
+          <w:highlight w:val="yellow"/>
+          <w:lang w:val="en-US"/>
+        </w:rPr>
+        <w:t xml:space="preserve"> stage 2</w:t>
       </w:r>
       <w:r>
         <w:rPr>
@@ -2595,7 +3160,13 @@
         <w:rPr>
           <w:lang w:val="en-US"/>
         </w:rPr>
-        <w:t>Usin</w:t>
+        <w:t>Backround info - u</w:t>
+      </w:r>
+      <w:r>
+        <w:rPr>
+          <w:lang w:val="en-US"/>
+        </w:rPr>
+        <w:t>sin</w:t>
       </w:r>
       <w:r>
         <w:rPr>
@@ -3367,7 +3938,6 @@
           <w:rFonts w:eastAsiaTheme="minorEastAsia"/>
           <w:lang w:val="en-US"/>
         </w:rPr>
-        <w:lastRenderedPageBreak/>
         <w:t xml:space="preserve">Velocity Transformation: To align the measured velocities </w:t>
       </w:r>
       <m:oMath>
@@ -3925,7 +4495,7 @@
           <w:szCs w:val="22"/>
           <w:lang w:val="en-US"/>
         </w:rPr>
-        <w:t xml:space="preserve">compass data (hard iron). Here we only plot it, but is has the </w:t>
+        <w:t>compass data (hard iron).</w:t>
       </w:r>
       <w:r>
         <w:rPr>
@@ -3933,7 +4503,7 @@
           <w:szCs w:val="22"/>
           <w:lang w:val="en-US"/>
         </w:rPr>
-        <w:t>functionality to correct U and V accordingly, which can be used in stage 2.</w:t>
+        <w:t>In stage 1</w:t>
       </w:r>
       <w:r>
         <w:rPr>
@@ -3941,423 +4511,187 @@
           <w:szCs w:val="22"/>
           <w:lang w:val="en-US"/>
         </w:rPr>
-        <w:t xml:space="preserve"> </w:t>
-      </w:r>
-    </w:p>
-    <w:p>
-      <w:pPr>
-        <w:spacing w:after="0"/>
-        <w:rPr>
-          <w:sz w:val="22"/>
-          <w:szCs w:val="22"/>
-          <w:lang w:val="en-US"/>
-        </w:rPr>
-      </w:pPr>
-    </w:p>
-    <w:p>
-      <w:pPr>
-        <w:pStyle w:val="Heading3"/>
-        <w:rPr>
-          <w:lang w:val="en-US"/>
-        </w:rPr>
-      </w:pPr>
-      <w:r>
-        <w:rPr>
-          <w:lang w:val="en-US"/>
-        </w:rPr>
-        <w:t xml:space="preserve">Figure </w:t>
-      </w:r>
-      <w:r>
-        <w:rPr>
-          <w:lang w:val="en-US"/>
-        </w:rPr>
-        <w:t>6</w:t>
-      </w:r>
-      <w:r>
-        <w:rPr>
-          <w:lang w:val="en-US"/>
-        </w:rPr>
-        <w:t xml:space="preserve"> – status: </w:t>
-      </w:r>
-      <w:r>
-        <w:rPr>
-          <w:lang w:val="en-US"/>
-        </w:rPr>
-        <w:t>completed</w:t>
-      </w:r>
-    </w:p>
-    <w:p>
-      <w:pPr>
-        <w:rPr>
-          <w:lang w:val="en-US"/>
-        </w:rPr>
-      </w:pPr>
-      <w:r>
-        <w:rPr>
-          <w:lang w:val="en-US"/>
-        </w:rPr>
-        <w:t>Plot all sorts of sensor diagnostics (temperature sensors</w:t>
-      </w:r>
-      <w:r>
-        <w:rPr>
-          <w:lang w:val="en-US"/>
-        </w:rPr>
-        <w:t>, accelerometers, magnetometer)</w:t>
-      </w:r>
-      <w:r>
-        <w:rPr>
-          <w:lang w:val="en-US"/>
-        </w:rPr>
-        <w:t>. Just check then temperature sensors are sensible, etc.</w:t>
-      </w:r>
-    </w:p>
-    <w:p>
-      <w:pPr>
-        <w:pStyle w:val="Heading3"/>
-        <w:rPr>
-          <w:lang w:val="en-US"/>
-        </w:rPr>
-      </w:pPr>
-      <w:r>
-        <w:rPr>
-          <w:lang w:val="en-US"/>
-        </w:rPr>
-        <w:t>Save Stage 01 data</w:t>
-      </w:r>
-    </w:p>
-    <w:p>
-      <w:pPr>
-        <w:rPr>
-          <w:i/>
-          <w:iCs/>
-          <w:color w:val="3A7C22" w:themeColor="accent6" w:themeShade="BF"/>
-          <w:lang w:val="en-US"/>
-        </w:rPr>
-      </w:pPr>
-      <w:r>
-        <w:rPr>
-          <w:lang w:val="en-US"/>
-        </w:rPr>
-        <w:t>Data are save</w:t>
-      </w:r>
-      <w:r>
-        <w:rPr>
-          <w:lang w:val="en-US"/>
-        </w:rPr>
-        <w:t xml:space="preserve">d filename: </w:t>
-      </w:r>
-      <w:r>
-        <w:rPr>
-          <w:i/>
-          <w:iCs/>
-          <w:color w:val="3A7C22" w:themeColor="accent6" w:themeShade="BF"/>
-          <w:lang w:val="en-US"/>
-        </w:rPr>
-        <w:t>moor_id_sn_stage1.nc</w:t>
-      </w:r>
-      <w:r>
-        <w:rPr>
-          <w:lang w:val="en-US"/>
-        </w:rPr>
-        <w:t xml:space="preserve">,  e.g. for JC238: </w:t>
-      </w:r>
-      <w:r>
-        <w:rPr>
-          <w:i/>
-          <w:iCs/>
-          <w:color w:val="3A7C22" w:themeColor="accent6" w:themeShade="BF"/>
-          <w:lang w:val="en-US"/>
-        </w:rPr>
-        <w:t>rhadcp_0</w:t>
-      </w:r>
-      <w:r>
-        <w:rPr>
-          <w:i/>
-          <w:iCs/>
-          <w:color w:val="3A7C22" w:themeColor="accent6" w:themeShade="BF"/>
-          <w:lang w:val="en-US"/>
-        </w:rPr>
-        <w:t>1</w:t>
-      </w:r>
-      <w:r>
-        <w:rPr>
-          <w:i/>
-          <w:iCs/>
-          <w:color w:val="3A7C22" w:themeColor="accent6" w:themeShade="BF"/>
-          <w:lang w:val="en-US"/>
-        </w:rPr>
-        <w:t>_202</w:t>
-      </w:r>
-      <w:r>
-        <w:rPr>
-          <w:i/>
-          <w:iCs/>
-          <w:color w:val="3A7C22" w:themeColor="accent6" w:themeShade="BF"/>
-          <w:lang w:val="en-US"/>
-        </w:rPr>
-        <w:t>0</w:t>
-      </w:r>
-      <w:r>
-        <w:rPr>
-          <w:i/>
-          <w:iCs/>
-          <w:color w:val="3A7C22" w:themeColor="accent6" w:themeShade="BF"/>
-          <w:lang w:val="en-US"/>
-        </w:rPr>
-        <w:t>_200044_stage1.nc</w:t>
-      </w:r>
-    </w:p>
-    <w:p>
-      <w:pPr>
-        <w:rPr>
-          <w:i/>
-          <w:iCs/>
-          <w:color w:val="4EA72E" w:themeColor="accent6"/>
-          <w:lang w:val="en-US"/>
-        </w:rPr>
-      </w:pPr>
-      <w:r>
-        <w:rPr>
-          <w:lang w:val="en-US"/>
-        </w:rPr>
-        <w:t xml:space="preserve">Data directory: </w:t>
-      </w:r>
-      <w:r>
-        <w:rPr>
-          <w:lang w:val="en-US"/>
-        </w:rPr>
-        <w:t xml:space="preserve"> </w:t>
-      </w:r>
-      <w:r>
-        <w:rPr>
-          <w:i/>
-          <w:iCs/>
-          <w:color w:val="4EA72E" w:themeColor="accent6"/>
-          <w:lang w:val="en-US"/>
-        </w:rPr>
-        <w:t>osnap</w:t>
-      </w:r>
-      <w:r>
-        <w:rPr>
-          <w:i/>
-          <w:iCs/>
-          <w:color w:val="4EA72E" w:themeColor="accent6"/>
-          <w:lang w:val="en-US"/>
-        </w:rPr>
-        <w:t>/</w:t>
-      </w:r>
-      <w:r>
-        <w:rPr>
-          <w:i/>
-          <w:iCs/>
-          <w:color w:val="4EA72E" w:themeColor="accent6"/>
-          <w:lang w:val="en-US"/>
-        </w:rPr>
-        <w:t>data</w:t>
-      </w:r>
-      <w:r>
-        <w:rPr>
-          <w:i/>
-          <w:iCs/>
-          <w:color w:val="4EA72E" w:themeColor="accent6"/>
-          <w:lang w:val="en-US"/>
-        </w:rPr>
-        <w:t>/</w:t>
-      </w:r>
-      <w:r>
-        <w:rPr>
-          <w:i/>
-          <w:iCs/>
-          <w:color w:val="4EA72E" w:themeColor="accent6"/>
-          <w:lang w:val="en-US"/>
-        </w:rPr>
-        <w:t>moor</w:t>
-      </w:r>
-      <w:r>
-        <w:rPr>
-          <w:i/>
-          <w:iCs/>
-          <w:color w:val="4EA72E" w:themeColor="accent6"/>
-          <w:lang w:val="en-US"/>
-        </w:rPr>
-        <w:t>/</w:t>
-      </w:r>
-      <w:r>
-        <w:rPr>
-          <w:i/>
-          <w:iCs/>
-          <w:color w:val="4EA72E" w:themeColor="accent6"/>
-          <w:lang w:val="en-US"/>
-        </w:rPr>
-        <w:t>proc</w:t>
-      </w:r>
-      <w:r>
-        <w:rPr>
-          <w:i/>
-          <w:iCs/>
-          <w:color w:val="4EA72E" w:themeColor="accent6"/>
-          <w:lang w:val="en-US"/>
-        </w:rPr>
-        <w:t>/moor_id/</w:t>
-      </w:r>
-      <w:r>
-        <w:rPr>
-          <w:i/>
-          <w:iCs/>
-          <w:color w:val="4EA72E" w:themeColor="accent6"/>
-          <w:lang w:val="en-US"/>
-        </w:rPr>
-        <w:t>adcp_S55</w:t>
-      </w:r>
-      <w:r>
-        <w:rPr>
-          <w:i/>
-          <w:iCs/>
-          <w:color w:val="4EA72E" w:themeColor="accent6"/>
-          <w:lang w:val="en-US"/>
-        </w:rPr>
-        <w:t>/</w:t>
-      </w:r>
-    </w:p>
-    <w:p>
-      <w:pPr>
-        <w:rPr>
-          <w:i/>
-          <w:iCs/>
-          <w:color w:val="4EA72E" w:themeColor="accent6"/>
-          <w:lang w:val="en-US"/>
-        </w:rPr>
-      </w:pPr>
-      <w:r>
-        <w:rPr>
-          <w:lang w:val="en-US"/>
-        </w:rPr>
-        <w:t xml:space="preserve">E.g. for JC238: </w:t>
-      </w:r>
-      <w:r>
-        <w:rPr>
-          <w:lang w:val="en-US"/>
-        </w:rPr>
-        <w:t xml:space="preserve"> </w:t>
-      </w:r>
-      <w:r>
-        <w:rPr>
-          <w:i/>
-          <w:iCs/>
-          <w:color w:val="4EA72E" w:themeColor="accent6"/>
-          <w:lang w:val="en-US"/>
-        </w:rPr>
-        <w:t>osnap\data\moor\proc\rhadcp_0</w:t>
-      </w:r>
-      <w:r>
-        <w:rPr>
-          <w:i/>
-          <w:iCs/>
-          <w:color w:val="4EA72E" w:themeColor="accent6"/>
-          <w:lang w:val="en-US"/>
-        </w:rPr>
-        <w:t>1</w:t>
-      </w:r>
-      <w:r>
-        <w:rPr>
-          <w:i/>
-          <w:iCs/>
-          <w:color w:val="4EA72E" w:themeColor="accent6"/>
-          <w:lang w:val="en-US"/>
-        </w:rPr>
-        <w:t>_202</w:t>
-      </w:r>
-      <w:r>
-        <w:rPr>
-          <w:i/>
-          <w:iCs/>
-          <w:color w:val="4EA72E" w:themeColor="accent6"/>
-          <w:lang w:val="en-US"/>
-        </w:rPr>
-        <w:t>0</w:t>
-      </w:r>
-      <w:r>
-        <w:rPr>
-          <w:i/>
-          <w:iCs/>
-          <w:color w:val="4EA72E" w:themeColor="accent6"/>
-          <w:lang w:val="en-US"/>
-        </w:rPr>
-        <w:t>\adcp_S55\</w:t>
-      </w:r>
-    </w:p>
-    <w:p>
-      <w:pPr>
-        <w:rPr>
-          <w:lang w:val="en-US"/>
-        </w:rPr>
-      </w:pPr>
-      <w:r>
-        <w:rPr>
-          <w:lang w:val="en-US"/>
-        </w:rPr>
-        <w:t xml:space="preserve">The function </w:t>
+        <w:t xml:space="preserve"> we only plot it, but </w:t>
       </w:r>
       <w:r>
         <w:rPr>
           <w:i/>
           <w:iCs/>
           <w:color w:val="C00000"/>
-          <w:lang w:val="en-US"/>
-        </w:rPr>
-        <w:t>s55_load_nc_as_struct.m</w:t>
-      </w:r>
-      <w:r>
-        <w:rPr>
-          <w:i/>
-          <w:iCs/>
-          <w:lang w:val="en-US"/>
-        </w:rPr>
-        <w:t xml:space="preserve"> </w:t>
-      </w:r>
-      <w:r>
-        <w:rPr>
-          <w:lang w:val="en-US"/>
-        </w:rPr>
-        <w:t>load</w:t>
-      </w:r>
-      <w:r>
-        <w:rPr>
-          <w:lang w:val="en-US"/>
-        </w:rPr>
-        <w:t>s</w:t>
-      </w:r>
-      <w:r>
-        <w:rPr>
-          <w:lang w:val="en-US"/>
-        </w:rPr>
-        <w:t xml:space="preserve"> nc-file as matlab structure.</w:t>
-      </w:r>
-    </w:p>
-    <w:p>
-      <w:pPr>
-        <w:spacing w:after="0"/>
-        <w:rPr>
           <w:sz w:val="22"/>
           <w:szCs w:val="22"/>
           <w:lang w:val="en-US"/>
         </w:rPr>
-      </w:pPr>
-    </w:p>
-    <w:p>
-      <w:pPr>
+        <w:t>s55_hard_iron_compass_correction.m</w:t>
+      </w:r>
+      <w:r>
         <w:rPr>
           <w:sz w:val="22"/>
           <w:szCs w:val="22"/>
           <w:lang w:val="en-US"/>
         </w:rPr>
-      </w:pPr>
+        <w:t xml:space="preserve"> </w:t>
+      </w:r>
       <w:r>
         <w:rPr>
           <w:sz w:val="22"/>
           <w:szCs w:val="22"/>
           <w:lang w:val="en-US"/>
         </w:rPr>
+        <w:t xml:space="preserve">has the </w:t>
+      </w:r>
+      <w:r>
+        <w:rPr>
+          <w:sz w:val="22"/>
+          <w:szCs w:val="22"/>
+          <w:lang w:val="en-US"/>
+        </w:rPr>
+        <w:t>functionality to correct U and V accordingly, which can be used in stage 2.</w:t>
+      </w:r>
+      <w:r>
+        <w:rPr>
+          <w:sz w:val="22"/>
+          <w:szCs w:val="22"/>
+          <w:lang w:val="en-US"/>
+        </w:rPr>
+        <w:t xml:space="preserve"> </w:t>
+      </w:r>
+    </w:p>
+    <w:p>
+      <w:pPr>
+        <w:spacing w:after="0"/>
+        <w:rPr>
+          <w:sz w:val="22"/>
+          <w:szCs w:val="22"/>
+          <w:lang w:val="en-US"/>
+        </w:rPr>
+      </w:pPr>
+    </w:p>
+    <w:p>
+      <w:pPr>
+        <w:pStyle w:val="Heading3"/>
+        <w:rPr>
+          <w:lang w:val="en-US"/>
+        </w:rPr>
+      </w:pPr>
+      <w:r>
+        <w:rPr>
+          <w:lang w:val="en-US"/>
+        </w:rPr>
+        <w:t xml:space="preserve">Figure </w:t>
+      </w:r>
+      <w:r>
+        <w:rPr>
+          <w:lang w:val="en-US"/>
+        </w:rPr>
+        <w:t>6</w:t>
+      </w:r>
+      <w:r>
+        <w:rPr>
+          <w:lang w:val="en-US"/>
+        </w:rPr>
+        <w:t xml:space="preserve"> – status: </w:t>
+      </w:r>
+      <w:r>
+        <w:rPr>
+          <w:lang w:val="en-US"/>
+        </w:rPr>
+        <w:t>completed</w:t>
+      </w:r>
+    </w:p>
+    <w:p>
+      <w:pPr>
+        <w:rPr>
+          <w:lang w:val="en-US"/>
+        </w:rPr>
+      </w:pPr>
+      <w:r>
+        <w:rPr>
+          <w:lang w:val="en-US"/>
+        </w:rPr>
+        <w:t>Plot all sorts of sensor diagnostics (temperature sensors</w:t>
+      </w:r>
+      <w:r>
+        <w:rPr>
+          <w:lang w:val="en-US"/>
+        </w:rPr>
+        <w:t>, accelerometers, magnetometer)</w:t>
+      </w:r>
+      <w:r>
+        <w:rPr>
+          <w:lang w:val="en-US"/>
+        </w:rPr>
+        <w:t xml:space="preserve">. </w:t>
+      </w:r>
+      <w:r>
+        <w:rPr>
+          <w:b/>
+          <w:bCs/>
+          <w:lang w:val="en-US"/>
+        </w:rPr>
+        <w:t>Action:</w:t>
+      </w:r>
+      <w:r>
+        <w:rPr>
+          <w:lang w:val="en-US"/>
+        </w:rPr>
+        <w:t xml:space="preserve"> C</w:t>
+      </w:r>
+      <w:r>
+        <w:rPr>
+          <w:lang w:val="en-US"/>
+        </w:rPr>
+        <w:t>heck then temperature</w:t>
+      </w:r>
+      <w:r>
+        <w:rPr>
+          <w:lang w:val="en-US"/>
+        </w:rPr>
+        <w:t xml:space="preserve"> and other</w:t>
+      </w:r>
+      <w:r>
+        <w:rPr>
+          <w:lang w:val="en-US"/>
+        </w:rPr>
+        <w:t xml:space="preserve"> sensors</w:t>
+      </w:r>
+      <w:r>
+        <w:rPr>
+          <w:lang w:val="en-US"/>
+        </w:rPr>
+        <w:t xml:space="preserve"> data</w:t>
+      </w:r>
+      <w:r>
+        <w:rPr>
+          <w:lang w:val="en-US"/>
+        </w:rPr>
+        <w:t xml:space="preserve"> are sensible, etc.</w:t>
+      </w:r>
+    </w:p>
+    <w:p>
+      <w:pPr>
+        <w:spacing w:after="0"/>
+        <w:rPr>
+          <w:sz w:val="22"/>
+          <w:szCs w:val="22"/>
+          <w:lang w:val="en-US"/>
+        </w:rPr>
+      </w:pPr>
+    </w:p>
+    <w:p>
+      <w:pPr>
+        <w:rPr>
+          <w:sz w:val="22"/>
+          <w:szCs w:val="22"/>
+          <w:lang w:val="en-US"/>
+        </w:rPr>
+      </w:pPr>
+      <w:r>
+        <w:rPr>
+          <w:sz w:val="22"/>
+          <w:szCs w:val="22"/>
+          <w:lang w:val="en-US"/>
+        </w:rPr>
         <w:br w:type="page"/>
       </w:r>
     </w:p>
@@ -4366,7 +4700,6 @@
         <w:pStyle w:val="Heading2"/>
       </w:pPr>
       <w:r>
-        <w:lastRenderedPageBreak/>
         <w:t xml:space="preserve">STAGE 2 – </w:t>
       </w:r>
       <w:r>
@@ -4505,6 +4838,75 @@
           <w:numId w:val="25"/>
         </w:numPr>
         <w:rPr>
+          <w:b/>
+          <w:bCs/>
+          <w:lang w:val="en-US"/>
+        </w:rPr>
+      </w:pPr>
+      <w:r>
+        <w:rPr>
+          <w:b/>
+          <w:bCs/>
+          <w:lang w:val="en-US"/>
+        </w:rPr>
+        <w:t>Hard iron compass correction</w:t>
+      </w:r>
+    </w:p>
+    <w:p>
+      <w:pPr>
+        <w:pStyle w:val="ListParagraph"/>
+        <w:ind w:left="502"/>
+        <w:rPr>
+          <w:lang w:val="en-US"/>
+        </w:rPr>
+      </w:pPr>
+      <w:r>
+        <w:rPr>
+          <w:lang w:val="en-US"/>
+        </w:rPr>
+        <w:t>This is the first correction. After plot comes up operator can select a time frame to improve circle fit. E.g. for JC238 ADCP rotated only at beginning</w:t>
+      </w:r>
+      <w:r>
+        <w:rPr>
+          <w:lang w:val="en-US"/>
+        </w:rPr>
+        <w:t>.</w:t>
+      </w:r>
+      <w:r>
+        <w:rPr>
+          <w:lang w:val="en-US"/>
+        </w:rPr>
+        <w:t xml:space="preserve"> </w:t>
+      </w:r>
+    </w:p>
+    <w:p>
+      <w:pPr>
+        <w:pStyle w:val="ListParagraph"/>
+        <w:numPr>
+          <w:ilvl w:val="0"/>
+          <w:numId w:val="25"/>
+        </w:numPr>
+        <w:rPr>
+          <w:lang w:val="en-US"/>
+        </w:rPr>
+      </w:pPr>
+      <w:r>
+        <w:rPr>
+          <w:b/>
+          <w:bCs/>
+          <w:lang w:val="en-US"/>
+        </w:rPr>
+        <w:t>Correct horizontal velocity for Magnetic Deviation</w:t>
+      </w:r>
+    </w:p>
+    <w:p>
+      <w:pPr>
+        <w:pStyle w:val="ListParagraph"/>
+        <w:numPr>
+          <w:ilvl w:val="0"/>
+          <w:numId w:val="25"/>
+        </w:numPr>
+        <w:rPr>
           <w:lang w:val="en-US"/>
         </w:rPr>
       </w:pPr>
@@ -4582,7 +4984,7 @@
           <w:lang w:val="en-US"/>
         </w:rPr>
       </w:pPr>
-      <w:commentRangeStart w:id="6"/>
+      <w:commentRangeStart w:id="5"/>
       <w:r>
         <w:rPr>
           <w:lang w:val="en-US"/>
@@ -4613,7 +5015,7 @@
         </w:rPr>
         <w:t>Use also MC measurements for speed of sound correction</w:t>
       </w:r>
-      <w:commentRangeEnd w:id="6"/>
+      <w:commentRangeEnd w:id="5"/>
       <w:r>
         <w:rPr>
           <w:rStyle w:val="CommentReference"/>
@@ -4621,7 +5023,7 @@
           <w:szCs w:val="24"/>
           <w:lang w:val="en-US"/>
         </w:rPr>
-        <w:commentReference w:id="6"/>
+        <w:commentReference w:id="5"/>
       </w:r>
       <w:r>
         <w:rPr>
@@ -4641,7 +5043,7 @@
           <w:lang w:val="en-US"/>
         </w:rPr>
       </w:pPr>
-      <w:commentRangeStart w:id="7"/>
+      <w:commentRangeStart w:id="6"/>
       <w:r>
         <w:rPr>
           <w:b/>
@@ -4665,7 +5067,7 @@
         </w:rPr>
         <w:t>As RHADCP is mounted on string I applied the following including pitch.</w:t>
       </w:r>
-      <w:commentRangeEnd w:id="7"/>
+      <w:commentRangeEnd w:id="6"/>
       <w:r>
         <w:rPr>
           <w:rStyle w:val="CommentReference"/>
@@ -4673,7 +5075,7 @@
           <w:szCs w:val="24"/>
           <w:lang w:val="en-US"/>
         </w:rPr>
-        <w:commentReference w:id="7"/>
+        <w:commentReference w:id="6"/>
       </w:r>
     </w:p>
     <w:p>
@@ -4961,44 +5363,6 @@
     </w:p>
     <w:p>
       <w:pPr>
-        <w:pStyle w:val="ListParagraph"/>
-        <w:numPr>
-          <w:ilvl w:val="0"/>
-          <w:numId w:val="25"/>
-        </w:numPr>
-        <w:rPr>
-          <w:lang w:val="en-US"/>
-        </w:rPr>
-      </w:pPr>
-      <w:r>
-        <w:rPr>
-          <w:lang w:val="en-US"/>
-        </w:rPr>
-        <w:t>Hard iron compass correction</w:t>
-      </w:r>
-    </w:p>
-    <w:p>
-      <w:pPr>
-        <w:pStyle w:val="ListParagraph"/>
-        <w:numPr>
-          <w:ilvl w:val="0"/>
-          <w:numId w:val="25"/>
-        </w:numPr>
-        <w:rPr>
-          <w:lang w:val="en-US"/>
-        </w:rPr>
-      </w:pPr>
-      <w:r>
-        <w:rPr>
-          <w:b/>
-          <w:bCs/>
-          <w:lang w:val="en-US"/>
-        </w:rPr>
-        <w:t>Correct horizontal velocity for Magnetic Deviation</w:t>
-      </w:r>
-    </w:p>
-    <w:p>
-      <w:pPr>
         <w:pStyle w:val="Heading2"/>
       </w:pPr>
       <w:r>
@@ -5043,7 +5407,6 @@
         <w:pStyle w:val="Heading2"/>
       </w:pPr>
       <w:r>
-        <w:lastRenderedPageBreak/>
         <w:t>Appendix</w:t>
       </w:r>
     </w:p>
@@ -8351,7 +8714,7 @@
       </w:r>
     </w:p>
   </w:comment>
-  <w:comment w:id="4" w:author="Kristin Burmeister" w:date="2026-01-27T15:49:00Z" w:initials="KB">
+  <w:comment w:id="4" w:author="Kristin Burmeister" w:date="2026-01-06T16:44:00Z" w:initials="KB">
     <w:p>
       <w:pPr>
         <w:pStyle w:val="CommentText"/>
@@ -8363,11 +8726,11 @@
         <w:annotationRef/>
       </w:r>
       <w:r>
-        <w:t>Kind of work in progress. Not sure how to flag this….</w:t>
+        <w:t xml:space="preserve">Could we flag it as “Compass probably bad - post-processing possible” but not to the correction because I would like to compare it with the other raw data and see if we could correct it then… </w:t>
       </w:r>
     </w:p>
   </w:comment>
-  <w:comment w:id="5" w:author="Kristin Burmeister" w:date="2026-01-06T16:44:00Z" w:initials="KB">
+  <w:comment w:id="5" w:author="Kristin Burmeister" w:date="2026-02-11T16:39:00Z" w:initials="KB">
     <w:p>
       <w:pPr>
         <w:pStyle w:val="CommentText"/>
@@ -8379,27 +8742,11 @@
         <w:annotationRef/>
       </w:r>
       <w:r>
-        <w:t xml:space="preserve">Could we flag it as “Compass probably bad - post-processing possible” but not to the correction because I would like to compare it with the other raw data and see if we could correct it then… </w:t>
+        <w:t>Needs to be added and automated</w:t>
       </w:r>
     </w:p>
   </w:comment>
-  <w:comment w:id="6" w:author="Kristin Burmeister" w:date="2026-02-11T16:39:00Z" w:initials="KB">
-    <w:p>
-      <w:pPr>
-        <w:pStyle w:val="CommentText"/>
-      </w:pPr>
-      <w:r>
-        <w:rPr>
-          <w:rStyle w:val="CommentReference"/>
-        </w:rPr>
-        <w:annotationRef/>
-      </w:r>
-      <w:r>
-        <w:t>Needs to be added and automated</w:t>
-      </w:r>
-    </w:p>
-  </w:comment>
-  <w:comment w:id="7" w:author="Kristin Burmeister" w:date="2026-02-11T16:41:00Z" w:initials="KB">
+  <w:comment w:id="6" w:author="Kristin Burmeister" w:date="2026-02-11T16:41:00Z" w:initials="KB">
     <w:p>
       <w:pPr>
         <w:pStyle w:val="CommentText"/>
@@ -8424,7 +8771,6 @@
   <w15:commentEx w15:paraId="40C61E6C" w15:done="0"/>
   <w15:commentEx w15:paraId="30603793" w15:paraIdParent="40C61E6C" w15:done="0"/>
   <w15:commentEx w15:paraId="42A7A97C" w15:done="0"/>
-  <w15:commentEx w15:paraId="3624F258" w15:done="0"/>
   <w15:commentEx w15:paraId="0515072D" w15:done="1"/>
   <w15:commentEx w15:paraId="1509A33A" w15:done="0"/>
   <w15:commentEx w15:paraId="1E494E99" w15:done="0"/>
@@ -8437,7 +8783,6 @@
   <w16cex:commentExtensible w16cex:durableId="2BBC945F" w16cex:dateUtc="2026-01-06T03:47:00Z"/>
   <w16cex:commentExtensible w16cex:durableId="6BF40AD2" w16cex:dateUtc="2026-01-06T03:48:00Z"/>
   <w16cex:commentExtensible w16cex:durableId="54EC9FCE" w16cex:dateUtc="2026-01-06T03:44:00Z"/>
-  <w16cex:commentExtensible w16cex:durableId="2DEF1A88" w16cex:dateUtc="2026-01-27T02:49:00Z"/>
   <w16cex:commentExtensible w16cex:durableId="41BFB27F" w16cex:dateUtc="2026-01-06T03:44:00Z"/>
   <w16cex:commentExtensible w16cex:durableId="0EE6EA31" w16cex:dateUtc="2026-02-11T16:39:00Z"/>
   <w16cex:commentExtensible w16cex:durableId="71A5AADE" w16cex:dateUtc="2026-02-11T16:41:00Z"/>
@@ -8450,7 +8795,6 @@
   <w16cid:commentId w16cid:paraId="40C61E6C" w16cid:durableId="2BBC945F"/>
   <w16cid:commentId w16cid:paraId="30603793" w16cid:durableId="6BF40AD2"/>
   <w16cid:commentId w16cid:paraId="42A7A97C" w16cid:durableId="54EC9FCE"/>
-  <w16cid:commentId w16cid:paraId="3624F258" w16cid:durableId="2DEF1A88"/>
   <w16cid:commentId w16cid:paraId="0515072D" w16cid:durableId="41BFB27F"/>
   <w16cid:commentId w16cid:paraId="1509A33A" w16cid:durableId="0EE6EA31"/>
   <w16cid:commentId w16cid:paraId="1E494E99" w16cid:durableId="71A5AADE"/>
@@ -8731,7 +9075,7 @@
   <w:abstractNum w:abstractNumId="1" w15:restartNumberingAfterBreak="0">
     <w:nsid w:val="05C207BA"/>
     <w:multiLevelType w:val="multilevel"/>
-    <w:tmpl w:val="157EEDCC"/>
+    <w:tmpl w:val="66AEBB40"/>
     <w:lvl w:ilvl="0">
       <w:start w:val="1"/>
       <w:numFmt w:val="decimal"/>
@@ -8746,15 +9090,12 @@
     </w:lvl>
     <w:lvl w:ilvl="1">
       <w:start w:val="1"/>
-      <w:numFmt w:val="bullet"/>
-      <w:lvlText w:val=""/>
-      <w:lvlJc w:val="left"/>
-      <w:pPr>
-        <w:ind w:left="1440" w:hanging="360"/>
-      </w:pPr>
-      <w:rPr>
-        <w:rFonts w:ascii="Symbol" w:hAnsi="Symbol" w:hint="default"/>
-      </w:rPr>
+      <w:numFmt w:val="decimal"/>
+      <w:lvlText w:val="%2."/>
+      <w:lvlJc w:val="left"/>
+      <w:pPr>
+        <w:ind w:left="720" w:hanging="360"/>
+      </w:pPr>
     </w:lvl>
     <w:lvl w:ilvl="2" w:tentative="1">
       <w:start w:val="1"/>
@@ -9140,6 +9481,116 @@
     </w:lvl>
   </w:abstractNum>
   <w:abstractNum w:abstractNumId="4" w15:restartNumberingAfterBreak="0">
+    <w:nsid w:val="1B44403E"/>
+    <w:multiLevelType w:val="multilevel"/>
+    <w:tmpl w:val="6E3EA124"/>
+    <w:lvl w:ilvl="0">
+      <w:start w:val="1"/>
+      <w:numFmt w:val="decimal"/>
+      <w:lvlText w:val="%1."/>
+      <w:lvlJc w:val="left"/>
+      <w:pPr>
+        <w:tabs>
+          <w:tab w:val="num" w:pos="720"/>
+        </w:tabs>
+        <w:ind w:left="720" w:hanging="360"/>
+      </w:pPr>
+    </w:lvl>
+    <w:lvl w:ilvl="1">
+      <w:start w:val="1"/>
+      <w:numFmt w:val="lowerLetter"/>
+      <w:lvlText w:val="%2."/>
+      <w:lvlJc w:val="left"/>
+      <w:pPr>
+        <w:ind w:left="720" w:hanging="360"/>
+      </w:pPr>
+    </w:lvl>
+    <w:lvl w:ilvl="2" w:tentative="1">
+      <w:start w:val="1"/>
+      <w:numFmt w:val="decimal"/>
+      <w:lvlText w:val="%3."/>
+      <w:lvlJc w:val="left"/>
+      <w:pPr>
+        <w:tabs>
+          <w:tab w:val="num" w:pos="2160"/>
+        </w:tabs>
+        <w:ind w:left="2160" w:hanging="360"/>
+      </w:pPr>
+    </w:lvl>
+    <w:lvl w:ilvl="3" w:tentative="1">
+      <w:start w:val="1"/>
+      <w:numFmt w:val="decimal"/>
+      <w:lvlText w:val="%4."/>
+      <w:lvlJc w:val="left"/>
+      <w:pPr>
+        <w:tabs>
+          <w:tab w:val="num" w:pos="2880"/>
+        </w:tabs>
+        <w:ind w:left="2880" w:hanging="360"/>
+      </w:pPr>
+    </w:lvl>
+    <w:lvl w:ilvl="4" w:tentative="1">
+      <w:start w:val="1"/>
+      <w:numFmt w:val="decimal"/>
+      <w:lvlText w:val="%5."/>
+      <w:lvlJc w:val="left"/>
+      <w:pPr>
+        <w:tabs>
+          <w:tab w:val="num" w:pos="3600"/>
+        </w:tabs>
+        <w:ind w:left="3600" w:hanging="360"/>
+      </w:pPr>
+    </w:lvl>
+    <w:lvl w:ilvl="5" w:tentative="1">
+      <w:start w:val="1"/>
+      <w:numFmt w:val="decimal"/>
+      <w:lvlText w:val="%6."/>
+      <w:lvlJc w:val="left"/>
+      <w:pPr>
+        <w:tabs>
+          <w:tab w:val="num" w:pos="4320"/>
+        </w:tabs>
+        <w:ind w:left="4320" w:hanging="360"/>
+      </w:pPr>
+    </w:lvl>
+    <w:lvl w:ilvl="6" w:tentative="1">
+      <w:start w:val="1"/>
+      <w:numFmt w:val="decimal"/>
+      <w:lvlText w:val="%7."/>
+      <w:lvlJc w:val="left"/>
+      <w:pPr>
+        <w:tabs>
+          <w:tab w:val="num" w:pos="5040"/>
+        </w:tabs>
+        <w:ind w:left="5040" w:hanging="360"/>
+      </w:pPr>
+    </w:lvl>
+    <w:lvl w:ilvl="7" w:tentative="1">
+      <w:start w:val="1"/>
+      <w:numFmt w:val="decimal"/>
+      <w:lvlText w:val="%8."/>
+      <w:lvlJc w:val="left"/>
+      <w:pPr>
+        <w:tabs>
+          <w:tab w:val="num" w:pos="5760"/>
+        </w:tabs>
+        <w:ind w:left="5760" w:hanging="360"/>
+      </w:pPr>
+    </w:lvl>
+    <w:lvl w:ilvl="8" w:tentative="1">
+      <w:start w:val="1"/>
+      <w:numFmt w:val="decimal"/>
+      <w:lvlText w:val="%9."/>
+      <w:lvlJc w:val="left"/>
+      <w:pPr>
+        <w:tabs>
+          <w:tab w:val="num" w:pos="6480"/>
+        </w:tabs>
+        <w:ind w:left="6480" w:hanging="360"/>
+      </w:pPr>
+    </w:lvl>
+  </w:abstractNum>
+  <w:abstractNum w:abstractNumId="5" w15:restartNumberingAfterBreak="0">
     <w:nsid w:val="23472601"/>
     <w:multiLevelType w:val="hybridMultilevel"/>
     <w:tmpl w:val="B19AD5D2"/>
@@ -9252,7 +9703,7 @@
       </w:rPr>
     </w:lvl>
   </w:abstractNum>
-  <w:abstractNum w:abstractNumId="5" w15:restartNumberingAfterBreak="0">
+  <w:abstractNum w:abstractNumId="6" w15:restartNumberingAfterBreak="0">
     <w:nsid w:val="268D34B0"/>
     <w:multiLevelType w:val="multilevel"/>
     <w:tmpl w:val="F5765C9A"/>
@@ -9365,7 +9816,7 @@
       </w:pPr>
     </w:lvl>
   </w:abstractNum>
-  <w:abstractNum w:abstractNumId="6" w15:restartNumberingAfterBreak="0">
+  <w:abstractNum w:abstractNumId="7" w15:restartNumberingAfterBreak="0">
     <w:nsid w:val="2860342D"/>
     <w:multiLevelType w:val="multilevel"/>
     <w:tmpl w:val="A5BCCF16"/>
@@ -9514,7 +9965,7 @@
       </w:rPr>
     </w:lvl>
   </w:abstractNum>
-  <w:abstractNum w:abstractNumId="7" w15:restartNumberingAfterBreak="0">
+  <w:abstractNum w:abstractNumId="8" w15:restartNumberingAfterBreak="0">
     <w:nsid w:val="2CE76810"/>
     <w:multiLevelType w:val="multilevel"/>
     <w:tmpl w:val="F8F449E8"/>
@@ -9663,10 +10114,10 @@
       </w:rPr>
     </w:lvl>
   </w:abstractNum>
-  <w:abstractNum w:abstractNumId="8" w15:restartNumberingAfterBreak="0">
+  <w:abstractNum w:abstractNumId="9" w15:restartNumberingAfterBreak="0">
     <w:nsid w:val="2DD86E25"/>
     <w:multiLevelType w:val="hybridMultilevel"/>
-    <w:tmpl w:val="C5F04574"/>
+    <w:tmpl w:val="1598D550"/>
     <w:lvl w:ilvl="0" w:tplc="0409000F">
       <w:start w:val="1"/>
       <w:numFmt w:val="decimal"/>
@@ -9676,7 +10127,7 @@
         <w:ind w:left="720" w:hanging="360"/>
       </w:pPr>
     </w:lvl>
-    <w:lvl w:ilvl="1" w:tplc="04090019" w:tentative="1">
+    <w:lvl w:ilvl="1" w:tplc="04090019">
       <w:start w:val="1"/>
       <w:numFmt w:val="lowerLetter"/>
       <w:lvlText w:val="%2."/>
@@ -9685,7 +10136,7 @@
         <w:ind w:left="1440" w:hanging="360"/>
       </w:pPr>
     </w:lvl>
-    <w:lvl w:ilvl="2" w:tplc="0409001B" w:tentative="1">
+    <w:lvl w:ilvl="2" w:tplc="0409001B">
       <w:start w:val="1"/>
       <w:numFmt w:val="lowerRoman"/>
       <w:lvlText w:val="%3."/>
@@ -9749,7 +10200,7 @@
       </w:pPr>
     </w:lvl>
   </w:abstractNum>
-  <w:abstractNum w:abstractNumId="9" w15:restartNumberingAfterBreak="0">
+  <w:abstractNum w:abstractNumId="10" w15:restartNumberingAfterBreak="0">
     <w:nsid w:val="2FE05074"/>
     <w:multiLevelType w:val="hybridMultilevel"/>
     <w:tmpl w:val="6486DE8E"/>
@@ -9862,7 +10313,7 @@
       </w:rPr>
     </w:lvl>
   </w:abstractNum>
-  <w:abstractNum w:abstractNumId="10" w15:restartNumberingAfterBreak="0">
+  <w:abstractNum w:abstractNumId="11" w15:restartNumberingAfterBreak="0">
     <w:nsid w:val="329D6ED1"/>
     <w:multiLevelType w:val="hybridMultilevel"/>
     <w:tmpl w:val="A2204EF4"/>
@@ -9975,7 +10426,7 @@
       </w:rPr>
     </w:lvl>
   </w:abstractNum>
-  <w:abstractNum w:abstractNumId="11" w15:restartNumberingAfterBreak="0">
+  <w:abstractNum w:abstractNumId="12" w15:restartNumberingAfterBreak="0">
     <w:nsid w:val="34013D8D"/>
     <w:multiLevelType w:val="hybridMultilevel"/>
     <w:tmpl w:val="F14CA870"/>
@@ -10088,7 +10539,7 @@
       </w:rPr>
     </w:lvl>
   </w:abstractNum>
-  <w:abstractNum w:abstractNumId="12" w15:restartNumberingAfterBreak="0">
+  <w:abstractNum w:abstractNumId="13" w15:restartNumberingAfterBreak="0">
     <w:nsid w:val="34CC2C91"/>
     <w:multiLevelType w:val="multilevel"/>
     <w:tmpl w:val="0A62D2D6"/>
@@ -10206,7 +10657,7 @@
       </w:pPr>
     </w:lvl>
   </w:abstractNum>
-  <w:abstractNum w:abstractNumId="13" w15:restartNumberingAfterBreak="0">
+  <w:abstractNum w:abstractNumId="14" w15:restartNumberingAfterBreak="0">
     <w:nsid w:val="351D5866"/>
     <w:multiLevelType w:val="multilevel"/>
     <w:tmpl w:val="FB2ECAC8"/>
@@ -10355,7 +10806,7 @@
       </w:rPr>
     </w:lvl>
   </w:abstractNum>
-  <w:abstractNum w:abstractNumId="14" w15:restartNumberingAfterBreak="0">
+  <w:abstractNum w:abstractNumId="15" w15:restartNumberingAfterBreak="0">
     <w:nsid w:val="35913AD7"/>
     <w:multiLevelType w:val="multilevel"/>
     <w:tmpl w:val="323A3D2C"/>
@@ -10496,7 +10947,7 @@
       </w:rPr>
     </w:lvl>
   </w:abstractNum>
-  <w:abstractNum w:abstractNumId="15" w15:restartNumberingAfterBreak="0">
+  <w:abstractNum w:abstractNumId="16" w15:restartNumberingAfterBreak="0">
     <w:nsid w:val="36CB3BDB"/>
     <w:multiLevelType w:val="multilevel"/>
     <w:tmpl w:val="18446BDA"/>
@@ -10645,7 +11096,7 @@
       </w:rPr>
     </w:lvl>
   </w:abstractNum>
-  <w:abstractNum w:abstractNumId="16" w15:restartNumberingAfterBreak="0">
+  <w:abstractNum w:abstractNumId="17" w15:restartNumberingAfterBreak="0">
     <w:nsid w:val="36FB64B9"/>
     <w:multiLevelType w:val="hybridMultilevel"/>
     <w:tmpl w:val="483ECF90"/>
@@ -10758,7 +11209,7 @@
       </w:rPr>
     </w:lvl>
   </w:abstractNum>
-  <w:abstractNum w:abstractNumId="17" w15:restartNumberingAfterBreak="0">
+  <w:abstractNum w:abstractNumId="18" w15:restartNumberingAfterBreak="0">
     <w:nsid w:val="3B83570D"/>
     <w:multiLevelType w:val="multilevel"/>
     <w:tmpl w:val="11066F98"/>
@@ -10907,7 +11358,269 @@
       </w:rPr>
     </w:lvl>
   </w:abstractNum>
-  <w:abstractNum w:abstractNumId="18" w15:restartNumberingAfterBreak="0">
+  <w:abstractNum w:abstractNumId="19" w15:restartNumberingAfterBreak="0">
+    <w:nsid w:val="3ED41449"/>
+    <w:multiLevelType w:val="hybridMultilevel"/>
+    <w:tmpl w:val="C3D08A14"/>
+    <w:lvl w:ilvl="0" w:tplc="04090001">
+      <w:start w:val="1"/>
+      <w:numFmt w:val="bullet"/>
+      <w:lvlText w:val=""/>
+      <w:lvlJc w:val="left"/>
+      <w:pPr>
+        <w:ind w:left="720" w:hanging="360"/>
+      </w:pPr>
+      <w:rPr>
+        <w:rFonts w:ascii="Symbol" w:hAnsi="Symbol" w:hint="default"/>
+      </w:rPr>
+    </w:lvl>
+    <w:lvl w:ilvl="1" w:tplc="04090003" w:tentative="1">
+      <w:start w:val="1"/>
+      <w:numFmt w:val="bullet"/>
+      <w:lvlText w:val="o"/>
+      <w:lvlJc w:val="left"/>
+      <w:pPr>
+        <w:ind w:left="1440" w:hanging="360"/>
+      </w:pPr>
+      <w:rPr>
+        <w:rFonts w:ascii="Courier New" w:hAnsi="Courier New" w:cs="Courier New" w:hint="default"/>
+      </w:rPr>
+    </w:lvl>
+    <w:lvl w:ilvl="2" w:tplc="04090005" w:tentative="1">
+      <w:start w:val="1"/>
+      <w:numFmt w:val="bullet"/>
+      <w:lvlText w:val=""/>
+      <w:lvlJc w:val="left"/>
+      <w:pPr>
+        <w:ind w:left="2160" w:hanging="360"/>
+      </w:pPr>
+      <w:rPr>
+        <w:rFonts w:ascii="Wingdings" w:hAnsi="Wingdings" w:hint="default"/>
+      </w:rPr>
+    </w:lvl>
+    <w:lvl w:ilvl="3" w:tplc="04090001" w:tentative="1">
+      <w:start w:val="1"/>
+      <w:numFmt w:val="bullet"/>
+      <w:lvlText w:val=""/>
+      <w:lvlJc w:val="left"/>
+      <w:pPr>
+        <w:ind w:left="2880" w:hanging="360"/>
+      </w:pPr>
+      <w:rPr>
+        <w:rFonts w:ascii="Symbol" w:hAnsi="Symbol" w:hint="default"/>
+      </w:rPr>
+    </w:lvl>
+    <w:lvl w:ilvl="4" w:tplc="04090003" w:tentative="1">
+      <w:start w:val="1"/>
+      <w:numFmt w:val="bullet"/>
+      <w:lvlText w:val="o"/>
+      <w:lvlJc w:val="left"/>
+      <w:pPr>
+        <w:ind w:left="3600" w:hanging="360"/>
+      </w:pPr>
+      <w:rPr>
+        <w:rFonts w:ascii="Courier New" w:hAnsi="Courier New" w:cs="Courier New" w:hint="default"/>
+      </w:rPr>
+    </w:lvl>
+    <w:lvl w:ilvl="5" w:tplc="04090005" w:tentative="1">
+      <w:start w:val="1"/>
+      <w:numFmt w:val="bullet"/>
+      <w:lvlText w:val=""/>
+      <w:lvlJc w:val="left"/>
+      <w:pPr>
+        <w:ind w:left="4320" w:hanging="360"/>
+      </w:pPr>
+      <w:rPr>
+        <w:rFonts w:ascii="Wingdings" w:hAnsi="Wingdings" w:hint="default"/>
+      </w:rPr>
+    </w:lvl>
+    <w:lvl w:ilvl="6" w:tplc="04090001" w:tentative="1">
+      <w:start w:val="1"/>
+      <w:numFmt w:val="bullet"/>
+      <w:lvlText w:val=""/>
+      <w:lvlJc w:val="left"/>
+      <w:pPr>
+        <w:ind w:left="5040" w:hanging="360"/>
+      </w:pPr>
+      <w:rPr>
+        <w:rFonts w:ascii="Symbol" w:hAnsi="Symbol" w:hint="default"/>
+      </w:rPr>
+    </w:lvl>
+    <w:lvl w:ilvl="7" w:tplc="04090003" w:tentative="1">
+      <w:start w:val="1"/>
+      <w:numFmt w:val="bullet"/>
+      <w:lvlText w:val="o"/>
+      <w:lvlJc w:val="left"/>
+      <w:pPr>
+        <w:ind w:left="5760" w:hanging="360"/>
+      </w:pPr>
+      <w:rPr>
+        <w:rFonts w:ascii="Courier New" w:hAnsi="Courier New" w:cs="Courier New" w:hint="default"/>
+      </w:rPr>
+    </w:lvl>
+    <w:lvl w:ilvl="8" w:tplc="04090005" w:tentative="1">
+      <w:start w:val="1"/>
+      <w:numFmt w:val="bullet"/>
+      <w:lvlText w:val=""/>
+      <w:lvlJc w:val="left"/>
+      <w:pPr>
+        <w:ind w:left="6480" w:hanging="360"/>
+      </w:pPr>
+      <w:rPr>
+        <w:rFonts w:ascii="Wingdings" w:hAnsi="Wingdings" w:hint="default"/>
+      </w:rPr>
+    </w:lvl>
+  </w:abstractNum>
+  <w:abstractNum w:abstractNumId="20" w15:restartNumberingAfterBreak="0">
+    <w:nsid w:val="45300557"/>
+    <w:multiLevelType w:val="multilevel"/>
+    <w:tmpl w:val="F898854E"/>
+    <w:lvl w:ilvl="0">
+      <w:start w:val="1"/>
+      <w:numFmt w:val="bullet"/>
+      <w:lvlText w:val=""/>
+      <w:lvlJc w:val="left"/>
+      <w:pPr>
+        <w:tabs>
+          <w:tab w:val="num" w:pos="720"/>
+        </w:tabs>
+        <w:ind w:left="720" w:hanging="360"/>
+      </w:pPr>
+      <w:rPr>
+        <w:rFonts w:ascii="Symbol" w:hAnsi="Symbol" w:hint="default"/>
+        <w:sz w:val="20"/>
+      </w:rPr>
+    </w:lvl>
+    <w:lvl w:ilvl="1" w:tentative="1">
+      <w:start w:val="1"/>
+      <w:numFmt w:val="bullet"/>
+      <w:lvlText w:val="o"/>
+      <w:lvlJc w:val="left"/>
+      <w:pPr>
+        <w:tabs>
+          <w:tab w:val="num" w:pos="1440"/>
+        </w:tabs>
+        <w:ind w:left="1440" w:hanging="360"/>
+      </w:pPr>
+      <w:rPr>
+        <w:rFonts w:ascii="Courier New" w:hAnsi="Courier New" w:hint="default"/>
+        <w:sz w:val="20"/>
+      </w:rPr>
+    </w:lvl>
+    <w:lvl w:ilvl="2" w:tentative="1">
+      <w:start w:val="1"/>
+      <w:numFmt w:val="bullet"/>
+      <w:lvlText w:val=""/>
+      <w:lvlJc w:val="left"/>
+      <w:pPr>
+        <w:tabs>
+          <w:tab w:val="num" w:pos="2160"/>
+        </w:tabs>
+        <w:ind w:left="2160" w:hanging="360"/>
+      </w:pPr>
+      <w:rPr>
+        <w:rFonts w:ascii="Wingdings" w:hAnsi="Wingdings" w:hint="default"/>
+        <w:sz w:val="20"/>
+      </w:rPr>
+    </w:lvl>
+    <w:lvl w:ilvl="3" w:tentative="1">
+      <w:start w:val="1"/>
+      <w:numFmt w:val="bullet"/>
+      <w:lvlText w:val=""/>
+      <w:lvlJc w:val="left"/>
+      <w:pPr>
+        <w:tabs>
+          <w:tab w:val="num" w:pos="2880"/>
+        </w:tabs>
+        <w:ind w:left="2880" w:hanging="360"/>
+      </w:pPr>
+      <w:rPr>
+        <w:rFonts w:ascii="Wingdings" w:hAnsi="Wingdings" w:hint="default"/>
+        <w:sz w:val="20"/>
+      </w:rPr>
+    </w:lvl>
+    <w:lvl w:ilvl="4" w:tentative="1">
+      <w:start w:val="1"/>
+      <w:numFmt w:val="bullet"/>
+      <w:lvlText w:val=""/>
+      <w:lvlJc w:val="left"/>
+      <w:pPr>
+        <w:tabs>
+          <w:tab w:val="num" w:pos="3600"/>
+        </w:tabs>
+        <w:ind w:left="3600" w:hanging="360"/>
+      </w:pPr>
+      <w:rPr>
+        <w:rFonts w:ascii="Wingdings" w:hAnsi="Wingdings" w:hint="default"/>
+        <w:sz w:val="20"/>
+      </w:rPr>
+    </w:lvl>
+    <w:lvl w:ilvl="5" w:tentative="1">
+      <w:start w:val="1"/>
+      <w:numFmt w:val="bullet"/>
+      <w:lvlText w:val=""/>
+      <w:lvlJc w:val="left"/>
+      <w:pPr>
+        <w:tabs>
+          <w:tab w:val="num" w:pos="4320"/>
+        </w:tabs>
+        <w:ind w:left="4320" w:hanging="360"/>
+      </w:pPr>
+      <w:rPr>
+        <w:rFonts w:ascii="Wingdings" w:hAnsi="Wingdings" w:hint="default"/>
+        <w:sz w:val="20"/>
+      </w:rPr>
+    </w:lvl>
+    <w:lvl w:ilvl="6" w:tentative="1">
+      <w:start w:val="1"/>
+      <w:numFmt w:val="bullet"/>
+      <w:lvlText w:val=""/>
+      <w:lvlJc w:val="left"/>
+      <w:pPr>
+        <w:tabs>
+          <w:tab w:val="num" w:pos="5040"/>
+        </w:tabs>
+        <w:ind w:left="5040" w:hanging="360"/>
+      </w:pPr>
+      <w:rPr>
+        <w:rFonts w:ascii="Wingdings" w:hAnsi="Wingdings" w:hint="default"/>
+        <w:sz w:val="20"/>
+      </w:rPr>
+    </w:lvl>
+    <w:lvl w:ilvl="7" w:tentative="1">
+      <w:start w:val="1"/>
+      <w:numFmt w:val="bullet"/>
+      <w:lvlText w:val=""/>
+      <w:lvlJc w:val="left"/>
+      <w:pPr>
+        <w:tabs>
+          <w:tab w:val="num" w:pos="5760"/>
+        </w:tabs>
+        <w:ind w:left="5760" w:hanging="360"/>
+      </w:pPr>
+      <w:rPr>
+        <w:rFonts w:ascii="Wingdings" w:hAnsi="Wingdings" w:hint="default"/>
+        <w:sz w:val="20"/>
+      </w:rPr>
+    </w:lvl>
+    <w:lvl w:ilvl="8" w:tentative="1">
+      <w:start w:val="1"/>
+      <w:numFmt w:val="bullet"/>
+      <w:lvlText w:val=""/>
+      <w:lvlJc w:val="left"/>
+      <w:pPr>
+        <w:tabs>
+          <w:tab w:val="num" w:pos="6480"/>
+        </w:tabs>
+        <w:ind w:left="6480" w:hanging="360"/>
+      </w:pPr>
+      <w:rPr>
+        <w:rFonts w:ascii="Wingdings" w:hAnsi="Wingdings" w:hint="default"/>
+        <w:sz w:val="20"/>
+      </w:rPr>
+    </w:lvl>
+  </w:abstractNum>
+  <w:abstractNum w:abstractNumId="21" w15:restartNumberingAfterBreak="0">
     <w:nsid w:val="46A61E3F"/>
     <w:multiLevelType w:val="multilevel"/>
     <w:tmpl w:val="157EEDCC"/>
@@ -11020,7 +11733,7 @@
       </w:pPr>
     </w:lvl>
   </w:abstractNum>
-  <w:abstractNum w:abstractNumId="19" w15:restartNumberingAfterBreak="0">
+  <w:abstractNum w:abstractNumId="22" w15:restartNumberingAfterBreak="0">
     <w:nsid w:val="4A0155F9"/>
     <w:multiLevelType w:val="multilevel"/>
     <w:tmpl w:val="F2D2F164"/>
@@ -11169,7 +11882,7 @@
       </w:rPr>
     </w:lvl>
   </w:abstractNum>
-  <w:abstractNum w:abstractNumId="20" w15:restartNumberingAfterBreak="0">
+  <w:abstractNum w:abstractNumId="23" w15:restartNumberingAfterBreak="0">
     <w:nsid w:val="4B46119A"/>
     <w:multiLevelType w:val="multilevel"/>
     <w:tmpl w:val="157EEDCC"/>
@@ -11282,7 +11995,7 @@
       </w:pPr>
     </w:lvl>
   </w:abstractNum>
-  <w:abstractNum w:abstractNumId="21" w15:restartNumberingAfterBreak="0">
+  <w:abstractNum w:abstractNumId="24" w15:restartNumberingAfterBreak="0">
     <w:nsid w:val="4B8E485B"/>
     <w:multiLevelType w:val="multilevel"/>
     <w:tmpl w:val="11066F98"/>
@@ -11431,7 +12144,7 @@
       </w:rPr>
     </w:lvl>
   </w:abstractNum>
-  <w:abstractNum w:abstractNumId="22" w15:restartNumberingAfterBreak="0">
+  <w:abstractNum w:abstractNumId="25" w15:restartNumberingAfterBreak="0">
     <w:nsid w:val="5293132B"/>
     <w:multiLevelType w:val="hybridMultilevel"/>
     <w:tmpl w:val="2D66F0E0"/>
@@ -11544,7 +12257,7 @@
       </w:rPr>
     </w:lvl>
   </w:abstractNum>
-  <w:abstractNum w:abstractNumId="23" w15:restartNumberingAfterBreak="0">
+  <w:abstractNum w:abstractNumId="26" w15:restartNumberingAfterBreak="0">
     <w:nsid w:val="572E3AB1"/>
     <w:multiLevelType w:val="multilevel"/>
     <w:tmpl w:val="C41014BE"/>
@@ -11661,7 +12374,156 @@
       </w:pPr>
     </w:lvl>
   </w:abstractNum>
-  <w:abstractNum w:abstractNumId="24" w15:restartNumberingAfterBreak="0">
+  <w:abstractNum w:abstractNumId="27" w15:restartNumberingAfterBreak="0">
+    <w:nsid w:val="5817342D"/>
+    <w:multiLevelType w:val="multilevel"/>
+    <w:tmpl w:val="C518A0FE"/>
+    <w:lvl w:ilvl="0">
+      <w:start w:val="1"/>
+      <w:numFmt w:val="bullet"/>
+      <w:lvlText w:val=""/>
+      <w:lvlJc w:val="left"/>
+      <w:pPr>
+        <w:tabs>
+          <w:tab w:val="num" w:pos="720"/>
+        </w:tabs>
+        <w:ind w:left="720" w:hanging="360"/>
+      </w:pPr>
+      <w:rPr>
+        <w:rFonts w:ascii="Symbol" w:hAnsi="Symbol" w:hint="default"/>
+        <w:sz w:val="20"/>
+      </w:rPr>
+    </w:lvl>
+    <w:lvl w:ilvl="1" w:tentative="1">
+      <w:start w:val="1"/>
+      <w:numFmt w:val="bullet"/>
+      <w:lvlText w:val="o"/>
+      <w:lvlJc w:val="left"/>
+      <w:pPr>
+        <w:tabs>
+          <w:tab w:val="num" w:pos="1440"/>
+        </w:tabs>
+        <w:ind w:left="1440" w:hanging="360"/>
+      </w:pPr>
+      <w:rPr>
+        <w:rFonts w:ascii="Courier New" w:hAnsi="Courier New" w:hint="default"/>
+        <w:sz w:val="20"/>
+      </w:rPr>
+    </w:lvl>
+    <w:lvl w:ilvl="2" w:tentative="1">
+      <w:start w:val="1"/>
+      <w:numFmt w:val="bullet"/>
+      <w:lvlText w:val=""/>
+      <w:lvlJc w:val="left"/>
+      <w:pPr>
+        <w:tabs>
+          <w:tab w:val="num" w:pos="2160"/>
+        </w:tabs>
+        <w:ind w:left="2160" w:hanging="360"/>
+      </w:pPr>
+      <w:rPr>
+        <w:rFonts w:ascii="Wingdings" w:hAnsi="Wingdings" w:hint="default"/>
+        <w:sz w:val="20"/>
+      </w:rPr>
+    </w:lvl>
+    <w:lvl w:ilvl="3" w:tentative="1">
+      <w:start w:val="1"/>
+      <w:numFmt w:val="bullet"/>
+      <w:lvlText w:val=""/>
+      <w:lvlJc w:val="left"/>
+      <w:pPr>
+        <w:tabs>
+          <w:tab w:val="num" w:pos="2880"/>
+        </w:tabs>
+        <w:ind w:left="2880" w:hanging="360"/>
+      </w:pPr>
+      <w:rPr>
+        <w:rFonts w:ascii="Wingdings" w:hAnsi="Wingdings" w:hint="default"/>
+        <w:sz w:val="20"/>
+      </w:rPr>
+    </w:lvl>
+    <w:lvl w:ilvl="4" w:tentative="1">
+      <w:start w:val="1"/>
+      <w:numFmt w:val="bullet"/>
+      <w:lvlText w:val=""/>
+      <w:lvlJc w:val="left"/>
+      <w:pPr>
+        <w:tabs>
+          <w:tab w:val="num" w:pos="3600"/>
+        </w:tabs>
+        <w:ind w:left="3600" w:hanging="360"/>
+      </w:pPr>
+      <w:rPr>
+        <w:rFonts w:ascii="Wingdings" w:hAnsi="Wingdings" w:hint="default"/>
+        <w:sz w:val="20"/>
+      </w:rPr>
+    </w:lvl>
+    <w:lvl w:ilvl="5" w:tentative="1">
+      <w:start w:val="1"/>
+      <w:numFmt w:val="bullet"/>
+      <w:lvlText w:val=""/>
+      <w:lvlJc w:val="left"/>
+      <w:pPr>
+        <w:tabs>
+          <w:tab w:val="num" w:pos="4320"/>
+        </w:tabs>
+        <w:ind w:left="4320" w:hanging="360"/>
+      </w:pPr>
+      <w:rPr>
+        <w:rFonts w:ascii="Wingdings" w:hAnsi="Wingdings" w:hint="default"/>
+        <w:sz w:val="20"/>
+      </w:rPr>
+    </w:lvl>
+    <w:lvl w:ilvl="6" w:tentative="1">
+      <w:start w:val="1"/>
+      <w:numFmt w:val="bullet"/>
+      <w:lvlText w:val=""/>
+      <w:lvlJc w:val="left"/>
+      <w:pPr>
+        <w:tabs>
+          <w:tab w:val="num" w:pos="5040"/>
+        </w:tabs>
+        <w:ind w:left="5040" w:hanging="360"/>
+      </w:pPr>
+      <w:rPr>
+        <w:rFonts w:ascii="Wingdings" w:hAnsi="Wingdings" w:hint="default"/>
+        <w:sz w:val="20"/>
+      </w:rPr>
+    </w:lvl>
+    <w:lvl w:ilvl="7" w:tentative="1">
+      <w:start w:val="1"/>
+      <w:numFmt w:val="bullet"/>
+      <w:lvlText w:val=""/>
+      <w:lvlJc w:val="left"/>
+      <w:pPr>
+        <w:tabs>
+          <w:tab w:val="num" w:pos="5760"/>
+        </w:tabs>
+        <w:ind w:left="5760" w:hanging="360"/>
+      </w:pPr>
+      <w:rPr>
+        <w:rFonts w:ascii="Wingdings" w:hAnsi="Wingdings" w:hint="default"/>
+        <w:sz w:val="20"/>
+      </w:rPr>
+    </w:lvl>
+    <w:lvl w:ilvl="8" w:tentative="1">
+      <w:start w:val="1"/>
+      <w:numFmt w:val="bullet"/>
+      <w:lvlText w:val=""/>
+      <w:lvlJc w:val="left"/>
+      <w:pPr>
+        <w:tabs>
+          <w:tab w:val="num" w:pos="6480"/>
+        </w:tabs>
+        <w:ind w:left="6480" w:hanging="360"/>
+      </w:pPr>
+      <w:rPr>
+        <w:rFonts w:ascii="Wingdings" w:hAnsi="Wingdings" w:hint="default"/>
+        <w:sz w:val="20"/>
+      </w:rPr>
+    </w:lvl>
+  </w:abstractNum>
+  <w:abstractNum w:abstractNumId="28" w15:restartNumberingAfterBreak="0">
     <w:nsid w:val="5ED13208"/>
     <w:multiLevelType w:val="multilevel"/>
     <w:tmpl w:val="20D2693A"/>
@@ -11810,7 +12672,7 @@
       </w:rPr>
     </w:lvl>
   </w:abstractNum>
-  <w:abstractNum w:abstractNumId="25" w15:restartNumberingAfterBreak="0">
+  <w:abstractNum w:abstractNumId="29" w15:restartNumberingAfterBreak="0">
     <w:nsid w:val="6424168A"/>
     <w:multiLevelType w:val="multilevel"/>
     <w:tmpl w:val="B19E9DB2"/>
@@ -11959,7 +12821,7 @@
       </w:rPr>
     </w:lvl>
   </w:abstractNum>
-  <w:abstractNum w:abstractNumId="26" w15:restartNumberingAfterBreak="0">
+  <w:abstractNum w:abstractNumId="30" w15:restartNumberingAfterBreak="0">
     <w:nsid w:val="679B64A4"/>
     <w:multiLevelType w:val="multilevel"/>
     <w:tmpl w:val="157EEDCC"/>
@@ -12105,7 +12967,7 @@
       </w:rPr>
     </w:lvl>
   </w:abstractNum>
-  <w:abstractNum w:abstractNumId="27" w15:restartNumberingAfterBreak="0">
+  <w:abstractNum w:abstractNumId="31" w15:restartNumberingAfterBreak="0">
     <w:nsid w:val="6963465E"/>
     <w:multiLevelType w:val="multilevel"/>
     <w:tmpl w:val="7FCC432C"/>
@@ -12218,7 +13080,7 @@
       </w:pPr>
     </w:lvl>
   </w:abstractNum>
-  <w:abstractNum w:abstractNumId="28" w15:restartNumberingAfterBreak="0">
+  <w:abstractNum w:abstractNumId="32" w15:restartNumberingAfterBreak="0">
     <w:nsid w:val="6A2C786F"/>
     <w:multiLevelType w:val="multilevel"/>
     <w:tmpl w:val="F5C65456"/>
@@ -12367,7 +13229,7 @@
       </w:rPr>
     </w:lvl>
   </w:abstractNum>
-  <w:abstractNum w:abstractNumId="29" w15:restartNumberingAfterBreak="0">
+  <w:abstractNum w:abstractNumId="33" w15:restartNumberingAfterBreak="0">
     <w:nsid w:val="6C25198A"/>
     <w:multiLevelType w:val="multilevel"/>
     <w:tmpl w:val="D74630DE"/>
@@ -12516,7 +13378,7 @@
       </w:rPr>
     </w:lvl>
   </w:abstractNum>
-  <w:abstractNum w:abstractNumId="30" w15:restartNumberingAfterBreak="0">
+  <w:abstractNum w:abstractNumId="34" w15:restartNumberingAfterBreak="0">
     <w:nsid w:val="7B9F5DA1"/>
     <w:multiLevelType w:val="multilevel"/>
     <w:tmpl w:val="764CC03C"/>
@@ -12666,53 +13528,53 @@
     </w:lvl>
   </w:abstractNum>
   <w:num w:numId="1" w16cid:durableId="1697004852">
-    <w:abstractNumId w:val="14"/>
+    <w:abstractNumId w:val="15"/>
     <w:lvlOverride w:ilvl="1">
       <w:startOverride w:val="1"/>
     </w:lvlOverride>
   </w:num>
   <w:num w:numId="2" w16cid:durableId="830557843">
-    <w:abstractNumId w:val="14"/>
+    <w:abstractNumId w:val="15"/>
     <w:lvlOverride w:ilvl="1"/>
     <w:lvlOverride w:ilvl="2">
       <w:startOverride w:val="1"/>
     </w:lvlOverride>
   </w:num>
   <w:num w:numId="3" w16cid:durableId="952977496">
-    <w:abstractNumId w:val="14"/>
+    <w:abstractNumId w:val="15"/>
     <w:lvlOverride w:ilvl="1">
       <w:startOverride w:val="6"/>
     </w:lvlOverride>
   </w:num>
   <w:num w:numId="4" w16cid:durableId="452359500">
-    <w:abstractNumId w:val="19"/>
+    <w:abstractNumId w:val="22"/>
   </w:num>
   <w:num w:numId="5" w16cid:durableId="102187756">
-    <w:abstractNumId w:val="6"/>
+    <w:abstractNumId w:val="7"/>
   </w:num>
   <w:num w:numId="6" w16cid:durableId="190384433">
+    <w:abstractNumId w:val="33"/>
+  </w:num>
+  <w:num w:numId="7" w16cid:durableId="692925131">
     <w:abstractNumId w:val="29"/>
   </w:num>
-  <w:num w:numId="7" w16cid:durableId="692925131">
-    <w:abstractNumId w:val="25"/>
-  </w:num>
   <w:num w:numId="8" w16cid:durableId="1339961652">
-    <w:abstractNumId w:val="21"/>
+    <w:abstractNumId w:val="24"/>
   </w:num>
   <w:num w:numId="9" w16cid:durableId="1951357753">
-    <w:abstractNumId w:val="26"/>
+    <w:abstractNumId w:val="30"/>
   </w:num>
   <w:num w:numId="10" w16cid:durableId="99568332">
-    <w:abstractNumId w:val="13"/>
+    <w:abstractNumId w:val="14"/>
   </w:num>
   <w:num w:numId="11" w16cid:durableId="1628393834">
-    <w:abstractNumId w:val="27"/>
+    <w:abstractNumId w:val="31"/>
     <w:lvlOverride w:ilvl="0">
       <w:startOverride w:val="1"/>
     </w:lvlOverride>
   </w:num>
   <w:num w:numId="12" w16cid:durableId="1239097313">
-    <w:abstractNumId w:val="27"/>
+    <w:abstractNumId w:val="31"/>
     <w:lvlOverride w:ilvl="0"/>
     <w:lvlOverride w:ilvl="1">
       <w:startOverride w:val="1"/>
@@ -12725,67 +13587,79 @@
     </w:lvlOverride>
   </w:num>
   <w:num w:numId="14" w16cid:durableId="1956517008">
-    <w:abstractNumId w:val="20"/>
+    <w:abstractNumId w:val="23"/>
   </w:num>
   <w:num w:numId="15" w16cid:durableId="656999463">
     <w:abstractNumId w:val="3"/>
   </w:num>
   <w:num w:numId="16" w16cid:durableId="1533035477">
-    <w:abstractNumId w:val="28"/>
+    <w:abstractNumId w:val="32"/>
   </w:num>
   <w:num w:numId="17" w16cid:durableId="961615563">
     <w:abstractNumId w:val="2"/>
   </w:num>
   <w:num w:numId="18" w16cid:durableId="2138061094">
-    <w:abstractNumId w:val="15"/>
+    <w:abstractNumId w:val="16"/>
   </w:num>
   <w:num w:numId="19" w16cid:durableId="1632249961">
-    <w:abstractNumId w:val="7"/>
+    <w:abstractNumId w:val="8"/>
   </w:num>
   <w:num w:numId="20" w16cid:durableId="585069198">
-    <w:abstractNumId w:val="30"/>
+    <w:abstractNumId w:val="34"/>
   </w:num>
   <w:num w:numId="21" w16cid:durableId="610818748">
-    <w:abstractNumId w:val="8"/>
+    <w:abstractNumId w:val="9"/>
   </w:num>
   <w:num w:numId="22" w16cid:durableId="1664509188">
     <w:abstractNumId w:val="1"/>
   </w:num>
   <w:num w:numId="23" w16cid:durableId="245119510">
+    <w:abstractNumId w:val="6"/>
+  </w:num>
+  <w:num w:numId="24" w16cid:durableId="979461148">
+    <w:abstractNumId w:val="21"/>
+  </w:num>
+  <w:num w:numId="25" w16cid:durableId="1103261038">
+    <w:abstractNumId w:val="26"/>
+  </w:num>
+  <w:num w:numId="26" w16cid:durableId="995062853">
+    <w:abstractNumId w:val="18"/>
+  </w:num>
+  <w:num w:numId="27" w16cid:durableId="1005279804">
+    <w:abstractNumId w:val="28"/>
+  </w:num>
+  <w:num w:numId="28" w16cid:durableId="513031102">
+    <w:abstractNumId w:val="11"/>
+  </w:num>
+  <w:num w:numId="29" w16cid:durableId="785388356">
+    <w:abstractNumId w:val="25"/>
+  </w:num>
+  <w:num w:numId="30" w16cid:durableId="1660572253">
+    <w:abstractNumId w:val="13"/>
+  </w:num>
+  <w:num w:numId="31" w16cid:durableId="2097745421">
+    <w:abstractNumId w:val="17"/>
+  </w:num>
+  <w:num w:numId="32" w16cid:durableId="336617943">
+    <w:abstractNumId w:val="12"/>
+  </w:num>
+  <w:num w:numId="33" w16cid:durableId="994992955">
     <w:abstractNumId w:val="5"/>
   </w:num>
-  <w:num w:numId="24" w16cid:durableId="979461148">
-    <w:abstractNumId w:val="18"/>
-  </w:num>
-  <w:num w:numId="25" w16cid:durableId="1103261038">
-    <w:abstractNumId w:val="23"/>
-  </w:num>
-  <w:num w:numId="26" w16cid:durableId="995062853">
-    <w:abstractNumId w:val="17"/>
-  </w:num>
-  <w:num w:numId="27" w16cid:durableId="1005279804">
-    <w:abstractNumId w:val="24"/>
-  </w:num>
-  <w:num w:numId="28" w16cid:durableId="513031102">
+  <w:num w:numId="34" w16cid:durableId="1822387631">
     <w:abstractNumId w:val="10"/>
   </w:num>
-  <w:num w:numId="29" w16cid:durableId="785388356">
-    <w:abstractNumId w:val="22"/>
+  <w:num w:numId="35" w16cid:durableId="1286547943">
+    <w:abstractNumId w:val="20"/>
   </w:num>
-  <w:num w:numId="30" w16cid:durableId="1660572253">
-    <w:abstractNumId w:val="12"/>
+  <w:num w:numId="36" w16cid:durableId="1377657532">
+    <w:abstractNumId w:val="27"/>
   </w:num>
-  <w:num w:numId="31" w16cid:durableId="2097745421">
-    <w:abstractNumId w:val="16"/>
-  </w:num>
-  <w:num w:numId="32" w16cid:durableId="336617943">
-    <w:abstractNumId w:val="11"/>
-  </w:num>
-  <w:num w:numId="33" w16cid:durableId="994992955">
+  <w:num w:numId="37" w16cid:durableId="1015613895">
     <w:abstractNumId w:val="4"/>
   </w:num>
-  <w:num w:numId="34" w16cid:durableId="1822387631">
-    <w:abstractNumId w:val="9"/>
+  <w:num w:numId="38" w16cid:durableId="95365310">
+    <w:abstractNumId w:val="19"/>
   </w:num>
 </w:numbering>
 </file>
@@ -13198,7 +14072,7 @@
   <w:style w:type="paragraph" w:default="1" w:styleId="Normal">
     <w:name w:val="Normal"/>
     <w:qFormat/>
-    <w:rsid w:val="002B35CD"/>
+    <w:rsid w:val="00DA4C0D"/>
     <w:rPr>
       <w:lang w:val="en-GB"/>
     </w:rPr>
@@ -13403,7 +14277,6 @@
   <w:style w:type="character" w:default="1" w:styleId="DefaultParagraphFont">
     <w:name w:val="Default Paragraph Font"/>
     <w:uiPriority w:val="1"/>
-    <w:semiHidden/>
     <w:unhideWhenUsed/>
   </w:style>
   <w:style w:type="table" w:default="1" w:styleId="TableNormal">
@@ -13848,6 +14721,36 @@
       </w:tblBorders>
     </w:tblPr>
   </w:style>
+  <w:style w:type="character" w:styleId="Strong">
+    <w:name w:val="Strong"/>
+    <w:basedOn w:val="DefaultParagraphFont"/>
+    <w:uiPriority w:val="22"/>
+    <w:qFormat/>
+    <w:rsid w:val="00106BE5"/>
+    <w:rPr>
+      <w:b/>
+      <w:bCs/>
+    </w:rPr>
+  </w:style>
+  <w:style w:type="paragraph" w:customStyle="1" w:styleId="df3vjf">
+    <w:name w:val="df3vjf"/>
+    <w:basedOn w:val="Normal"/>
+    <w:rsid w:val="00106BE5"/>
+    <w:pPr>
+      <w:spacing w:before="100" w:beforeAutospacing="1" w:after="100" w:afterAutospacing="1" w:line="240" w:lineRule="auto"/>
+    </w:pPr>
+    <w:rPr>
+      <w:rFonts w:ascii="Times New Roman" w:eastAsia="Times New Roman" w:hAnsi="Times New Roman" w:cs="Times New Roman"/>
+      <w:kern w:val="0"/>
+      <w:lang w:val="en-US"/>
+      <w14:ligatures w14:val="none"/>
+    </w:rPr>
+  </w:style>
+  <w:style w:type="character" w:customStyle="1" w:styleId="t286pc">
+    <w:name w:val="t286pc"/>
+    <w:basedOn w:val="DefaultParagraphFont"/>
+    <w:rsid w:val="00106BE5"/>
+  </w:style>
 </w:styles>
 </file>
 

</xml_diff>

<commit_message>
Small mods to enable processing on Sam's machine.  Slightly edited time mask logic in Hard_iron_compass_correction
</commit_message>
<xml_diff>
--- a/exec/gitrepo/stage1/adcp_s55/Signature 55Hz processing guide.docx
+++ b/exec/gitrepo/stage1/adcp_s55/Signature 55Hz processing guide.docx
@@ -67,7 +67,7 @@
         <w:rPr>
           <w:noProof/>
         </w:rPr>
-        <w:t>11/02/2026 13:05:37</w:t>
+        <w:t>07/05/2026 10:19:24</w:t>
       </w:r>
       <w:r>
         <w:fldChar w:fldCharType="end"/>
@@ -1028,11 +1028,22 @@
       <w:r>
         <w:tab/>
       </w:r>
+      <w:commentRangeStart w:id="4"/>
       <w:r>
         <w:rPr>
           <w:rFonts w:ascii="Aptos Mono" w:eastAsia="Aptos Mono" w:hAnsi="Aptos Mono" w:cs="Aptos Mono"/>
         </w:rPr>
         <w:t>9378</w:t>
+      </w:r>
+      <w:commentRangeEnd w:id="4"/>
+      <w:r>
+        <w:rPr>
+          <w:rStyle w:val="CommentReference"/>
+          <w:rFonts w:ascii="Aptos Mono" w:eastAsia="Aptos Mono" w:hAnsi="Aptos Mono" w:cs="Aptos Mono"/>
+          <w:sz w:val="24"/>
+          <w:szCs w:val="24"/>
+        </w:rPr>
+        <w:commentReference w:id="4"/>
       </w:r>
     </w:p>
     <w:p>
@@ -1614,7 +1625,7 @@
           <w:lang w:val="en-US"/>
         </w:rPr>
       </w:pPr>
-      <w:commentRangeStart w:id="4"/>
+      <w:commentRangeStart w:id="5"/>
       <w:r>
         <w:rPr>
           <w:b/>
@@ -1834,14 +1845,14 @@
       <w:r>
         <w:t>/despike velocity</w:t>
       </w:r>
-      <w:commentRangeEnd w:id="4"/>
+      <w:commentRangeEnd w:id="5"/>
       <w:r>
         <w:rPr>
           <w:rStyle w:val="CommentReference"/>
           <w:sz w:val="24"/>
           <w:szCs w:val="24"/>
         </w:rPr>
-        <w:commentReference w:id="4"/>
+        <w:commentReference w:id="5"/>
       </w:r>
     </w:p>
     <w:p>
@@ -2468,7 +2479,7 @@
           <w:lang w:val="en-US"/>
         </w:rPr>
       </w:pPr>
-      <w:commentRangeStart w:id="5"/>
+      <w:commentRangeStart w:id="6"/>
       <w:r>
         <w:rPr>
           <w:b/>
@@ -2483,7 +2494,7 @@
         </w:rPr>
         <w:t>:</w:t>
       </w:r>
-      <w:commentRangeEnd w:id="5"/>
+      <w:commentRangeEnd w:id="6"/>
       <w:r>
         <w:rPr>
           <w:rStyle w:val="CommentReference"/>
@@ -2491,7 +2502,7 @@
           <w:szCs w:val="24"/>
           <w:lang w:val="en-US"/>
         </w:rPr>
-        <w:commentReference w:id="5"/>
+        <w:commentReference w:id="6"/>
       </w:r>
       <w:r>
         <w:rPr>
@@ -4582,7 +4593,7 @@
           <w:lang w:val="en-US"/>
         </w:rPr>
       </w:pPr>
-      <w:commentRangeStart w:id="6"/>
+      <w:commentRangeStart w:id="7"/>
       <w:r>
         <w:rPr>
           <w:lang w:val="en-US"/>
@@ -4613,7 +4624,7 @@
         </w:rPr>
         <w:t>Use also MC measurements for speed of sound correction</w:t>
       </w:r>
-      <w:commentRangeEnd w:id="6"/>
+      <w:commentRangeEnd w:id="7"/>
       <w:r>
         <w:rPr>
           <w:rStyle w:val="CommentReference"/>
@@ -4621,7 +4632,7 @@
           <w:szCs w:val="24"/>
           <w:lang w:val="en-US"/>
         </w:rPr>
-        <w:commentReference w:id="6"/>
+        <w:commentReference w:id="7"/>
       </w:r>
       <w:r>
         <w:rPr>
@@ -4641,7 +4652,7 @@
           <w:lang w:val="en-US"/>
         </w:rPr>
       </w:pPr>
-      <w:commentRangeStart w:id="7"/>
+      <w:commentRangeStart w:id="8"/>
       <w:r>
         <w:rPr>
           <w:b/>
@@ -4665,7 +4676,7 @@
         </w:rPr>
         <w:t>As RHADCP is mounted on string I applied the following including pitch.</w:t>
       </w:r>
-      <w:commentRangeEnd w:id="7"/>
+      <w:commentRangeEnd w:id="8"/>
       <w:r>
         <w:rPr>
           <w:rStyle w:val="CommentReference"/>
@@ -4673,7 +4684,7 @@
           <w:szCs w:val="24"/>
           <w:lang w:val="en-US"/>
         </w:rPr>
-        <w:commentReference w:id="7"/>
+        <w:commentReference w:id="8"/>
       </w:r>
     </w:p>
     <w:p>
@@ -8351,7 +8362,7 @@
       </w:r>
     </w:p>
   </w:comment>
-  <w:comment w:id="4" w:author="Kristin Burmeister" w:date="2026-01-27T15:49:00Z" w:initials="KB">
+  <w:comment w:id="4" w:author="Sam Jones" w:date="2026-05-08T16:03:00Z" w:initials="SJ">
     <w:p>
       <w:pPr>
         <w:pStyle w:val="CommentText"/>
@@ -8363,11 +8374,27 @@
         <w:annotationRef/>
       </w:r>
       <w:r>
+        <w:t>Nit-picking, but Microcat 9113 spanned the 2020-22 deployment.  9378 was 2022-24</w:t>
+      </w:r>
+    </w:p>
+  </w:comment>
+  <w:comment w:id="5" w:author="Kristin Burmeister" w:date="2026-01-27T15:49:00Z" w:initials="KB">
+    <w:p>
+      <w:pPr>
+        <w:pStyle w:val="CommentText"/>
+      </w:pPr>
+      <w:r>
+        <w:rPr>
+          <w:rStyle w:val="CommentReference"/>
+        </w:rPr>
+        <w:annotationRef/>
+      </w:r>
+      <w:r>
         <w:t>Kind of work in progress. Not sure how to flag this….</w:t>
       </w:r>
     </w:p>
   </w:comment>
-  <w:comment w:id="5" w:author="Kristin Burmeister" w:date="2026-01-06T16:44:00Z" w:initials="KB">
+  <w:comment w:id="6" w:author="Kristin Burmeister" w:date="2026-01-06T16:44:00Z" w:initials="KB">
     <w:p>
       <w:pPr>
         <w:pStyle w:val="CommentText"/>
@@ -8383,7 +8410,7 @@
       </w:r>
     </w:p>
   </w:comment>
-  <w:comment w:id="6" w:author="Kristin Burmeister" w:date="2026-02-11T16:39:00Z" w:initials="KB">
+  <w:comment w:id="7" w:author="Kristin Burmeister" w:date="2026-02-11T16:39:00Z" w:initials="KB">
     <w:p>
       <w:pPr>
         <w:pStyle w:val="CommentText"/>
@@ -8399,7 +8426,7 @@
       </w:r>
     </w:p>
   </w:comment>
-  <w:comment w:id="7" w:author="Kristin Burmeister" w:date="2026-02-11T16:41:00Z" w:initials="KB">
+  <w:comment w:id="8" w:author="Kristin Burmeister" w:date="2026-02-11T16:41:00Z" w:initials="KB">
     <w:p>
       <w:pPr>
         <w:pStyle w:val="CommentText"/>
@@ -8424,6 +8451,7 @@
   <w15:commentEx w15:paraId="40C61E6C" w15:done="0"/>
   <w15:commentEx w15:paraId="30603793" w15:paraIdParent="40C61E6C" w15:done="0"/>
   <w15:commentEx w15:paraId="42A7A97C" w15:done="0"/>
+  <w15:commentEx w15:paraId="0709CACC" w15:done="0"/>
   <w15:commentEx w15:paraId="3624F258" w15:done="0"/>
   <w15:commentEx w15:paraId="0515072D" w15:done="1"/>
   <w15:commentEx w15:paraId="1509A33A" w15:done="0"/>
@@ -8437,6 +8465,7 @@
   <w16cex:commentExtensible w16cex:durableId="2BBC945F" w16cex:dateUtc="2026-01-06T03:47:00Z"/>
   <w16cex:commentExtensible w16cex:durableId="6BF40AD2" w16cex:dateUtc="2026-01-06T03:48:00Z"/>
   <w16cex:commentExtensible w16cex:durableId="54EC9FCE" w16cex:dateUtc="2026-01-06T03:44:00Z"/>
+  <w16cex:commentExtensible w16cex:durableId="65A5C0B8" w16cex:dateUtc="2026-05-08T15:03:00Z"/>
   <w16cex:commentExtensible w16cex:durableId="2DEF1A88" w16cex:dateUtc="2026-01-27T02:49:00Z"/>
   <w16cex:commentExtensible w16cex:durableId="41BFB27F" w16cex:dateUtc="2026-01-06T03:44:00Z"/>
   <w16cex:commentExtensible w16cex:durableId="0EE6EA31" w16cex:dateUtc="2026-02-11T16:39:00Z"/>
@@ -8450,6 +8479,7 @@
   <w16cid:commentId w16cid:paraId="40C61E6C" w16cid:durableId="2BBC945F"/>
   <w16cid:commentId w16cid:paraId="30603793" w16cid:durableId="6BF40AD2"/>
   <w16cid:commentId w16cid:paraId="42A7A97C" w16cid:durableId="54EC9FCE"/>
+  <w16cid:commentId w16cid:paraId="0709CACC" w16cid:durableId="65A5C0B8"/>
   <w16cid:commentId w16cid:paraId="3624F258" w16cid:durableId="2DEF1A88"/>
   <w16cid:commentId w16cid:paraId="0515072D" w16cid:durableId="41BFB27F"/>
   <w16cid:commentId w16cid:paraId="1509A33A" w16cid:durableId="0EE6EA31"/>
@@ -12794,6 +12824,9 @@
 <w15:people xmlns:wpc="http://schemas.microsoft.com/office/word/2010/wordprocessingCanvas" xmlns:cx="http://schemas.microsoft.com/office/drawing/2014/chartex" xmlns:cx1="http://schemas.microsoft.com/office/drawing/2015/9/8/chartex" xmlns:cx2="http://schemas.microsoft.com/office/drawing/2015/10/21/chartex" xmlns:cx3="http://schemas.microsoft.com/office/drawing/2016/5/9/chartex" xmlns:cx4="http://schemas.microsoft.com/office/drawing/2016/5/10/chartex" xmlns:cx5="http://schemas.microsoft.com/office/drawing/2016/5/11/chartex" xmlns:cx6="http://schemas.microsoft.com/office/drawing/2016/5/12/chartex" xmlns:cx7="http://schemas.microsoft.com/office/drawing/2016/5/13/chartex" xmlns:cx8="http://schemas.microsoft.com/office/drawing/2016/5/14/chartex" xmlns:mc="http://schemas.openxmlformats.org/markup-compatibility/2006" xmlns:aink="http://schemas.microsoft.com/office/drawing/2016/ink" xmlns:am3d="http://schemas.microsoft.com/office/drawing/2017/model3d" xmlns:o="urn:schemas-microsoft-com:office:office" xmlns:oel="http://schemas.microsoft.com/office/2019/extlst" xmlns:r="http://schemas.openxmlformats.org/officeDocument/2006/relationships" xmlns:m="http://schemas.openxmlformats.org/officeDocument/2006/math" xmlns:v="urn:schemas-microsoft-com:vml" xmlns:wp14="http://schemas.microsoft.com/office/word/2010/wordprocessingDrawing" xmlns:wp="http://schemas.openxmlformats.org/drawingml/2006/wordprocessingDrawing" xmlns:w10="urn:schemas-microsoft-com:office:word" xmlns:w="http://schemas.openxmlformats.org/wordprocessingml/2006/main" xmlns:w14="http://schemas.microsoft.com/office/word/2010/wordml" xmlns:w15="http://schemas.microsoft.com/office/word/2012/wordml" xmlns:w16cex="http://schemas.microsoft.com/office/word/2018/wordml/cex" xmlns:w16cid="http://schemas.microsoft.com/office/word/2016/wordml/cid" xmlns:w16="http://schemas.microsoft.com/office/word/2018/wordml" xmlns:w16du="http://schemas.microsoft.com/office/word/2023/wordml/word16du" xmlns:w16sdtdh="http://schemas.microsoft.com/office/word/2020/wordml/sdtdatahash" xmlns:w16sdtfl="http://schemas.microsoft.com/office/word/2024/wordml/sdtformatlock" xmlns:w16se="http://schemas.microsoft.com/office/word/2015/wordml/symex" xmlns:wpg="http://schemas.microsoft.com/office/word/2010/wordprocessingGroup" xmlns:wpi="http://schemas.microsoft.com/office/word/2010/wordprocessingInk" xmlns:wne="http://schemas.microsoft.com/office/word/2006/wordml" xmlns:wps="http://schemas.microsoft.com/office/word/2010/wordprocessingShape" mc:Ignorable="w14 w15 w16se w16cid w16 w16cex w16sdtdh w16sdtfl w16du wp14">
   <w15:person w15:author="Kristin Burmeister">
     <w15:presenceInfo w15:providerId="AD" w15:userId="S::SA07KB@sams.ac.uk::36ee710c-25aa-4549-8dac-543caa2d2369"/>
+  </w15:person>
+  <w15:person w15:author="Sam Jones">
+    <w15:presenceInfo w15:providerId="AD" w15:userId="S::SA01SJ@sams.ac.uk::1ab27e2e-34df-4217-bf97-0109f73558fd"/>
   </w15:person>
 </w15:people>
 </file>

</xml_diff>